<commit_message>
docker - network file updated
</commit_message>
<xml_diff>
--- a/Docker/7-network.docx
+++ b/Docker/7-network.docx
@@ -2356,6 +2356,7 @@
     </w:p>
     <w:p>
       <w:pPr>
+        <w:spacing w:after="60"/>
         <w:ind w:left="360"/>
         <w:jc w:val="both"/>
         <w:rPr>
@@ -2372,6 +2373,947 @@
         </w:rPr>
         <w:t>Bridge driver is local to one host.</w:t>
       </w:r>
+    </w:p>
+    <w:p>
+      <w:pPr>
+        <w:spacing w:after="60"/>
+        <w:ind w:left="360"/>
+        <w:jc w:val="both"/>
+        <w:rPr>
+          <w:rFonts w:asciiTheme="majorBidi" w:hAnsiTheme="majorBidi" w:cstheme="majorBidi"/>
+          <w:sz w:val="28"/>
+          <w:szCs w:val="28"/>
+        </w:rPr>
+      </w:pPr>
+      <w:r>
+        <w:rPr>
+          <w:rFonts w:asciiTheme="majorBidi" w:hAnsiTheme="majorBidi" w:cstheme="majorBidi"/>
+          <w:sz w:val="28"/>
+          <w:szCs w:val="28"/>
+        </w:rPr>
+        <w:t>There are two “bridge” networks in Docker:</w:t>
+      </w:r>
+    </w:p>
+    <w:p>
+      <w:pPr>
+        <w:pStyle w:val="ListParagraph"/>
+        <w:numPr>
+          <w:ilvl w:val="1"/>
+          <w:numId w:val="3"/>
+        </w:numPr>
+        <w:ind w:left="720"/>
+        <w:rPr>
+          <w:rFonts w:asciiTheme="majorBidi" w:hAnsiTheme="majorBidi" w:cstheme="majorBidi"/>
+          <w:sz w:val="28"/>
+          <w:szCs w:val="28"/>
+        </w:rPr>
+      </w:pPr>
+      <w:r>
+        <w:rPr>
+          <w:rFonts w:asciiTheme="majorBidi" w:hAnsiTheme="majorBidi" w:cstheme="majorBidi"/>
+          <w:sz w:val="28"/>
+          <w:szCs w:val="28"/>
+        </w:rPr>
+        <w:t>The default bridge (called bridge, backed by docker0)</w:t>
+      </w:r>
+    </w:p>
+    <w:p>
+      <w:pPr>
+        <w:pStyle w:val="ListParagraph"/>
+        <w:numPr>
+          <w:ilvl w:val="1"/>
+          <w:numId w:val="3"/>
+        </w:numPr>
+        <w:spacing w:after="60"/>
+        <w:ind w:left="720"/>
+        <w:jc w:val="both"/>
+        <w:rPr>
+          <w:rFonts w:asciiTheme="majorBidi" w:hAnsiTheme="majorBidi" w:cstheme="majorBidi"/>
+          <w:sz w:val="28"/>
+          <w:szCs w:val="28"/>
+        </w:rPr>
+      </w:pPr>
+      <w:r>
+        <w:rPr>
+          <w:rFonts w:asciiTheme="majorBidi" w:hAnsiTheme="majorBidi" w:cstheme="majorBidi"/>
+          <w:sz w:val="28"/>
+          <w:szCs w:val="28"/>
+        </w:rPr>
+        <w:t xml:space="preserve">A user-defined bridge (created with </w:t>
+      </w:r>
+      <w:r>
+        <w:rPr>
+          <w:rFonts w:asciiTheme="majorBidi" w:hAnsiTheme="majorBidi" w:cstheme="majorBidi"/>
+          <w:b/>
+          <w:bCs/>
+          <w:i/>
+          <w:iCs/>
+          <w:sz w:val="28"/>
+          <w:szCs w:val="28"/>
+        </w:rPr>
+        <w:t>docker network create</w:t>
+      </w:r>
+      <w:r>
+        <w:rPr>
+          <w:rFonts w:asciiTheme="majorBidi" w:hAnsiTheme="majorBidi" w:cstheme="majorBidi"/>
+          <w:sz w:val="28"/>
+          <w:szCs w:val="28"/>
+        </w:rPr>
+        <w:t>)</w:t>
+      </w:r>
+    </w:p>
+    <w:p>
+      <w:pPr>
+        <w:spacing w:after="60"/>
+        <w:ind w:left="360"/>
+        <w:jc w:val="both"/>
+        <w:rPr>
+          <w:rFonts w:asciiTheme="majorBidi" w:hAnsiTheme="majorBidi" w:cstheme="majorBidi"/>
+          <w:sz w:val="28"/>
+          <w:szCs w:val="28"/>
+        </w:rPr>
+      </w:pPr>
+      <w:r>
+        <w:rPr>
+          <w:rFonts w:asciiTheme="majorBidi" w:hAnsiTheme="majorBidi" w:cstheme="majorBidi"/>
+          <w:sz w:val="28"/>
+          <w:szCs w:val="28"/>
+        </w:rPr>
+        <w:t>They both use Linux bridges under the hood. The difference is control and behavior.</w:t>
+      </w:r>
+    </w:p>
+    <w:p>
+      <w:pPr>
+        <w:ind w:left="360"/>
+        <w:jc w:val="both"/>
+        <w:rPr>
+          <w:rFonts w:asciiTheme="majorBidi" w:hAnsiTheme="majorBidi" w:cstheme="majorBidi"/>
+          <w:sz w:val="28"/>
+          <w:szCs w:val="28"/>
+        </w:rPr>
+      </w:pPr>
+      <w:r>
+        <w:rPr>
+          <w:rFonts w:asciiTheme="majorBidi" w:hAnsiTheme="majorBidi" w:cstheme="majorBidi"/>
+          <w:sz w:val="28"/>
+          <w:szCs w:val="28"/>
+        </w:rPr>
+        <w:t>Here’s the clean comparison:</w:t>
+      </w:r>
+    </w:p>
+    <w:tbl>
+      <w:tblPr>
+        <w:tblStyle w:val="GridTable3"/>
+        <w:tblW w:w="0" w:type="auto"/>
+        <w:tblInd w:w="265" w:type="dxa"/>
+        <w:tblLook w:val="04A0" w:firstRow="1" w:lastRow="0" w:firstColumn="1" w:lastColumn="0" w:noHBand="0" w:noVBand="1"/>
+      </w:tblPr>
+      <w:tblGrid>
+        <w:gridCol w:w="3326"/>
+        <w:gridCol w:w="3597"/>
+        <w:gridCol w:w="3597"/>
+      </w:tblGrid>
+      <w:tr>
+        <w:trPr>
+          <w:cnfStyle w:val="100000000000" w:firstRow="1" w:lastRow="0" w:firstColumn="0" w:lastColumn="0" w:oddVBand="0" w:evenVBand="0" w:oddHBand="0" w:evenHBand="0" w:firstRowFirstColumn="0" w:firstRowLastColumn="0" w:lastRowFirstColumn="0" w:lastRowLastColumn="0"/>
+        </w:trPr>
+        <w:tc>
+          <w:tcPr>
+            <w:cnfStyle w:val="001000000100" w:firstRow="0" w:lastRow="0" w:firstColumn="1" w:lastColumn="0" w:oddVBand="0" w:evenVBand="0" w:oddHBand="0" w:evenHBand="0" w:firstRowFirstColumn="1" w:firstRowLastColumn="0" w:lastRowFirstColumn="0" w:lastRowLastColumn="0"/>
+            <w:tcW w:w="3326" w:type="dxa"/>
+            <w:tcBorders>
+              <w:top w:val="single" w:sz="12" w:space="0" w:color="000000"/>
+            </w:tcBorders>
+            <w:vAlign w:val="center"/>
+          </w:tcPr>
+          <w:p>
+            <w:pPr>
+              <w:spacing w:before="120" w:after="120"/>
+              <w:jc w:val="center"/>
+              <w:rPr>
+                <w:rFonts w:asciiTheme="majorBidi" w:hAnsiTheme="majorBidi" w:cstheme="majorBidi"/>
+                <w:sz w:val="28"/>
+                <w:szCs w:val="28"/>
+              </w:rPr>
+            </w:pPr>
+            <w:r>
+              <w:rPr>
+                <w:rFonts w:asciiTheme="majorBidi" w:hAnsiTheme="majorBidi" w:cstheme="majorBidi"/>
+                <w:sz w:val="28"/>
+                <w:szCs w:val="28"/>
+              </w:rPr>
+              <w:lastRenderedPageBreak/>
+              <w:t>Feature</w:t>
+            </w:r>
+          </w:p>
+        </w:tc>
+        <w:tc>
+          <w:tcPr>
+            <w:tcW w:w="3597" w:type="dxa"/>
+            <w:tcBorders>
+              <w:top w:val="single" w:sz="12" w:space="0" w:color="000000"/>
+            </w:tcBorders>
+            <w:vAlign w:val="center"/>
+          </w:tcPr>
+          <w:p>
+            <w:pPr>
+              <w:spacing w:before="120" w:after="120"/>
+              <w:jc w:val="center"/>
+              <w:cnfStyle w:val="100000000000" w:firstRow="1" w:lastRow="0" w:firstColumn="0" w:lastColumn="0" w:oddVBand="0" w:evenVBand="0" w:oddHBand="0" w:evenHBand="0" w:firstRowFirstColumn="0" w:firstRowLastColumn="0" w:lastRowFirstColumn="0" w:lastRowLastColumn="0"/>
+              <w:rPr>
+                <w:rFonts w:asciiTheme="majorBidi" w:hAnsiTheme="majorBidi" w:cstheme="majorBidi"/>
+                <w:sz w:val="28"/>
+                <w:szCs w:val="28"/>
+              </w:rPr>
+            </w:pPr>
+            <w:r>
+              <w:rPr>
+                <w:rFonts w:asciiTheme="majorBidi" w:hAnsiTheme="majorBidi" w:cstheme="majorBidi"/>
+                <w:sz w:val="28"/>
+                <w:szCs w:val="28"/>
+              </w:rPr>
+              <w:t>Default bridge (</w:t>
+            </w:r>
+            <w:r>
+              <w:rPr>
+                <w:rStyle w:val="HTMLCode"/>
+                <w:rFonts w:asciiTheme="majorBidi" w:eastAsiaTheme="majorEastAsia" w:hAnsiTheme="majorBidi" w:cstheme="majorBidi"/>
+                <w:sz w:val="28"/>
+                <w:szCs w:val="28"/>
+              </w:rPr>
+              <w:t>bridge</w:t>
+            </w:r>
+            <w:r>
+              <w:rPr>
+                <w:rFonts w:asciiTheme="majorBidi" w:hAnsiTheme="majorBidi" w:cstheme="majorBidi"/>
+                <w:sz w:val="28"/>
+                <w:szCs w:val="28"/>
+              </w:rPr>
+              <w:t>)</w:t>
+            </w:r>
+          </w:p>
+        </w:tc>
+        <w:tc>
+          <w:tcPr>
+            <w:tcW w:w="3597" w:type="dxa"/>
+            <w:tcBorders>
+              <w:top w:val="single" w:sz="12" w:space="0" w:color="000000"/>
+            </w:tcBorders>
+            <w:vAlign w:val="center"/>
+          </w:tcPr>
+          <w:p>
+            <w:pPr>
+              <w:spacing w:before="120" w:after="120"/>
+              <w:jc w:val="center"/>
+              <w:cnfStyle w:val="100000000000" w:firstRow="1" w:lastRow="0" w:firstColumn="0" w:lastColumn="0" w:oddVBand="0" w:evenVBand="0" w:oddHBand="0" w:evenHBand="0" w:firstRowFirstColumn="0" w:firstRowLastColumn="0" w:lastRowFirstColumn="0" w:lastRowLastColumn="0"/>
+              <w:rPr>
+                <w:rFonts w:asciiTheme="majorBidi" w:hAnsiTheme="majorBidi" w:cstheme="majorBidi"/>
+                <w:sz w:val="28"/>
+                <w:szCs w:val="28"/>
+              </w:rPr>
+            </w:pPr>
+            <w:r>
+              <w:rPr>
+                <w:rFonts w:asciiTheme="majorBidi" w:hAnsiTheme="majorBidi" w:cstheme="majorBidi"/>
+                <w:sz w:val="28"/>
+                <w:szCs w:val="28"/>
+              </w:rPr>
+              <w:t>User-defined bridge</w:t>
+            </w:r>
+          </w:p>
+        </w:tc>
+      </w:tr>
+      <w:tr>
+        <w:trPr>
+          <w:cnfStyle w:val="000000100000" w:firstRow="0" w:lastRow="0" w:firstColumn="0" w:lastColumn="0" w:oddVBand="0" w:evenVBand="0" w:oddHBand="1" w:evenHBand="0" w:firstRowFirstColumn="0" w:firstRowLastColumn="0" w:lastRowFirstColumn="0" w:lastRowLastColumn="0"/>
+        </w:trPr>
+        <w:tc>
+          <w:tcPr>
+            <w:cnfStyle w:val="001000000000" w:firstRow="0" w:lastRow="0" w:firstColumn="1" w:lastColumn="0" w:oddVBand="0" w:evenVBand="0" w:oddHBand="0" w:evenHBand="0" w:firstRowFirstColumn="0" w:firstRowLastColumn="0" w:lastRowFirstColumn="0" w:lastRowLastColumn="0"/>
+            <w:tcW w:w="3326" w:type="dxa"/>
+            <w:vAlign w:val="center"/>
+          </w:tcPr>
+          <w:p>
+            <w:pPr>
+              <w:spacing w:before="60" w:after="60"/>
+              <w:jc w:val="center"/>
+              <w:rPr>
+                <w:rFonts w:asciiTheme="majorBidi" w:hAnsiTheme="majorBidi" w:cstheme="majorBidi"/>
+                <w:b/>
+                <w:bCs/>
+                <w:sz w:val="28"/>
+                <w:szCs w:val="28"/>
+              </w:rPr>
+            </w:pPr>
+            <w:r>
+              <w:rPr>
+                <w:rFonts w:asciiTheme="majorBidi" w:hAnsiTheme="majorBidi" w:cstheme="majorBidi"/>
+                <w:b/>
+                <w:bCs/>
+                <w:sz w:val="28"/>
+                <w:szCs w:val="28"/>
+              </w:rPr>
+              <w:t>Created automatically</w:t>
+            </w:r>
+          </w:p>
+        </w:tc>
+        <w:tc>
+          <w:tcPr>
+            <w:tcW w:w="3597" w:type="dxa"/>
+            <w:vAlign w:val="center"/>
+          </w:tcPr>
+          <w:p>
+            <w:pPr>
+              <w:spacing w:before="60" w:after="60"/>
+              <w:jc w:val="center"/>
+              <w:cnfStyle w:val="000000100000" w:firstRow="0" w:lastRow="0" w:firstColumn="0" w:lastColumn="0" w:oddVBand="0" w:evenVBand="0" w:oddHBand="1" w:evenHBand="0" w:firstRowFirstColumn="0" w:firstRowLastColumn="0" w:lastRowFirstColumn="0" w:lastRowLastColumn="0"/>
+              <w:rPr>
+                <w:rFonts w:asciiTheme="majorBidi" w:hAnsiTheme="majorBidi" w:cstheme="majorBidi"/>
+                <w:sz w:val="28"/>
+                <w:szCs w:val="28"/>
+              </w:rPr>
+            </w:pPr>
+            <w:r>
+              <w:rPr>
+                <w:rFonts w:asciiTheme="majorBidi" w:hAnsiTheme="majorBidi" w:cstheme="majorBidi"/>
+                <w:sz w:val="28"/>
+                <w:szCs w:val="28"/>
+              </w:rPr>
+              <w:t>Yes (when Docker starts)</w:t>
+            </w:r>
+          </w:p>
+        </w:tc>
+        <w:tc>
+          <w:tcPr>
+            <w:tcW w:w="3597" w:type="dxa"/>
+            <w:vAlign w:val="center"/>
+          </w:tcPr>
+          <w:p>
+            <w:pPr>
+              <w:spacing w:before="60" w:after="60"/>
+              <w:jc w:val="center"/>
+              <w:cnfStyle w:val="000000100000" w:firstRow="0" w:lastRow="0" w:firstColumn="0" w:lastColumn="0" w:oddVBand="0" w:evenVBand="0" w:oddHBand="1" w:evenHBand="0" w:firstRowFirstColumn="0" w:firstRowLastColumn="0" w:lastRowFirstColumn="0" w:lastRowLastColumn="0"/>
+              <w:rPr>
+                <w:rFonts w:asciiTheme="majorBidi" w:hAnsiTheme="majorBidi" w:cstheme="majorBidi"/>
+                <w:sz w:val="28"/>
+                <w:szCs w:val="28"/>
+              </w:rPr>
+            </w:pPr>
+            <w:r>
+              <w:rPr>
+                <w:rFonts w:asciiTheme="majorBidi" w:hAnsiTheme="majorBidi" w:cstheme="majorBidi"/>
+                <w:sz w:val="28"/>
+                <w:szCs w:val="28"/>
+              </w:rPr>
+              <w:t>No (you create it)</w:t>
+            </w:r>
+          </w:p>
+        </w:tc>
+      </w:tr>
+      <w:tr>
+        <w:tc>
+          <w:tcPr>
+            <w:cnfStyle w:val="001000000000" w:firstRow="0" w:lastRow="0" w:firstColumn="1" w:lastColumn="0" w:oddVBand="0" w:evenVBand="0" w:oddHBand="0" w:evenHBand="0" w:firstRowFirstColumn="0" w:firstRowLastColumn="0" w:lastRowFirstColumn="0" w:lastRowLastColumn="0"/>
+            <w:tcW w:w="3326" w:type="dxa"/>
+            <w:vAlign w:val="center"/>
+          </w:tcPr>
+          <w:p>
+            <w:pPr>
+              <w:spacing w:before="60" w:after="60"/>
+              <w:jc w:val="center"/>
+              <w:rPr>
+                <w:rFonts w:asciiTheme="majorBidi" w:hAnsiTheme="majorBidi" w:cstheme="majorBidi"/>
+                <w:b/>
+                <w:bCs/>
+                <w:sz w:val="28"/>
+                <w:szCs w:val="28"/>
+              </w:rPr>
+            </w:pPr>
+            <w:r>
+              <w:rPr>
+                <w:rFonts w:asciiTheme="majorBidi" w:hAnsiTheme="majorBidi" w:cstheme="majorBidi"/>
+                <w:b/>
+                <w:bCs/>
+                <w:sz w:val="28"/>
+                <w:szCs w:val="28"/>
+              </w:rPr>
+              <w:t>Name resolution (DNS)</w:t>
+            </w:r>
+          </w:p>
+        </w:tc>
+        <w:tc>
+          <w:tcPr>
+            <w:tcW w:w="3597" w:type="dxa"/>
+            <w:vAlign w:val="center"/>
+          </w:tcPr>
+          <w:p>
+            <w:pPr>
+              <w:spacing w:before="60" w:after="60"/>
+              <w:jc w:val="center"/>
+              <w:cnfStyle w:val="000000000000" w:firstRow="0" w:lastRow="0" w:firstColumn="0" w:lastColumn="0" w:oddVBand="0" w:evenVBand="0" w:oddHBand="0" w:evenHBand="0" w:firstRowFirstColumn="0" w:firstRowLastColumn="0" w:lastRowFirstColumn="0" w:lastRowLastColumn="0"/>
+              <w:rPr>
+                <w:rFonts w:asciiTheme="majorBidi" w:hAnsiTheme="majorBidi" w:cstheme="majorBidi"/>
+                <w:sz w:val="28"/>
+                <w:szCs w:val="28"/>
+              </w:rPr>
+            </w:pPr>
+            <w:r>
+              <w:rPr>
+                <w:rFonts w:asciiTheme="majorBidi" w:hAnsiTheme="majorBidi" w:cstheme="majorBidi"/>
+                <w:sz w:val="28"/>
+                <w:szCs w:val="28"/>
+              </w:rPr>
+              <w:t>No automatic container name resolution</w:t>
+            </w:r>
+          </w:p>
+        </w:tc>
+        <w:tc>
+          <w:tcPr>
+            <w:tcW w:w="3597" w:type="dxa"/>
+            <w:vAlign w:val="center"/>
+          </w:tcPr>
+          <w:p>
+            <w:pPr>
+              <w:spacing w:before="60" w:after="60"/>
+              <w:jc w:val="center"/>
+              <w:cnfStyle w:val="000000000000" w:firstRow="0" w:lastRow="0" w:firstColumn="0" w:lastColumn="0" w:oddVBand="0" w:evenVBand="0" w:oddHBand="0" w:evenHBand="0" w:firstRowFirstColumn="0" w:firstRowLastColumn="0" w:lastRowFirstColumn="0" w:lastRowLastColumn="0"/>
+              <w:rPr>
+                <w:rFonts w:asciiTheme="majorBidi" w:hAnsiTheme="majorBidi" w:cstheme="majorBidi"/>
+                <w:sz w:val="28"/>
+                <w:szCs w:val="28"/>
+              </w:rPr>
+            </w:pPr>
+            <w:r>
+              <w:rPr>
+                <w:rFonts w:asciiTheme="majorBidi" w:hAnsiTheme="majorBidi" w:cstheme="majorBidi"/>
+                <w:sz w:val="28"/>
+                <w:szCs w:val="28"/>
+              </w:rPr>
+              <w:t>Built-in DNS (containers resolve each other by name)</w:t>
+            </w:r>
+          </w:p>
+        </w:tc>
+      </w:tr>
+      <w:tr>
+        <w:trPr>
+          <w:cnfStyle w:val="000000100000" w:firstRow="0" w:lastRow="0" w:firstColumn="0" w:lastColumn="0" w:oddVBand="0" w:evenVBand="0" w:oddHBand="1" w:evenHBand="0" w:firstRowFirstColumn="0" w:firstRowLastColumn="0" w:lastRowFirstColumn="0" w:lastRowLastColumn="0"/>
+        </w:trPr>
+        <w:tc>
+          <w:tcPr>
+            <w:cnfStyle w:val="001000000000" w:firstRow="0" w:lastRow="0" w:firstColumn="1" w:lastColumn="0" w:oddVBand="0" w:evenVBand="0" w:oddHBand="0" w:evenHBand="0" w:firstRowFirstColumn="0" w:firstRowLastColumn="0" w:lastRowFirstColumn="0" w:lastRowLastColumn="0"/>
+            <w:tcW w:w="3326" w:type="dxa"/>
+            <w:vAlign w:val="center"/>
+          </w:tcPr>
+          <w:p>
+            <w:pPr>
+              <w:spacing w:before="60" w:after="60"/>
+              <w:jc w:val="center"/>
+              <w:rPr>
+                <w:rFonts w:asciiTheme="majorBidi" w:hAnsiTheme="majorBidi" w:cstheme="majorBidi"/>
+                <w:b/>
+                <w:bCs/>
+                <w:sz w:val="28"/>
+                <w:szCs w:val="28"/>
+              </w:rPr>
+            </w:pPr>
+            <w:r>
+              <w:rPr>
+                <w:rFonts w:asciiTheme="majorBidi" w:hAnsiTheme="majorBidi" w:cstheme="majorBidi"/>
+                <w:b/>
+                <w:bCs/>
+                <w:sz w:val="28"/>
+                <w:szCs w:val="28"/>
+              </w:rPr>
+              <w:t>Isolation</w:t>
+            </w:r>
+          </w:p>
+        </w:tc>
+        <w:tc>
+          <w:tcPr>
+            <w:tcW w:w="3597" w:type="dxa"/>
+            <w:vAlign w:val="center"/>
+          </w:tcPr>
+          <w:p>
+            <w:pPr>
+              <w:spacing w:before="60" w:after="60"/>
+              <w:jc w:val="center"/>
+              <w:cnfStyle w:val="000000100000" w:firstRow="0" w:lastRow="0" w:firstColumn="0" w:lastColumn="0" w:oddVBand="0" w:evenVBand="0" w:oddHBand="1" w:evenHBand="0" w:firstRowFirstColumn="0" w:firstRowLastColumn="0" w:lastRowFirstColumn="0" w:lastRowLastColumn="0"/>
+              <w:rPr>
+                <w:rFonts w:asciiTheme="majorBidi" w:hAnsiTheme="majorBidi" w:cstheme="majorBidi"/>
+                <w:sz w:val="28"/>
+                <w:szCs w:val="28"/>
+              </w:rPr>
+            </w:pPr>
+            <w:r>
+              <w:rPr>
+                <w:rFonts w:asciiTheme="majorBidi" w:hAnsiTheme="majorBidi" w:cstheme="majorBidi"/>
+                <w:sz w:val="28"/>
+                <w:szCs w:val="28"/>
+              </w:rPr>
+              <w:t xml:space="preserve">Weak – all containers on </w:t>
+            </w:r>
+            <w:r>
+              <w:rPr>
+                <w:rStyle w:val="HTMLCode"/>
+                <w:rFonts w:asciiTheme="majorBidi" w:eastAsiaTheme="majorEastAsia" w:hAnsiTheme="majorBidi" w:cstheme="majorBidi"/>
+                <w:sz w:val="28"/>
+                <w:szCs w:val="28"/>
+              </w:rPr>
+              <w:t>bridge</w:t>
+            </w:r>
+            <w:r>
+              <w:rPr>
+                <w:rFonts w:asciiTheme="majorBidi" w:hAnsiTheme="majorBidi" w:cstheme="majorBidi"/>
+                <w:sz w:val="28"/>
+                <w:szCs w:val="28"/>
+              </w:rPr>
+              <w:t xml:space="preserve"> can talk</w:t>
+            </w:r>
+          </w:p>
+        </w:tc>
+        <w:tc>
+          <w:tcPr>
+            <w:tcW w:w="3597" w:type="dxa"/>
+            <w:vAlign w:val="center"/>
+          </w:tcPr>
+          <w:p>
+            <w:pPr>
+              <w:spacing w:before="60" w:after="60"/>
+              <w:jc w:val="center"/>
+              <w:cnfStyle w:val="000000100000" w:firstRow="0" w:lastRow="0" w:firstColumn="0" w:lastColumn="0" w:oddVBand="0" w:evenVBand="0" w:oddHBand="1" w:evenHBand="0" w:firstRowFirstColumn="0" w:firstRowLastColumn="0" w:lastRowFirstColumn="0" w:lastRowLastColumn="0"/>
+              <w:rPr>
+                <w:rFonts w:asciiTheme="majorBidi" w:hAnsiTheme="majorBidi" w:cstheme="majorBidi"/>
+                <w:sz w:val="28"/>
+                <w:szCs w:val="28"/>
+              </w:rPr>
+            </w:pPr>
+            <w:r>
+              <w:rPr>
+                <w:rFonts w:asciiTheme="majorBidi" w:hAnsiTheme="majorBidi" w:cstheme="majorBidi"/>
+                <w:sz w:val="28"/>
+                <w:szCs w:val="28"/>
+              </w:rPr>
+              <w:t>Stronger – only containers attached can talk</w:t>
+            </w:r>
+          </w:p>
+        </w:tc>
+      </w:tr>
+      <w:tr>
+        <w:tc>
+          <w:tcPr>
+            <w:cnfStyle w:val="001000000000" w:firstRow="0" w:lastRow="0" w:firstColumn="1" w:lastColumn="0" w:oddVBand="0" w:evenVBand="0" w:oddHBand="0" w:evenHBand="0" w:firstRowFirstColumn="0" w:firstRowLastColumn="0" w:lastRowFirstColumn="0" w:lastRowLastColumn="0"/>
+            <w:tcW w:w="3326" w:type="dxa"/>
+            <w:vAlign w:val="center"/>
+          </w:tcPr>
+          <w:p>
+            <w:pPr>
+              <w:spacing w:before="60" w:after="60"/>
+              <w:jc w:val="center"/>
+              <w:rPr>
+                <w:rFonts w:asciiTheme="majorBidi" w:hAnsiTheme="majorBidi" w:cstheme="majorBidi"/>
+                <w:b/>
+                <w:bCs/>
+                <w:sz w:val="28"/>
+                <w:szCs w:val="28"/>
+              </w:rPr>
+            </w:pPr>
+            <w:r>
+              <w:rPr>
+                <w:rFonts w:asciiTheme="majorBidi" w:hAnsiTheme="majorBidi" w:cstheme="majorBidi"/>
+                <w:b/>
+                <w:bCs/>
+                <w:sz w:val="28"/>
+                <w:szCs w:val="28"/>
+              </w:rPr>
+              <w:t>Attach/detach running containers</w:t>
+            </w:r>
+          </w:p>
+        </w:tc>
+        <w:tc>
+          <w:tcPr>
+            <w:tcW w:w="3597" w:type="dxa"/>
+            <w:vAlign w:val="center"/>
+          </w:tcPr>
+          <w:p>
+            <w:pPr>
+              <w:spacing w:before="60" w:after="60"/>
+              <w:jc w:val="center"/>
+              <w:cnfStyle w:val="000000000000" w:firstRow="0" w:lastRow="0" w:firstColumn="0" w:lastColumn="0" w:oddVBand="0" w:evenVBand="0" w:oddHBand="0" w:evenHBand="0" w:firstRowFirstColumn="0" w:firstRowLastColumn="0" w:lastRowFirstColumn="0" w:lastRowLastColumn="0"/>
+              <w:rPr>
+                <w:rFonts w:asciiTheme="majorBidi" w:hAnsiTheme="majorBidi" w:cstheme="majorBidi"/>
+                <w:sz w:val="28"/>
+                <w:szCs w:val="28"/>
+              </w:rPr>
+            </w:pPr>
+            <w:r>
+              <w:rPr>
+                <w:rFonts w:asciiTheme="majorBidi" w:hAnsiTheme="majorBidi" w:cstheme="majorBidi"/>
+                <w:sz w:val="28"/>
+                <w:szCs w:val="28"/>
+              </w:rPr>
+              <w:t>Must recreate container</w:t>
+            </w:r>
+          </w:p>
+        </w:tc>
+        <w:tc>
+          <w:tcPr>
+            <w:tcW w:w="3597" w:type="dxa"/>
+            <w:vAlign w:val="center"/>
+          </w:tcPr>
+          <w:p>
+            <w:pPr>
+              <w:spacing w:before="60" w:after="60"/>
+              <w:jc w:val="center"/>
+              <w:cnfStyle w:val="000000000000" w:firstRow="0" w:lastRow="0" w:firstColumn="0" w:lastColumn="0" w:oddVBand="0" w:evenVBand="0" w:oddHBand="0" w:evenHBand="0" w:firstRowFirstColumn="0" w:firstRowLastColumn="0" w:lastRowFirstColumn="0" w:lastRowLastColumn="0"/>
+              <w:rPr>
+                <w:rFonts w:asciiTheme="majorBidi" w:hAnsiTheme="majorBidi" w:cstheme="majorBidi"/>
+                <w:sz w:val="28"/>
+                <w:szCs w:val="28"/>
+              </w:rPr>
+            </w:pPr>
+            <w:r>
+              <w:rPr>
+                <w:rStyle w:val="HTMLCode"/>
+                <w:rFonts w:asciiTheme="majorBidi" w:eastAsiaTheme="majorEastAsia" w:hAnsiTheme="majorBidi" w:cstheme="majorBidi"/>
+                <w:sz w:val="28"/>
+                <w:szCs w:val="28"/>
+              </w:rPr>
+              <w:t>docker network connect/disconnect</w:t>
+            </w:r>
+          </w:p>
+        </w:tc>
+      </w:tr>
+      <w:tr>
+        <w:trPr>
+          <w:cnfStyle w:val="000000100000" w:firstRow="0" w:lastRow="0" w:firstColumn="0" w:lastColumn="0" w:oddVBand="0" w:evenVBand="0" w:oddHBand="1" w:evenHBand="0" w:firstRowFirstColumn="0" w:firstRowLastColumn="0" w:lastRowFirstColumn="0" w:lastRowLastColumn="0"/>
+        </w:trPr>
+        <w:tc>
+          <w:tcPr>
+            <w:cnfStyle w:val="001000000000" w:firstRow="0" w:lastRow="0" w:firstColumn="1" w:lastColumn="0" w:oddVBand="0" w:evenVBand="0" w:oddHBand="0" w:evenHBand="0" w:firstRowFirstColumn="0" w:firstRowLastColumn="0" w:lastRowFirstColumn="0" w:lastRowLastColumn="0"/>
+            <w:tcW w:w="3326" w:type="dxa"/>
+            <w:vAlign w:val="center"/>
+          </w:tcPr>
+          <w:p>
+            <w:pPr>
+              <w:spacing w:before="60" w:after="60"/>
+              <w:jc w:val="center"/>
+              <w:rPr>
+                <w:rFonts w:asciiTheme="majorBidi" w:hAnsiTheme="majorBidi" w:cstheme="majorBidi"/>
+                <w:b/>
+                <w:bCs/>
+                <w:sz w:val="28"/>
+                <w:szCs w:val="28"/>
+              </w:rPr>
+            </w:pPr>
+            <w:r>
+              <w:rPr>
+                <w:rFonts w:asciiTheme="majorBidi" w:hAnsiTheme="majorBidi" w:cstheme="majorBidi"/>
+                <w:b/>
+                <w:bCs/>
+                <w:sz w:val="28"/>
+                <w:szCs w:val="28"/>
+              </w:rPr>
+              <w:t>Custom subnet</w:t>
+            </w:r>
+          </w:p>
+        </w:tc>
+        <w:tc>
+          <w:tcPr>
+            <w:tcW w:w="3597" w:type="dxa"/>
+            <w:vAlign w:val="center"/>
+          </w:tcPr>
+          <w:p>
+            <w:pPr>
+              <w:spacing w:before="60" w:after="60"/>
+              <w:jc w:val="center"/>
+              <w:cnfStyle w:val="000000100000" w:firstRow="0" w:lastRow="0" w:firstColumn="0" w:lastColumn="0" w:oddVBand="0" w:evenVBand="0" w:oddHBand="1" w:evenHBand="0" w:firstRowFirstColumn="0" w:firstRowLastColumn="0" w:lastRowFirstColumn="0" w:lastRowLastColumn="0"/>
+              <w:rPr>
+                <w:rFonts w:asciiTheme="majorBidi" w:hAnsiTheme="majorBidi" w:cstheme="majorBidi"/>
+                <w:sz w:val="28"/>
+                <w:szCs w:val="28"/>
+              </w:rPr>
+            </w:pPr>
+            <w:r>
+              <w:rPr>
+                <w:rFonts w:asciiTheme="majorBidi" w:hAnsiTheme="majorBidi" w:cstheme="majorBidi"/>
+                <w:sz w:val="28"/>
+                <w:szCs w:val="28"/>
+              </w:rPr>
+              <w:t>Not easily</w:t>
+            </w:r>
+          </w:p>
+        </w:tc>
+        <w:tc>
+          <w:tcPr>
+            <w:tcW w:w="3597" w:type="dxa"/>
+            <w:vAlign w:val="center"/>
+          </w:tcPr>
+          <w:p>
+            <w:pPr>
+              <w:spacing w:before="60" w:after="60"/>
+              <w:jc w:val="center"/>
+              <w:cnfStyle w:val="000000100000" w:firstRow="0" w:lastRow="0" w:firstColumn="0" w:lastColumn="0" w:oddVBand="0" w:evenVBand="0" w:oddHBand="1" w:evenHBand="0" w:firstRowFirstColumn="0" w:firstRowLastColumn="0" w:lastRowFirstColumn="0" w:lastRowLastColumn="0"/>
+              <w:rPr>
+                <w:rFonts w:asciiTheme="majorBidi" w:hAnsiTheme="majorBidi" w:cstheme="majorBidi"/>
+                <w:sz w:val="28"/>
+                <w:szCs w:val="28"/>
+              </w:rPr>
+            </w:pPr>
+            <w:r>
+              <w:rPr>
+                <w:rStyle w:val="HTMLCode"/>
+                <w:rFonts w:asciiTheme="majorBidi" w:eastAsiaTheme="majorEastAsia" w:hAnsiTheme="majorBidi" w:cstheme="majorBidi"/>
+                <w:sz w:val="28"/>
+                <w:szCs w:val="28"/>
+              </w:rPr>
+              <w:t>--subnet</w:t>
+            </w:r>
+            <w:r>
+              <w:rPr>
+                <w:rFonts w:asciiTheme="majorBidi" w:hAnsiTheme="majorBidi" w:cstheme="majorBidi"/>
+                <w:sz w:val="28"/>
+                <w:szCs w:val="28"/>
+              </w:rPr>
+              <w:t xml:space="preserve">, </w:t>
+            </w:r>
+            <w:r>
+              <w:rPr>
+                <w:rStyle w:val="HTMLCode"/>
+                <w:rFonts w:asciiTheme="majorBidi" w:eastAsiaTheme="majorEastAsia" w:hAnsiTheme="majorBidi" w:cstheme="majorBidi"/>
+                <w:sz w:val="28"/>
+                <w:szCs w:val="28"/>
+              </w:rPr>
+              <w:t>--gateway</w:t>
+            </w:r>
+            <w:r>
+              <w:rPr>
+                <w:rFonts w:asciiTheme="majorBidi" w:hAnsiTheme="majorBidi" w:cstheme="majorBidi"/>
+                <w:sz w:val="28"/>
+                <w:szCs w:val="28"/>
+              </w:rPr>
+              <w:t xml:space="preserve"> supported</w:t>
+            </w:r>
+          </w:p>
+        </w:tc>
+      </w:tr>
+      <w:tr>
+        <w:tc>
+          <w:tcPr>
+            <w:cnfStyle w:val="001000000000" w:firstRow="0" w:lastRow="0" w:firstColumn="1" w:lastColumn="0" w:oddVBand="0" w:evenVBand="0" w:oddHBand="0" w:evenHBand="0" w:firstRowFirstColumn="0" w:firstRowLastColumn="0" w:lastRowFirstColumn="0" w:lastRowLastColumn="0"/>
+            <w:tcW w:w="3326" w:type="dxa"/>
+            <w:vAlign w:val="center"/>
+          </w:tcPr>
+          <w:p>
+            <w:pPr>
+              <w:spacing w:before="60" w:after="60"/>
+              <w:jc w:val="center"/>
+              <w:rPr>
+                <w:rFonts w:asciiTheme="majorBidi" w:hAnsiTheme="majorBidi" w:cstheme="majorBidi"/>
+                <w:b/>
+                <w:bCs/>
+                <w:sz w:val="28"/>
+                <w:szCs w:val="28"/>
+              </w:rPr>
+            </w:pPr>
+            <w:r>
+              <w:rPr>
+                <w:rFonts w:asciiTheme="majorBidi" w:hAnsiTheme="majorBidi" w:cstheme="majorBidi"/>
+                <w:b/>
+                <w:bCs/>
+                <w:sz w:val="28"/>
+                <w:szCs w:val="28"/>
+              </w:rPr>
+              <w:t>Static IP support</w:t>
+            </w:r>
+          </w:p>
+        </w:tc>
+        <w:tc>
+          <w:tcPr>
+            <w:tcW w:w="3597" w:type="dxa"/>
+            <w:vAlign w:val="center"/>
+          </w:tcPr>
+          <w:p>
+            <w:pPr>
+              <w:spacing w:before="60" w:after="60"/>
+              <w:jc w:val="center"/>
+              <w:cnfStyle w:val="000000000000" w:firstRow="0" w:lastRow="0" w:firstColumn="0" w:lastColumn="0" w:oddVBand="0" w:evenVBand="0" w:oddHBand="0" w:evenHBand="0" w:firstRowFirstColumn="0" w:firstRowLastColumn="0" w:lastRowFirstColumn="0" w:lastRowLastColumn="0"/>
+              <w:rPr>
+                <w:rFonts w:asciiTheme="majorBidi" w:hAnsiTheme="majorBidi" w:cstheme="majorBidi"/>
+                <w:sz w:val="28"/>
+                <w:szCs w:val="28"/>
+              </w:rPr>
+            </w:pPr>
+            <w:r>
+              <w:rPr>
+                <w:rFonts w:asciiTheme="majorBidi" w:hAnsiTheme="majorBidi" w:cstheme="majorBidi"/>
+                <w:sz w:val="28"/>
+                <w:szCs w:val="28"/>
+              </w:rPr>
+              <w:t>No</w:t>
+            </w:r>
+          </w:p>
+        </w:tc>
+        <w:tc>
+          <w:tcPr>
+            <w:tcW w:w="3597" w:type="dxa"/>
+            <w:vAlign w:val="center"/>
+          </w:tcPr>
+          <w:p>
+            <w:pPr>
+              <w:spacing w:before="60" w:after="60"/>
+              <w:jc w:val="center"/>
+              <w:cnfStyle w:val="000000000000" w:firstRow="0" w:lastRow="0" w:firstColumn="0" w:lastColumn="0" w:oddVBand="0" w:evenVBand="0" w:oddHBand="0" w:evenHBand="0" w:firstRowFirstColumn="0" w:firstRowLastColumn="0" w:lastRowFirstColumn="0" w:lastRowLastColumn="0"/>
+              <w:rPr>
+                <w:rFonts w:asciiTheme="majorBidi" w:hAnsiTheme="majorBidi" w:cstheme="majorBidi"/>
+                <w:sz w:val="28"/>
+                <w:szCs w:val="28"/>
+              </w:rPr>
+            </w:pPr>
+            <w:r>
+              <w:rPr>
+                <w:rFonts w:asciiTheme="majorBidi" w:hAnsiTheme="majorBidi" w:cstheme="majorBidi"/>
+                <w:sz w:val="28"/>
+                <w:szCs w:val="28"/>
+              </w:rPr>
+              <w:t>Yes (</w:t>
+            </w:r>
+            <w:r>
+              <w:rPr>
+                <w:rStyle w:val="HTMLCode"/>
+                <w:rFonts w:asciiTheme="majorBidi" w:eastAsiaTheme="majorEastAsia" w:hAnsiTheme="majorBidi" w:cstheme="majorBidi"/>
+                <w:sz w:val="28"/>
+                <w:szCs w:val="28"/>
+              </w:rPr>
+              <w:t>--</w:t>
+            </w:r>
+            <w:proofErr w:type="spellStart"/>
+            <w:r>
+              <w:rPr>
+                <w:rStyle w:val="HTMLCode"/>
+                <w:rFonts w:asciiTheme="majorBidi" w:eastAsiaTheme="majorEastAsia" w:hAnsiTheme="majorBidi" w:cstheme="majorBidi"/>
+                <w:sz w:val="28"/>
+                <w:szCs w:val="28"/>
+              </w:rPr>
+              <w:t>ip</w:t>
+            </w:r>
+            <w:proofErr w:type="spellEnd"/>
+            <w:r>
+              <w:rPr>
+                <w:rFonts w:asciiTheme="majorBidi" w:hAnsiTheme="majorBidi" w:cstheme="majorBidi"/>
+                <w:sz w:val="28"/>
+                <w:szCs w:val="28"/>
+              </w:rPr>
+              <w:t>)</w:t>
+            </w:r>
+          </w:p>
+        </w:tc>
+      </w:tr>
+      <w:tr>
+        <w:trPr>
+          <w:cnfStyle w:val="000000100000" w:firstRow="0" w:lastRow="0" w:firstColumn="0" w:lastColumn="0" w:oddVBand="0" w:evenVBand="0" w:oddHBand="1" w:evenHBand="0" w:firstRowFirstColumn="0" w:firstRowLastColumn="0" w:lastRowFirstColumn="0" w:lastRowLastColumn="0"/>
+        </w:trPr>
+        <w:tc>
+          <w:tcPr>
+            <w:cnfStyle w:val="001000000000" w:firstRow="0" w:lastRow="0" w:firstColumn="1" w:lastColumn="0" w:oddVBand="0" w:evenVBand="0" w:oddHBand="0" w:evenHBand="0" w:firstRowFirstColumn="0" w:firstRowLastColumn="0" w:lastRowFirstColumn="0" w:lastRowLastColumn="0"/>
+            <w:tcW w:w="3326" w:type="dxa"/>
+            <w:tcBorders>
+              <w:bottom w:val="single" w:sz="12" w:space="0" w:color="000000"/>
+            </w:tcBorders>
+            <w:vAlign w:val="center"/>
+          </w:tcPr>
+          <w:p>
+            <w:pPr>
+              <w:spacing w:before="60" w:after="60"/>
+              <w:jc w:val="center"/>
+              <w:rPr>
+                <w:rFonts w:asciiTheme="majorBidi" w:hAnsiTheme="majorBidi" w:cstheme="majorBidi"/>
+                <w:b/>
+                <w:bCs/>
+                <w:sz w:val="28"/>
+                <w:szCs w:val="28"/>
+              </w:rPr>
+            </w:pPr>
+            <w:r>
+              <w:rPr>
+                <w:rFonts w:asciiTheme="majorBidi" w:hAnsiTheme="majorBidi" w:cstheme="majorBidi"/>
+                <w:b/>
+                <w:bCs/>
+                <w:sz w:val="28"/>
+                <w:szCs w:val="28"/>
+              </w:rPr>
+              <w:t>Production use</w:t>
+            </w:r>
+          </w:p>
+        </w:tc>
+        <w:tc>
+          <w:tcPr>
+            <w:tcW w:w="3597" w:type="dxa"/>
+            <w:tcBorders>
+              <w:bottom w:val="single" w:sz="12" w:space="0" w:color="000000"/>
+            </w:tcBorders>
+            <w:vAlign w:val="center"/>
+          </w:tcPr>
+          <w:p>
+            <w:pPr>
+              <w:spacing w:before="60" w:after="60"/>
+              <w:jc w:val="center"/>
+              <w:cnfStyle w:val="000000100000" w:firstRow="0" w:lastRow="0" w:firstColumn="0" w:lastColumn="0" w:oddVBand="0" w:evenVBand="0" w:oddHBand="1" w:evenHBand="0" w:firstRowFirstColumn="0" w:firstRowLastColumn="0" w:lastRowFirstColumn="0" w:lastRowLastColumn="0"/>
+              <w:rPr>
+                <w:rFonts w:asciiTheme="majorBidi" w:hAnsiTheme="majorBidi" w:cstheme="majorBidi"/>
+                <w:sz w:val="28"/>
+                <w:szCs w:val="28"/>
+              </w:rPr>
+            </w:pPr>
+            <w:r>
+              <w:rPr>
+                <w:rFonts w:asciiTheme="majorBidi" w:hAnsiTheme="majorBidi" w:cstheme="majorBidi"/>
+                <w:sz w:val="28"/>
+                <w:szCs w:val="28"/>
+              </w:rPr>
+              <w:t>Not recommended</w:t>
+            </w:r>
+          </w:p>
+        </w:tc>
+        <w:tc>
+          <w:tcPr>
+            <w:tcW w:w="3597" w:type="dxa"/>
+            <w:tcBorders>
+              <w:bottom w:val="single" w:sz="12" w:space="0" w:color="000000"/>
+            </w:tcBorders>
+            <w:vAlign w:val="center"/>
+          </w:tcPr>
+          <w:p>
+            <w:pPr>
+              <w:spacing w:before="60" w:after="60"/>
+              <w:jc w:val="center"/>
+              <w:cnfStyle w:val="000000100000" w:firstRow="0" w:lastRow="0" w:firstColumn="0" w:lastColumn="0" w:oddVBand="0" w:evenVBand="0" w:oddHBand="1" w:evenHBand="0" w:firstRowFirstColumn="0" w:firstRowLastColumn="0" w:lastRowFirstColumn="0" w:lastRowLastColumn="0"/>
+              <w:rPr>
+                <w:rFonts w:asciiTheme="majorBidi" w:hAnsiTheme="majorBidi" w:cstheme="majorBidi"/>
+                <w:sz w:val="28"/>
+                <w:szCs w:val="28"/>
+              </w:rPr>
+            </w:pPr>
+            <w:r>
+              <w:rPr>
+                <w:rFonts w:asciiTheme="majorBidi" w:hAnsiTheme="majorBidi" w:cstheme="majorBidi"/>
+                <w:sz w:val="28"/>
+                <w:szCs w:val="28"/>
+              </w:rPr>
+              <w:t>Recommended</w:t>
+            </w:r>
+          </w:p>
+        </w:tc>
+      </w:tr>
+    </w:tbl>
+    <w:p>
+      <w:pPr>
+        <w:jc w:val="both"/>
+        <w:rPr>
+          <w:rFonts w:asciiTheme="majorBidi" w:hAnsiTheme="majorBidi" w:cstheme="majorBidi"/>
+          <w:sz w:val="6"/>
+          <w:szCs w:val="6"/>
+        </w:rPr>
+      </w:pPr>
     </w:p>
     <w:p>
       <w:pPr>
@@ -2401,6 +3343,16 @@
         </w:rPr>
         <w:t>Overlay Driver</w:t>
       </w:r>
+      <w:r>
+        <w:rPr>
+          <w:rFonts w:asciiTheme="majorBidi" w:hAnsiTheme="majorBidi" w:cstheme="majorBidi"/>
+          <w:b/>
+          <w:bCs/>
+          <w:sz w:val="32"/>
+          <w:szCs w:val="32"/>
+        </w:rPr>
+        <w:t>:</w:t>
+      </w:r>
     </w:p>
     <w:p>
       <w:pPr>
@@ -2527,7 +3479,6 @@
           <w:sz w:val="28"/>
           <w:szCs w:val="28"/>
         </w:rPr>
-        <w:lastRenderedPageBreak/>
         <w:t>Overlay requires:</w:t>
       </w:r>
     </w:p>
@@ -2938,6 +3889,7 @@
           <w:sz w:val="28"/>
           <w:szCs w:val="28"/>
         </w:rPr>
+        <w:lastRenderedPageBreak/>
         <w:t>Its own presence on physical LAN</w:t>
       </w:r>
     </w:p>
@@ -3452,7 +4404,6 @@
           <w:sz w:val="28"/>
           <w:szCs w:val="28"/>
         </w:rPr>
-        <w:lastRenderedPageBreak/>
         <w:t>Packets now flow via driver-managed infrastructure.</w:t>
       </w:r>
     </w:p>
@@ -3862,6 +4813,7 @@
           <w:sz w:val="28"/>
           <w:szCs w:val="28"/>
         </w:rPr>
+        <w:lastRenderedPageBreak/>
         <w:t>CNM</w:t>
       </w:r>
     </w:p>
@@ -4280,7 +5232,6 @@
           <w:sz w:val="28"/>
           <w:szCs w:val="28"/>
         </w:rPr>
-        <w:lastRenderedPageBreak/>
         <w:t>This allows:</w:t>
       </w:r>
     </w:p>
@@ -4663,6 +5614,7 @@
           <w:sz w:val="28"/>
           <w:szCs w:val="28"/>
         </w:rPr>
+        <w:lastRenderedPageBreak/>
         <w:t>Allocating IP addresses (IPAM)</w:t>
       </w:r>
     </w:p>
@@ -5095,7 +6047,6 @@
           <w:sz w:val="28"/>
           <w:szCs w:val="28"/>
         </w:rPr>
-        <w:lastRenderedPageBreak/>
         <w:t>Assigning MAC addresses (</w:t>
       </w:r>
       <w:proofErr w:type="spellStart"/>
@@ -5526,6 +6477,7 @@
           <w:sz w:val="28"/>
           <w:szCs w:val="28"/>
         </w:rPr>
+        <w:lastRenderedPageBreak/>
         <w:t>Coordinates components</w:t>
       </w:r>
     </w:p>
@@ -5993,7 +6945,6 @@
           <w:sz w:val="28"/>
           <w:szCs w:val="28"/>
         </w:rPr>
-        <w:lastRenderedPageBreak/>
         <w:t>libnetwork</w:t>
       </w:r>
       <w:proofErr w:type="spellEnd"/>
@@ -6564,6 +7515,7 @@
           <w:sz w:val="28"/>
           <w:szCs w:val="28"/>
         </w:rPr>
+        <w:lastRenderedPageBreak/>
         <w:t>Data Plane (Driver + Kernel):</w:t>
       </w:r>
     </w:p>
@@ -6973,7 +7925,6 @@
           <w:sz w:val="28"/>
           <w:szCs w:val="28"/>
         </w:rPr>
-        <w:lastRenderedPageBreak/>
         <w:t>Ethernet frames</w:t>
       </w:r>
     </w:p>
@@ -7354,6 +8305,7 @@
           <w:sz w:val="28"/>
           <w:szCs w:val="28"/>
         </w:rPr>
+        <w:lastRenderedPageBreak/>
         <w:t>ip</w:t>
       </w:r>
       <w:proofErr w:type="spellEnd"/>
@@ -7802,15 +8754,6 @@
     </w:p>
     <w:p>
       <w:pPr>
-        <w:rPr>
-          <w:rFonts w:asciiTheme="majorBidi" w:hAnsiTheme="majorBidi" w:cstheme="majorBidi"/>
-          <w:sz w:val="28"/>
-          <w:szCs w:val="28"/>
-        </w:rPr>
-      </w:pPr>
-    </w:p>
-    <w:p>
-      <w:pPr>
         <w:pStyle w:val="ListParagraph"/>
         <w:numPr>
           <w:ilvl w:val="0"/>
@@ -7829,7 +8772,6 @@
           <w:sz w:val="28"/>
           <w:szCs w:val="28"/>
         </w:rPr>
-        <w:lastRenderedPageBreak/>
         <w:t>No IP routing involved.</w:t>
       </w:r>
     </w:p>
@@ -8182,6 +9124,7 @@
           <w:sz w:val="28"/>
           <w:szCs w:val="28"/>
         </w:rPr>
+        <w:lastRenderedPageBreak/>
         <w:t>Bridge vs Router</w:t>
       </w:r>
       <w:r>
@@ -8498,7 +9441,6 @@
           <w:sz w:val="28"/>
           <w:szCs w:val="28"/>
         </w:rPr>
-        <w:lastRenderedPageBreak/>
         <w:t>docker0 usually has an IP like 172.17.0.1</w:t>
       </w:r>
     </w:p>
@@ -8634,6 +9576,2156 @@
           <w:szCs w:val="28"/>
         </w:rPr>
         <w:t>Linux bridge = software Ethernet switch inside the kernel.</w:t>
+      </w:r>
+    </w:p>
+    <w:p>
+      <w:pPr>
+        <w:rPr>
+          <w:rFonts w:asciiTheme="majorBidi" w:hAnsiTheme="majorBidi" w:cstheme="majorBidi"/>
+          <w:b/>
+          <w:bCs/>
+          <w:sz w:val="36"/>
+          <w:szCs w:val="36"/>
+        </w:rPr>
+      </w:pPr>
+      <w:r>
+        <w:rPr>
+          <w:rFonts w:asciiTheme="majorBidi" w:hAnsiTheme="majorBidi" w:cstheme="majorBidi"/>
+          <w:b/>
+          <w:bCs/>
+          <w:sz w:val="36"/>
+          <w:szCs w:val="36"/>
+        </w:rPr>
+        <w:t>Important Commands:</w:t>
+      </w:r>
+    </w:p>
+    <w:p>
+      <w:pPr>
+        <w:pStyle w:val="ListParagraph"/>
+        <w:numPr>
+          <w:ilvl w:val="0"/>
+          <w:numId w:val="39"/>
+        </w:numPr>
+        <w:spacing w:after="60"/>
+        <w:ind w:left="360"/>
+        <w:rPr>
+          <w:rFonts w:asciiTheme="majorBidi" w:hAnsiTheme="majorBidi" w:cstheme="majorBidi"/>
+          <w:b/>
+          <w:bCs/>
+          <w:i/>
+          <w:iCs/>
+          <w:sz w:val="32"/>
+          <w:szCs w:val="32"/>
+        </w:rPr>
+      </w:pPr>
+      <w:r>
+        <w:rPr>
+          <w:rFonts w:asciiTheme="majorBidi" w:hAnsiTheme="majorBidi" w:cstheme="majorBidi"/>
+          <w:b/>
+          <w:bCs/>
+          <w:i/>
+          <w:iCs/>
+          <w:sz w:val="32"/>
+          <w:szCs w:val="32"/>
+        </w:rPr>
+        <w:t>docker network create</w:t>
+      </w:r>
+    </w:p>
+    <w:p>
+      <w:pPr>
+        <w:spacing w:after="60"/>
+        <w:ind w:left="360"/>
+        <w:rPr>
+          <w:rFonts w:asciiTheme="majorBidi" w:hAnsiTheme="majorBidi" w:cstheme="majorBidi"/>
+          <w:sz w:val="28"/>
+          <w:szCs w:val="28"/>
+        </w:rPr>
+      </w:pPr>
+      <w:r>
+        <w:rPr>
+          <w:rFonts w:asciiTheme="majorBidi" w:hAnsiTheme="majorBidi" w:cstheme="majorBidi"/>
+          <w:sz w:val="28"/>
+          <w:szCs w:val="28"/>
+        </w:rPr>
+        <w:t>Creates a new network.</w:t>
+      </w:r>
+    </w:p>
+    <w:p>
+      <w:pPr>
+        <w:spacing w:after="60"/>
+        <w:ind w:left="360"/>
+        <w:rPr>
+          <w:rFonts w:asciiTheme="majorBidi" w:hAnsiTheme="majorBidi" w:cstheme="majorBidi"/>
+          <w:sz w:val="28"/>
+          <w:szCs w:val="28"/>
+        </w:rPr>
+      </w:pPr>
+      <w:r>
+        <w:rPr>
+          <w:rFonts w:asciiTheme="majorBidi" w:hAnsiTheme="majorBidi" w:cstheme="majorBidi"/>
+          <w:sz w:val="28"/>
+          <w:szCs w:val="28"/>
+        </w:rPr>
+        <w:t>Basic:</w:t>
+      </w:r>
+    </w:p>
+    <w:p>
+      <w:pPr>
+        <w:spacing w:after="60"/>
+        <w:ind w:left="360"/>
+        <w:rPr>
+          <w:rFonts w:asciiTheme="majorBidi" w:hAnsiTheme="majorBidi" w:cstheme="majorBidi"/>
+          <w:b/>
+          <w:bCs/>
+          <w:i/>
+          <w:iCs/>
+          <w:sz w:val="28"/>
+          <w:szCs w:val="28"/>
+        </w:rPr>
+      </w:pPr>
+      <w:r>
+        <w:rPr>
+          <w:rFonts w:asciiTheme="majorBidi" w:hAnsiTheme="majorBidi" w:cstheme="majorBidi"/>
+          <w:b/>
+          <w:bCs/>
+          <w:i/>
+          <w:iCs/>
+          <w:sz w:val="28"/>
+          <w:szCs w:val="28"/>
+        </w:rPr>
+        <w:t xml:space="preserve">docker network create </w:t>
+      </w:r>
+      <w:proofErr w:type="spellStart"/>
+      <w:r>
+        <w:rPr>
+          <w:rFonts w:asciiTheme="majorBidi" w:hAnsiTheme="majorBidi" w:cstheme="majorBidi"/>
+          <w:b/>
+          <w:bCs/>
+          <w:i/>
+          <w:iCs/>
+          <w:sz w:val="28"/>
+          <w:szCs w:val="28"/>
+        </w:rPr>
+        <w:t>mynet</w:t>
+      </w:r>
+      <w:proofErr w:type="spellEnd"/>
+    </w:p>
+    <w:p>
+      <w:pPr>
+        <w:spacing w:after="0"/>
+        <w:ind w:left="360"/>
+        <w:rPr>
+          <w:rFonts w:asciiTheme="majorBidi" w:hAnsiTheme="majorBidi" w:cstheme="majorBidi"/>
+          <w:sz w:val="28"/>
+          <w:szCs w:val="28"/>
+        </w:rPr>
+      </w:pPr>
+      <w:r>
+        <w:rPr>
+          <w:rFonts w:asciiTheme="majorBidi" w:hAnsiTheme="majorBidi" w:cstheme="majorBidi"/>
+          <w:sz w:val="28"/>
+          <w:szCs w:val="28"/>
+        </w:rPr>
+        <w:t>Important options:</w:t>
+      </w:r>
+    </w:p>
+    <w:p>
+      <w:pPr>
+        <w:pStyle w:val="ListParagraph"/>
+        <w:numPr>
+          <w:ilvl w:val="1"/>
+          <w:numId w:val="39"/>
+        </w:numPr>
+        <w:spacing w:after="0"/>
+        <w:ind w:left="720"/>
+        <w:rPr>
+          <w:rFonts w:asciiTheme="majorBidi" w:hAnsiTheme="majorBidi" w:cstheme="majorBidi"/>
+          <w:sz w:val="28"/>
+          <w:szCs w:val="28"/>
+        </w:rPr>
+      </w:pPr>
+      <w:r>
+        <w:rPr>
+          <w:rFonts w:asciiTheme="majorBidi" w:hAnsiTheme="majorBidi" w:cstheme="majorBidi"/>
+          <w:b/>
+          <w:bCs/>
+          <w:i/>
+          <w:iCs/>
+          <w:sz w:val="28"/>
+          <w:szCs w:val="28"/>
+        </w:rPr>
+        <w:t>--driver</w:t>
+      </w:r>
+      <w:r>
+        <w:rPr>
+          <w:rFonts w:asciiTheme="majorBidi" w:hAnsiTheme="majorBidi" w:cstheme="majorBidi"/>
+          <w:sz w:val="28"/>
+          <w:szCs w:val="28"/>
+        </w:rPr>
+        <w:t xml:space="preserve"> </w:t>
+      </w:r>
+      <w:r>
+        <w:rPr>
+          <w:rFonts w:asciiTheme="majorBidi" w:hAnsiTheme="majorBidi" w:cstheme="majorBidi"/>
+          <w:sz w:val="28"/>
+          <w:szCs w:val="28"/>
+        </w:rPr>
+        <w:t>→ Choose backend implementation.</w:t>
+      </w:r>
+      <w:r>
+        <w:rPr>
+          <w:rFonts w:asciiTheme="majorBidi" w:hAnsiTheme="majorBidi" w:cstheme="majorBidi"/>
+          <w:sz w:val="28"/>
+          <w:szCs w:val="28"/>
+        </w:rPr>
+        <w:t xml:space="preserve"> Example:</w:t>
+      </w:r>
+    </w:p>
+    <w:p>
+      <w:pPr>
+        <w:spacing w:after="0"/>
+        <w:ind w:left="720"/>
+        <w:rPr>
+          <w:rFonts w:asciiTheme="majorBidi" w:hAnsiTheme="majorBidi" w:cstheme="majorBidi"/>
+          <w:b/>
+          <w:bCs/>
+          <w:i/>
+          <w:iCs/>
+          <w:sz w:val="28"/>
+          <w:szCs w:val="28"/>
+        </w:rPr>
+      </w:pPr>
+      <w:r>
+        <w:rPr>
+          <w:rFonts w:asciiTheme="majorBidi" w:hAnsiTheme="majorBidi" w:cstheme="majorBidi"/>
+          <w:b/>
+          <w:bCs/>
+          <w:i/>
+          <w:iCs/>
+          <w:sz w:val="28"/>
+          <w:szCs w:val="28"/>
+        </w:rPr>
+        <w:t xml:space="preserve">docker network create --driver bridge </w:t>
+      </w:r>
+      <w:proofErr w:type="spellStart"/>
+      <w:r>
+        <w:rPr>
+          <w:rFonts w:asciiTheme="majorBidi" w:hAnsiTheme="majorBidi" w:cstheme="majorBidi"/>
+          <w:b/>
+          <w:bCs/>
+          <w:i/>
+          <w:iCs/>
+          <w:sz w:val="28"/>
+          <w:szCs w:val="28"/>
+        </w:rPr>
+        <w:t>mynet</w:t>
+      </w:r>
+      <w:proofErr w:type="spellEnd"/>
+    </w:p>
+    <w:p>
+      <w:pPr>
+        <w:spacing w:after="0"/>
+        <w:ind w:left="720"/>
+        <w:rPr>
+          <w:rFonts w:asciiTheme="majorBidi" w:hAnsiTheme="majorBidi" w:cstheme="majorBidi"/>
+          <w:sz w:val="28"/>
+          <w:szCs w:val="28"/>
+        </w:rPr>
+      </w:pPr>
+      <w:r>
+        <w:rPr>
+          <w:rFonts w:asciiTheme="majorBidi" w:hAnsiTheme="majorBidi" w:cstheme="majorBidi"/>
+          <w:sz w:val="28"/>
+          <w:szCs w:val="28"/>
+        </w:rPr>
+        <w:t>Common values:</w:t>
+      </w:r>
+    </w:p>
+    <w:p>
+      <w:pPr>
+        <w:pStyle w:val="ListParagraph"/>
+        <w:numPr>
+          <w:ilvl w:val="2"/>
+          <w:numId w:val="39"/>
+        </w:numPr>
+        <w:ind w:left="1080"/>
+        <w:rPr>
+          <w:rFonts w:asciiTheme="majorBidi" w:hAnsiTheme="majorBidi" w:cstheme="majorBidi"/>
+          <w:sz w:val="28"/>
+          <w:szCs w:val="28"/>
+        </w:rPr>
+      </w:pPr>
+      <w:r>
+        <w:rPr>
+          <w:rFonts w:asciiTheme="majorBidi" w:hAnsiTheme="majorBidi" w:cstheme="majorBidi"/>
+          <w:sz w:val="28"/>
+          <w:szCs w:val="28"/>
+        </w:rPr>
+        <w:lastRenderedPageBreak/>
+        <w:t>bridge</w:t>
+      </w:r>
+    </w:p>
+    <w:p>
+      <w:pPr>
+        <w:pStyle w:val="ListParagraph"/>
+        <w:numPr>
+          <w:ilvl w:val="2"/>
+          <w:numId w:val="39"/>
+        </w:numPr>
+        <w:ind w:left="1080"/>
+        <w:rPr>
+          <w:rFonts w:asciiTheme="majorBidi" w:hAnsiTheme="majorBidi" w:cstheme="majorBidi"/>
+          <w:sz w:val="28"/>
+          <w:szCs w:val="28"/>
+        </w:rPr>
+      </w:pPr>
+      <w:r>
+        <w:rPr>
+          <w:rFonts w:asciiTheme="majorBidi" w:hAnsiTheme="majorBidi" w:cstheme="majorBidi"/>
+          <w:sz w:val="28"/>
+          <w:szCs w:val="28"/>
+        </w:rPr>
+        <w:t>overlay</w:t>
+      </w:r>
+    </w:p>
+    <w:p>
+      <w:pPr>
+        <w:pStyle w:val="ListParagraph"/>
+        <w:numPr>
+          <w:ilvl w:val="2"/>
+          <w:numId w:val="39"/>
+        </w:numPr>
+        <w:ind w:left="1080"/>
+        <w:rPr>
+          <w:rFonts w:asciiTheme="majorBidi" w:hAnsiTheme="majorBidi" w:cstheme="majorBidi"/>
+          <w:sz w:val="28"/>
+          <w:szCs w:val="28"/>
+        </w:rPr>
+      </w:pPr>
+      <w:r>
+        <w:rPr>
+          <w:rFonts w:asciiTheme="majorBidi" w:hAnsiTheme="majorBidi" w:cstheme="majorBidi"/>
+          <w:sz w:val="28"/>
+          <w:szCs w:val="28"/>
+        </w:rPr>
+        <w:t>host</w:t>
+      </w:r>
+    </w:p>
+    <w:p>
+      <w:pPr>
+        <w:pStyle w:val="ListParagraph"/>
+        <w:numPr>
+          <w:ilvl w:val="2"/>
+          <w:numId w:val="39"/>
+        </w:numPr>
+        <w:ind w:left="1080"/>
+        <w:rPr>
+          <w:rFonts w:asciiTheme="majorBidi" w:hAnsiTheme="majorBidi" w:cstheme="majorBidi"/>
+          <w:sz w:val="28"/>
+          <w:szCs w:val="28"/>
+        </w:rPr>
+      </w:pPr>
+      <w:proofErr w:type="spellStart"/>
+      <w:r>
+        <w:rPr>
+          <w:rFonts w:asciiTheme="majorBidi" w:hAnsiTheme="majorBidi" w:cstheme="majorBidi"/>
+          <w:sz w:val="28"/>
+          <w:szCs w:val="28"/>
+        </w:rPr>
+        <w:t>macvlan</w:t>
+      </w:r>
+      <w:proofErr w:type="spellEnd"/>
+    </w:p>
+    <w:p>
+      <w:pPr>
+        <w:pStyle w:val="ListParagraph"/>
+        <w:numPr>
+          <w:ilvl w:val="2"/>
+          <w:numId w:val="39"/>
+        </w:numPr>
+        <w:ind w:left="1080"/>
+        <w:rPr>
+          <w:rFonts w:asciiTheme="majorBidi" w:hAnsiTheme="majorBidi" w:cstheme="majorBidi"/>
+          <w:sz w:val="28"/>
+          <w:szCs w:val="28"/>
+        </w:rPr>
+      </w:pPr>
+      <w:r>
+        <w:rPr>
+          <w:rFonts w:asciiTheme="majorBidi" w:hAnsiTheme="majorBidi" w:cstheme="majorBidi"/>
+          <w:sz w:val="28"/>
+          <w:szCs w:val="28"/>
+        </w:rPr>
+        <w:t>none</w:t>
+      </w:r>
+    </w:p>
+    <w:p>
+      <w:pPr>
+        <w:pStyle w:val="ListParagraph"/>
+        <w:ind w:left="1080"/>
+        <w:rPr>
+          <w:rFonts w:asciiTheme="majorBidi" w:hAnsiTheme="majorBidi" w:cstheme="majorBidi"/>
+          <w:sz w:val="6"/>
+          <w:szCs w:val="6"/>
+        </w:rPr>
+      </w:pPr>
+    </w:p>
+    <w:p>
+      <w:pPr>
+        <w:pStyle w:val="ListParagraph"/>
+        <w:numPr>
+          <w:ilvl w:val="2"/>
+          <w:numId w:val="41"/>
+        </w:numPr>
+        <w:spacing w:after="0"/>
+        <w:ind w:left="720"/>
+        <w:rPr>
+          <w:rFonts w:asciiTheme="majorBidi" w:hAnsiTheme="majorBidi" w:cstheme="majorBidi"/>
+          <w:b/>
+          <w:bCs/>
+          <w:i/>
+          <w:iCs/>
+          <w:sz w:val="28"/>
+          <w:szCs w:val="28"/>
+        </w:rPr>
+      </w:pPr>
+      <w:r>
+        <w:rPr>
+          <w:rFonts w:asciiTheme="majorBidi" w:hAnsiTheme="majorBidi" w:cstheme="majorBidi"/>
+          <w:b/>
+          <w:bCs/>
+          <w:i/>
+          <w:iCs/>
+          <w:sz w:val="28"/>
+          <w:szCs w:val="28"/>
+        </w:rPr>
+        <w:t>--</w:t>
+      </w:r>
+      <w:r>
+        <w:rPr>
+          <w:rFonts w:asciiTheme="majorBidi" w:hAnsiTheme="majorBidi" w:cstheme="majorBidi"/>
+          <w:b/>
+          <w:bCs/>
+          <w:i/>
+          <w:iCs/>
+          <w:sz w:val="28"/>
+          <w:szCs w:val="28"/>
+        </w:rPr>
+        <w:t>subnet</w:t>
+      </w:r>
+      <w:r>
+        <w:rPr>
+          <w:rFonts w:asciiTheme="majorBidi" w:hAnsiTheme="majorBidi" w:cstheme="majorBidi"/>
+          <w:b/>
+          <w:bCs/>
+          <w:i/>
+          <w:iCs/>
+          <w:sz w:val="28"/>
+          <w:szCs w:val="28"/>
+        </w:rPr>
+        <w:t xml:space="preserve"> </w:t>
+      </w:r>
+      <w:r>
+        <w:rPr>
+          <w:rFonts w:asciiTheme="majorBidi" w:hAnsiTheme="majorBidi" w:cstheme="majorBidi"/>
+          <w:sz w:val="28"/>
+          <w:szCs w:val="28"/>
+        </w:rPr>
+        <w:t>→ Define custom subnet.</w:t>
+      </w:r>
+      <w:r>
+        <w:rPr>
+          <w:rFonts w:asciiTheme="majorBidi" w:hAnsiTheme="majorBidi" w:cstheme="majorBidi"/>
+          <w:sz w:val="28"/>
+          <w:szCs w:val="28"/>
+        </w:rPr>
+        <w:t xml:space="preserve"> Example:</w:t>
+      </w:r>
+    </w:p>
+    <w:p>
+      <w:pPr>
+        <w:spacing w:after="60"/>
+        <w:ind w:left="720"/>
+        <w:rPr>
+          <w:rFonts w:asciiTheme="majorBidi" w:hAnsiTheme="majorBidi" w:cstheme="majorBidi"/>
+          <w:b/>
+          <w:bCs/>
+          <w:i/>
+          <w:iCs/>
+          <w:sz w:val="28"/>
+          <w:szCs w:val="28"/>
+        </w:rPr>
+      </w:pPr>
+      <w:r>
+        <w:rPr>
+          <w:rFonts w:asciiTheme="majorBidi" w:hAnsiTheme="majorBidi" w:cstheme="majorBidi"/>
+          <w:b/>
+          <w:bCs/>
+          <w:i/>
+          <w:iCs/>
+          <w:sz w:val="28"/>
+          <w:szCs w:val="28"/>
+        </w:rPr>
+        <w:t xml:space="preserve">docker network create --subnet 10.10.0.0/16 </w:t>
+      </w:r>
+      <w:proofErr w:type="spellStart"/>
+      <w:r>
+        <w:rPr>
+          <w:rFonts w:asciiTheme="majorBidi" w:hAnsiTheme="majorBidi" w:cstheme="majorBidi"/>
+          <w:b/>
+          <w:bCs/>
+          <w:i/>
+          <w:iCs/>
+          <w:sz w:val="28"/>
+          <w:szCs w:val="28"/>
+        </w:rPr>
+        <w:t>mynet</w:t>
+      </w:r>
+      <w:proofErr w:type="spellEnd"/>
+    </w:p>
+    <w:p>
+      <w:pPr>
+        <w:pStyle w:val="ListParagraph"/>
+        <w:numPr>
+          <w:ilvl w:val="0"/>
+          <w:numId w:val="42"/>
+        </w:numPr>
+        <w:spacing w:after="0"/>
+        <w:rPr>
+          <w:rFonts w:asciiTheme="majorBidi" w:hAnsiTheme="majorBidi" w:cstheme="majorBidi"/>
+          <w:b/>
+          <w:bCs/>
+          <w:i/>
+          <w:iCs/>
+          <w:sz w:val="28"/>
+          <w:szCs w:val="28"/>
+        </w:rPr>
+      </w:pPr>
+      <w:r>
+        <w:rPr>
+          <w:rFonts w:asciiTheme="majorBidi" w:hAnsiTheme="majorBidi" w:cstheme="majorBidi"/>
+          <w:b/>
+          <w:bCs/>
+          <w:i/>
+          <w:iCs/>
+          <w:sz w:val="28"/>
+          <w:szCs w:val="28"/>
+        </w:rPr>
+        <w:t>--gateway</w:t>
+      </w:r>
+      <w:r>
+        <w:rPr>
+          <w:rFonts w:asciiTheme="majorBidi" w:hAnsiTheme="majorBidi" w:cstheme="majorBidi"/>
+          <w:b/>
+          <w:bCs/>
+          <w:i/>
+          <w:iCs/>
+          <w:sz w:val="28"/>
+          <w:szCs w:val="28"/>
+        </w:rPr>
+        <w:t xml:space="preserve"> </w:t>
+      </w:r>
+      <w:r>
+        <w:rPr>
+          <w:rFonts w:asciiTheme="majorBidi" w:hAnsiTheme="majorBidi" w:cstheme="majorBidi"/>
+          <w:sz w:val="28"/>
+          <w:szCs w:val="28"/>
+        </w:rPr>
+        <w:t>→ Define gateway IP manually.</w:t>
+      </w:r>
+      <w:r>
+        <w:rPr>
+          <w:rFonts w:asciiTheme="majorBidi" w:hAnsiTheme="majorBidi" w:cstheme="majorBidi"/>
+          <w:sz w:val="28"/>
+          <w:szCs w:val="28"/>
+        </w:rPr>
+        <w:t xml:space="preserve"> Example:</w:t>
+      </w:r>
+    </w:p>
+    <w:p>
+      <w:pPr>
+        <w:spacing w:after="60"/>
+        <w:ind w:left="720"/>
+        <w:rPr>
+          <w:rFonts w:asciiTheme="majorBidi" w:hAnsiTheme="majorBidi" w:cstheme="majorBidi"/>
+          <w:b/>
+          <w:bCs/>
+          <w:i/>
+          <w:iCs/>
+          <w:sz w:val="28"/>
+          <w:szCs w:val="28"/>
+        </w:rPr>
+      </w:pPr>
+      <w:r>
+        <w:rPr>
+          <w:rFonts w:asciiTheme="majorBidi" w:hAnsiTheme="majorBidi" w:cstheme="majorBidi"/>
+          <w:b/>
+          <w:bCs/>
+          <w:i/>
+          <w:iCs/>
+          <w:sz w:val="28"/>
+          <w:szCs w:val="28"/>
+        </w:rPr>
+        <w:t>docker network create --subnet 10.10.0.0/16 --gateway 10.10.0.1</w:t>
+      </w:r>
+      <w:r>
+        <w:rPr>
+          <w:rFonts w:asciiTheme="majorBidi" w:hAnsiTheme="majorBidi" w:cstheme="majorBidi"/>
+          <w:b/>
+          <w:bCs/>
+          <w:i/>
+          <w:iCs/>
+          <w:sz w:val="28"/>
+          <w:szCs w:val="28"/>
+        </w:rPr>
+        <w:t xml:space="preserve"> </w:t>
+      </w:r>
+      <w:proofErr w:type="spellStart"/>
+      <w:r>
+        <w:rPr>
+          <w:rFonts w:asciiTheme="majorBidi" w:hAnsiTheme="majorBidi" w:cstheme="majorBidi"/>
+          <w:b/>
+          <w:bCs/>
+          <w:i/>
+          <w:iCs/>
+          <w:sz w:val="28"/>
+          <w:szCs w:val="28"/>
+        </w:rPr>
+        <w:t>mynet</w:t>
+      </w:r>
+      <w:proofErr w:type="spellEnd"/>
+    </w:p>
+    <w:p>
+      <w:pPr>
+        <w:pStyle w:val="ListParagraph"/>
+        <w:numPr>
+          <w:ilvl w:val="0"/>
+          <w:numId w:val="42"/>
+        </w:numPr>
+        <w:rPr>
+          <w:rFonts w:asciiTheme="majorBidi" w:hAnsiTheme="majorBidi" w:cstheme="majorBidi"/>
+          <w:b/>
+          <w:bCs/>
+          <w:i/>
+          <w:iCs/>
+          <w:sz w:val="28"/>
+          <w:szCs w:val="28"/>
+        </w:rPr>
+      </w:pPr>
+      <w:r>
+        <w:rPr>
+          <w:rFonts w:asciiTheme="majorBidi" w:hAnsiTheme="majorBidi" w:cstheme="majorBidi"/>
+          <w:b/>
+          <w:bCs/>
+          <w:i/>
+          <w:iCs/>
+          <w:sz w:val="28"/>
+          <w:szCs w:val="28"/>
+        </w:rPr>
+        <w:t>--</w:t>
+      </w:r>
+      <w:proofErr w:type="spellStart"/>
+      <w:r>
+        <w:rPr>
+          <w:rFonts w:asciiTheme="majorBidi" w:hAnsiTheme="majorBidi" w:cstheme="majorBidi"/>
+          <w:b/>
+          <w:bCs/>
+          <w:i/>
+          <w:iCs/>
+          <w:sz w:val="28"/>
+          <w:szCs w:val="28"/>
+        </w:rPr>
+        <w:t>ip</w:t>
+      </w:r>
+      <w:proofErr w:type="spellEnd"/>
+      <w:r>
+        <w:rPr>
+          <w:rFonts w:asciiTheme="majorBidi" w:hAnsiTheme="majorBidi" w:cstheme="majorBidi"/>
+          <w:b/>
+          <w:bCs/>
+          <w:i/>
+          <w:iCs/>
+          <w:sz w:val="28"/>
+          <w:szCs w:val="28"/>
+        </w:rPr>
+        <w:t>-range</w:t>
+      </w:r>
+      <w:r>
+        <w:rPr>
+          <w:rFonts w:asciiTheme="majorBidi" w:hAnsiTheme="majorBidi" w:cstheme="majorBidi"/>
+          <w:b/>
+          <w:bCs/>
+          <w:i/>
+          <w:iCs/>
+          <w:sz w:val="28"/>
+          <w:szCs w:val="28"/>
+        </w:rPr>
+        <w:t xml:space="preserve"> </w:t>
+      </w:r>
+      <w:r>
+        <w:rPr>
+          <w:rFonts w:asciiTheme="majorBidi" w:hAnsiTheme="majorBidi" w:cstheme="majorBidi"/>
+          <w:sz w:val="28"/>
+          <w:szCs w:val="28"/>
+        </w:rPr>
+        <w:t xml:space="preserve">→ </w:t>
+      </w:r>
+      <w:r>
+        <w:rPr>
+          <w:rFonts w:asciiTheme="majorBidi" w:hAnsiTheme="majorBidi" w:cstheme="majorBidi"/>
+          <w:sz w:val="28"/>
+          <w:szCs w:val="28"/>
+        </w:rPr>
+        <w:t>Define smaller allocation pool inside subnet.</w:t>
+      </w:r>
+      <w:r>
+        <w:rPr>
+          <w:rFonts w:asciiTheme="majorBidi" w:hAnsiTheme="majorBidi" w:cstheme="majorBidi"/>
+          <w:sz w:val="28"/>
+          <w:szCs w:val="28"/>
+        </w:rPr>
+        <w:t xml:space="preserve"> </w:t>
+      </w:r>
+      <w:r>
+        <w:rPr>
+          <w:rFonts w:asciiTheme="majorBidi" w:hAnsiTheme="majorBidi" w:cstheme="majorBidi"/>
+          <w:sz w:val="28"/>
+          <w:szCs w:val="28"/>
+        </w:rPr>
+        <w:t>Used for IPAM control.</w:t>
+      </w:r>
+    </w:p>
+    <w:p>
+      <w:pPr>
+        <w:pStyle w:val="ListParagraph"/>
+        <w:rPr>
+          <w:rFonts w:asciiTheme="majorBidi" w:hAnsiTheme="majorBidi" w:cstheme="majorBidi"/>
+          <w:b/>
+          <w:bCs/>
+          <w:i/>
+          <w:iCs/>
+          <w:sz w:val="8"/>
+          <w:szCs w:val="8"/>
+        </w:rPr>
+      </w:pPr>
+    </w:p>
+    <w:p>
+      <w:pPr>
+        <w:pStyle w:val="ListParagraph"/>
+        <w:numPr>
+          <w:ilvl w:val="0"/>
+          <w:numId w:val="42"/>
+        </w:numPr>
+        <w:rPr>
+          <w:rFonts w:asciiTheme="majorBidi" w:hAnsiTheme="majorBidi" w:cstheme="majorBidi"/>
+          <w:sz w:val="28"/>
+          <w:szCs w:val="28"/>
+        </w:rPr>
+      </w:pPr>
+      <w:r>
+        <w:rPr>
+          <w:rFonts w:asciiTheme="majorBidi" w:hAnsiTheme="majorBidi" w:cstheme="majorBidi"/>
+          <w:b/>
+          <w:bCs/>
+          <w:i/>
+          <w:iCs/>
+          <w:sz w:val="28"/>
+          <w:szCs w:val="28"/>
+        </w:rPr>
+        <w:t>--internal</w:t>
+      </w:r>
+      <w:r>
+        <w:rPr>
+          <w:rFonts w:asciiTheme="majorBidi" w:hAnsiTheme="majorBidi" w:cstheme="majorBidi"/>
+          <w:sz w:val="28"/>
+          <w:szCs w:val="28"/>
+        </w:rPr>
+        <w:t xml:space="preserve"> </w:t>
+      </w:r>
+      <w:r>
+        <w:rPr>
+          <w:rFonts w:asciiTheme="majorBidi" w:hAnsiTheme="majorBidi" w:cstheme="majorBidi"/>
+          <w:sz w:val="28"/>
+          <w:szCs w:val="28"/>
+        </w:rPr>
+        <w:t xml:space="preserve">→ </w:t>
+      </w:r>
+      <w:r>
+        <w:rPr>
+          <w:rFonts w:asciiTheme="majorBidi" w:hAnsiTheme="majorBidi" w:cstheme="majorBidi"/>
+          <w:sz w:val="28"/>
+          <w:szCs w:val="28"/>
+        </w:rPr>
+        <w:t>Prevents external access.</w:t>
+      </w:r>
+      <w:r>
+        <w:rPr>
+          <w:rFonts w:asciiTheme="majorBidi" w:hAnsiTheme="majorBidi" w:cstheme="majorBidi"/>
+          <w:sz w:val="28"/>
+          <w:szCs w:val="28"/>
+        </w:rPr>
+        <w:t xml:space="preserve"> </w:t>
+      </w:r>
+      <w:r>
+        <w:rPr>
+          <w:rFonts w:asciiTheme="majorBidi" w:hAnsiTheme="majorBidi" w:cstheme="majorBidi"/>
+          <w:sz w:val="28"/>
+          <w:szCs w:val="28"/>
+        </w:rPr>
+        <w:t>Containers can talk to each other but cannot reach outside internet.</w:t>
+      </w:r>
+      <w:r>
+        <w:rPr>
+          <w:rFonts w:asciiTheme="majorBidi" w:hAnsiTheme="majorBidi" w:cstheme="majorBidi"/>
+          <w:sz w:val="28"/>
+          <w:szCs w:val="28"/>
+        </w:rPr>
+        <w:t xml:space="preserve"> </w:t>
+      </w:r>
+      <w:r>
+        <w:rPr>
+          <w:rFonts w:asciiTheme="majorBidi" w:hAnsiTheme="majorBidi" w:cstheme="majorBidi"/>
+          <w:sz w:val="28"/>
+          <w:szCs w:val="28"/>
+        </w:rPr>
+        <w:t>Very useful for databases.</w:t>
+      </w:r>
+    </w:p>
+    <w:p>
+      <w:pPr>
+        <w:pStyle w:val="ListParagraph"/>
+        <w:rPr>
+          <w:rFonts w:asciiTheme="majorBidi" w:hAnsiTheme="majorBidi" w:cstheme="majorBidi"/>
+          <w:sz w:val="8"/>
+          <w:szCs w:val="8"/>
+        </w:rPr>
+      </w:pPr>
+    </w:p>
+    <w:p>
+      <w:pPr>
+        <w:pStyle w:val="ListParagraph"/>
+        <w:numPr>
+          <w:ilvl w:val="0"/>
+          <w:numId w:val="42"/>
+        </w:numPr>
+        <w:rPr>
+          <w:rFonts w:asciiTheme="majorBidi" w:hAnsiTheme="majorBidi" w:cstheme="majorBidi"/>
+          <w:b/>
+          <w:bCs/>
+          <w:i/>
+          <w:iCs/>
+          <w:sz w:val="28"/>
+          <w:szCs w:val="28"/>
+        </w:rPr>
+      </w:pPr>
+      <w:r>
+        <w:rPr>
+          <w:rFonts w:asciiTheme="majorBidi" w:hAnsiTheme="majorBidi" w:cstheme="majorBidi"/>
+          <w:b/>
+          <w:bCs/>
+          <w:i/>
+          <w:iCs/>
+          <w:sz w:val="28"/>
+          <w:szCs w:val="28"/>
+        </w:rPr>
+        <w:t>--attachable</w:t>
+      </w:r>
+      <w:r>
+        <w:rPr>
+          <w:rFonts w:asciiTheme="majorBidi" w:hAnsiTheme="majorBidi" w:cstheme="majorBidi"/>
+          <w:b/>
+          <w:bCs/>
+          <w:i/>
+          <w:iCs/>
+          <w:sz w:val="28"/>
+          <w:szCs w:val="28"/>
+        </w:rPr>
+        <w:t xml:space="preserve"> </w:t>
+      </w:r>
+      <w:r>
+        <w:rPr>
+          <w:rFonts w:asciiTheme="majorBidi" w:hAnsiTheme="majorBidi" w:cstheme="majorBidi"/>
+          <w:sz w:val="28"/>
+          <w:szCs w:val="28"/>
+        </w:rPr>
+        <w:t xml:space="preserve">→ </w:t>
+      </w:r>
+      <w:r>
+        <w:rPr>
+          <w:rFonts w:asciiTheme="majorBidi" w:hAnsiTheme="majorBidi" w:cstheme="majorBidi"/>
+          <w:sz w:val="28"/>
+          <w:szCs w:val="28"/>
+        </w:rPr>
+        <w:t>Overlay networks only (Swarm).</w:t>
+      </w:r>
+      <w:r>
+        <w:rPr>
+          <w:rFonts w:asciiTheme="majorBidi" w:hAnsiTheme="majorBidi" w:cstheme="majorBidi"/>
+          <w:sz w:val="28"/>
+          <w:szCs w:val="28"/>
+        </w:rPr>
+        <w:t xml:space="preserve"> </w:t>
+      </w:r>
+      <w:r>
+        <w:rPr>
+          <w:rFonts w:asciiTheme="majorBidi" w:hAnsiTheme="majorBidi" w:cstheme="majorBidi"/>
+          <w:sz w:val="28"/>
+          <w:szCs w:val="28"/>
+        </w:rPr>
+        <w:t>Allows standalone containers to join.</w:t>
+      </w:r>
+    </w:p>
+    <w:p>
+      <w:pPr>
+        <w:pStyle w:val="ListParagraph"/>
+        <w:rPr>
+          <w:rFonts w:asciiTheme="majorBidi" w:hAnsiTheme="majorBidi" w:cstheme="majorBidi"/>
+          <w:sz w:val="8"/>
+          <w:szCs w:val="8"/>
+        </w:rPr>
+      </w:pPr>
+    </w:p>
+    <w:p>
+      <w:pPr>
+        <w:pStyle w:val="ListParagraph"/>
+        <w:numPr>
+          <w:ilvl w:val="0"/>
+          <w:numId w:val="42"/>
+        </w:numPr>
+        <w:rPr>
+          <w:rFonts w:asciiTheme="majorBidi" w:hAnsiTheme="majorBidi" w:cstheme="majorBidi"/>
+          <w:b/>
+          <w:bCs/>
+          <w:i/>
+          <w:iCs/>
+          <w:sz w:val="28"/>
+          <w:szCs w:val="28"/>
+        </w:rPr>
+      </w:pPr>
+      <w:r>
+        <w:rPr>
+          <w:rFonts w:asciiTheme="majorBidi" w:hAnsiTheme="majorBidi" w:cstheme="majorBidi"/>
+          <w:b/>
+          <w:bCs/>
+          <w:i/>
+          <w:iCs/>
+          <w:sz w:val="28"/>
+          <w:szCs w:val="28"/>
+        </w:rPr>
+        <w:t>--opt</w:t>
+      </w:r>
+      <w:r>
+        <w:rPr>
+          <w:rFonts w:asciiTheme="majorBidi" w:hAnsiTheme="majorBidi" w:cstheme="majorBidi"/>
+          <w:b/>
+          <w:bCs/>
+          <w:i/>
+          <w:iCs/>
+          <w:sz w:val="28"/>
+          <w:szCs w:val="28"/>
+        </w:rPr>
+        <w:t xml:space="preserve"> </w:t>
+      </w:r>
+      <w:r>
+        <w:rPr>
+          <w:rFonts w:asciiTheme="majorBidi" w:hAnsiTheme="majorBidi" w:cstheme="majorBidi"/>
+          <w:sz w:val="28"/>
+          <w:szCs w:val="28"/>
+        </w:rPr>
+        <w:t xml:space="preserve">→ </w:t>
+      </w:r>
+      <w:r>
+        <w:rPr>
+          <w:rFonts w:asciiTheme="majorBidi" w:hAnsiTheme="majorBidi" w:cstheme="majorBidi"/>
+          <w:sz w:val="28"/>
+          <w:szCs w:val="28"/>
+        </w:rPr>
+        <w:t>Driver-specific options.</w:t>
+      </w:r>
+      <w:r>
+        <w:rPr>
+          <w:rFonts w:asciiTheme="majorBidi" w:hAnsiTheme="majorBidi" w:cstheme="majorBidi"/>
+          <w:sz w:val="28"/>
+          <w:szCs w:val="28"/>
+        </w:rPr>
+        <w:t xml:space="preserve"> </w:t>
+      </w:r>
+      <w:r>
+        <w:rPr>
+          <w:rFonts w:asciiTheme="majorBidi" w:hAnsiTheme="majorBidi" w:cstheme="majorBidi"/>
+          <w:sz w:val="28"/>
+          <w:szCs w:val="28"/>
+        </w:rPr>
+        <w:t>Example</w:t>
+      </w:r>
+      <w:r>
+        <w:rPr>
+          <w:rFonts w:asciiTheme="majorBidi" w:hAnsiTheme="majorBidi" w:cstheme="majorBidi"/>
+          <w:sz w:val="28"/>
+          <w:szCs w:val="28"/>
+        </w:rPr>
+        <w:t>:</w:t>
+      </w:r>
+    </w:p>
+    <w:p>
+      <w:pPr>
+        <w:pStyle w:val="ListParagraph"/>
+        <w:numPr>
+          <w:ilvl w:val="0"/>
+          <w:numId w:val="43"/>
+        </w:numPr>
+        <w:spacing w:after="0"/>
+        <w:ind w:left="1080"/>
+        <w:rPr>
+          <w:rFonts w:asciiTheme="majorBidi" w:hAnsiTheme="majorBidi" w:cstheme="majorBidi"/>
+          <w:b/>
+          <w:bCs/>
+          <w:i/>
+          <w:iCs/>
+          <w:sz w:val="28"/>
+          <w:szCs w:val="28"/>
+        </w:rPr>
+      </w:pPr>
+      <w:r>
+        <w:rPr>
+          <w:rFonts w:asciiTheme="majorBidi" w:hAnsiTheme="majorBidi" w:cstheme="majorBidi"/>
+          <w:sz w:val="28"/>
+          <w:szCs w:val="28"/>
+        </w:rPr>
+        <w:t>for bridge:</w:t>
+      </w:r>
+    </w:p>
+    <w:p>
+      <w:pPr>
+        <w:spacing w:after="60"/>
+        <w:ind w:left="1080"/>
+        <w:rPr>
+          <w:rFonts w:asciiTheme="majorBidi" w:hAnsiTheme="majorBidi" w:cstheme="majorBidi"/>
+          <w:b/>
+          <w:bCs/>
+          <w:i/>
+          <w:iCs/>
+          <w:sz w:val="28"/>
+          <w:szCs w:val="28"/>
+        </w:rPr>
+      </w:pPr>
+      <w:r>
+        <w:rPr>
+          <w:rFonts w:asciiTheme="majorBidi" w:hAnsiTheme="majorBidi" w:cstheme="majorBidi"/>
+          <w:b/>
+          <w:bCs/>
+          <w:i/>
+          <w:iCs/>
+          <w:sz w:val="28"/>
+          <w:szCs w:val="28"/>
+        </w:rPr>
+        <w:t>docker network create --driver bridge --opt com.docker.network.bridge.name=</w:t>
+      </w:r>
+      <w:proofErr w:type="spellStart"/>
+      <w:r>
+        <w:rPr>
+          <w:rFonts w:asciiTheme="majorBidi" w:hAnsiTheme="majorBidi" w:cstheme="majorBidi"/>
+          <w:b/>
+          <w:bCs/>
+          <w:i/>
+          <w:iCs/>
+          <w:sz w:val="28"/>
+          <w:szCs w:val="28"/>
+        </w:rPr>
+        <w:t>br_custom</w:t>
+      </w:r>
+      <w:proofErr w:type="spellEnd"/>
+      <w:r>
+        <w:rPr>
+          <w:rFonts w:asciiTheme="majorBidi" w:hAnsiTheme="majorBidi" w:cstheme="majorBidi"/>
+          <w:b/>
+          <w:bCs/>
+          <w:i/>
+          <w:iCs/>
+          <w:sz w:val="28"/>
+          <w:szCs w:val="28"/>
+        </w:rPr>
+        <w:t xml:space="preserve"> </w:t>
+      </w:r>
+      <w:proofErr w:type="spellStart"/>
+      <w:r>
+        <w:rPr>
+          <w:rFonts w:asciiTheme="majorBidi" w:hAnsiTheme="majorBidi" w:cstheme="majorBidi"/>
+          <w:b/>
+          <w:bCs/>
+          <w:i/>
+          <w:iCs/>
+          <w:sz w:val="28"/>
+          <w:szCs w:val="28"/>
+        </w:rPr>
+        <w:t>mynet</w:t>
+      </w:r>
+      <w:proofErr w:type="spellEnd"/>
+    </w:p>
+    <w:p>
+      <w:pPr>
+        <w:pStyle w:val="ListParagraph"/>
+        <w:numPr>
+          <w:ilvl w:val="0"/>
+          <w:numId w:val="43"/>
+        </w:numPr>
+        <w:spacing w:after="0"/>
+        <w:ind w:left="1080"/>
+        <w:rPr>
+          <w:rFonts w:asciiTheme="majorBidi" w:hAnsiTheme="majorBidi" w:cstheme="majorBidi"/>
+          <w:sz w:val="28"/>
+          <w:szCs w:val="28"/>
+        </w:rPr>
+      </w:pPr>
+      <w:r>
+        <w:rPr>
+          <w:rFonts w:asciiTheme="majorBidi" w:hAnsiTheme="majorBidi" w:cstheme="majorBidi"/>
+          <w:sz w:val="28"/>
+          <w:szCs w:val="28"/>
+        </w:rPr>
+        <w:t xml:space="preserve">For </w:t>
+      </w:r>
+      <w:proofErr w:type="spellStart"/>
+      <w:r>
+        <w:rPr>
+          <w:rFonts w:asciiTheme="majorBidi" w:hAnsiTheme="majorBidi" w:cstheme="majorBidi"/>
+          <w:sz w:val="28"/>
+          <w:szCs w:val="28"/>
+        </w:rPr>
+        <w:t>macvlan</w:t>
+      </w:r>
+      <w:proofErr w:type="spellEnd"/>
+      <w:r>
+        <w:rPr>
+          <w:rFonts w:asciiTheme="majorBidi" w:hAnsiTheme="majorBidi" w:cstheme="majorBidi"/>
+          <w:sz w:val="28"/>
+          <w:szCs w:val="28"/>
+        </w:rPr>
+        <w:t>:</w:t>
+      </w:r>
+    </w:p>
+    <w:p>
+      <w:pPr>
+        <w:spacing w:after="120"/>
+        <w:ind w:left="1080"/>
+        <w:rPr>
+          <w:rFonts w:asciiTheme="majorBidi" w:hAnsiTheme="majorBidi" w:cstheme="majorBidi"/>
+          <w:b/>
+          <w:bCs/>
+          <w:i/>
+          <w:iCs/>
+          <w:sz w:val="28"/>
+          <w:szCs w:val="28"/>
+        </w:rPr>
+      </w:pPr>
+      <w:r>
+        <w:rPr>
+          <w:rFonts w:asciiTheme="majorBidi" w:hAnsiTheme="majorBidi" w:cstheme="majorBidi"/>
+          <w:b/>
+          <w:bCs/>
+          <w:i/>
+          <w:iCs/>
+          <w:sz w:val="28"/>
+          <w:szCs w:val="28"/>
+        </w:rPr>
+        <w:t xml:space="preserve">docker network create -d </w:t>
+      </w:r>
+      <w:proofErr w:type="spellStart"/>
+      <w:r>
+        <w:rPr>
+          <w:rFonts w:asciiTheme="majorBidi" w:hAnsiTheme="majorBidi" w:cstheme="majorBidi"/>
+          <w:b/>
+          <w:bCs/>
+          <w:i/>
+          <w:iCs/>
+          <w:sz w:val="28"/>
+          <w:szCs w:val="28"/>
+        </w:rPr>
+        <w:t>macvlan</w:t>
+      </w:r>
+      <w:proofErr w:type="spellEnd"/>
+      <w:r>
+        <w:rPr>
+          <w:rFonts w:asciiTheme="majorBidi" w:hAnsiTheme="majorBidi" w:cstheme="majorBidi"/>
+          <w:b/>
+          <w:bCs/>
+          <w:i/>
+          <w:iCs/>
+          <w:sz w:val="28"/>
+          <w:szCs w:val="28"/>
+        </w:rPr>
+        <w:t xml:space="preserve"> --subnet=192.168.1.0/24 --gateway=192.168.1.1</w:t>
+      </w:r>
+      <w:r>
+        <w:rPr>
+          <w:rFonts w:asciiTheme="majorBidi" w:hAnsiTheme="majorBidi" w:cstheme="majorBidi"/>
+          <w:b/>
+          <w:bCs/>
+          <w:i/>
+          <w:iCs/>
+          <w:sz w:val="28"/>
+          <w:szCs w:val="28"/>
+        </w:rPr>
+        <w:t xml:space="preserve"> </w:t>
+      </w:r>
+      <w:r>
+        <w:rPr>
+          <w:rFonts w:asciiTheme="majorBidi" w:hAnsiTheme="majorBidi" w:cstheme="majorBidi"/>
+          <w:b/>
+          <w:bCs/>
+          <w:i/>
+          <w:iCs/>
+          <w:sz w:val="28"/>
+          <w:szCs w:val="28"/>
+        </w:rPr>
+        <w:t xml:space="preserve">-o parent=eth0 </w:t>
+      </w:r>
+      <w:proofErr w:type="spellStart"/>
+      <w:r>
+        <w:rPr>
+          <w:rFonts w:asciiTheme="majorBidi" w:hAnsiTheme="majorBidi" w:cstheme="majorBidi"/>
+          <w:b/>
+          <w:bCs/>
+          <w:i/>
+          <w:iCs/>
+          <w:sz w:val="28"/>
+          <w:szCs w:val="28"/>
+        </w:rPr>
+        <w:t>mymacvlan</w:t>
+      </w:r>
+      <w:proofErr w:type="spellEnd"/>
+    </w:p>
+    <w:p>
+      <w:pPr>
+        <w:pStyle w:val="ListParagraph"/>
+        <w:numPr>
+          <w:ilvl w:val="0"/>
+          <w:numId w:val="44"/>
+        </w:numPr>
+        <w:spacing w:after="60"/>
+        <w:ind w:left="360"/>
+        <w:rPr>
+          <w:rFonts w:asciiTheme="majorBidi" w:hAnsiTheme="majorBidi" w:cstheme="majorBidi"/>
+          <w:b/>
+          <w:bCs/>
+          <w:i/>
+          <w:iCs/>
+          <w:sz w:val="32"/>
+          <w:szCs w:val="32"/>
+        </w:rPr>
+      </w:pPr>
+      <w:r>
+        <w:rPr>
+          <w:rFonts w:asciiTheme="majorBidi" w:hAnsiTheme="majorBidi" w:cstheme="majorBidi"/>
+          <w:b/>
+          <w:bCs/>
+          <w:i/>
+          <w:iCs/>
+          <w:sz w:val="32"/>
+          <w:szCs w:val="32"/>
+        </w:rPr>
+        <w:t>docker network ls</w:t>
+      </w:r>
+    </w:p>
+    <w:p>
+      <w:pPr>
+        <w:spacing w:after="120"/>
+        <w:ind w:left="360"/>
+        <w:rPr>
+          <w:rFonts w:asciiTheme="majorBidi" w:hAnsiTheme="majorBidi" w:cstheme="majorBidi"/>
+          <w:sz w:val="28"/>
+          <w:szCs w:val="28"/>
+        </w:rPr>
+      </w:pPr>
+      <w:r>
+        <w:rPr>
+          <w:rFonts w:asciiTheme="majorBidi" w:hAnsiTheme="majorBidi" w:cstheme="majorBidi"/>
+          <w:sz w:val="28"/>
+          <w:szCs w:val="28"/>
+        </w:rPr>
+        <w:t>List networks.</w:t>
+      </w:r>
+    </w:p>
+    <w:p>
+      <w:pPr>
+        <w:pStyle w:val="ListParagraph"/>
+        <w:numPr>
+          <w:ilvl w:val="0"/>
+          <w:numId w:val="44"/>
+        </w:numPr>
+        <w:spacing w:after="60"/>
+        <w:ind w:left="360"/>
+        <w:rPr>
+          <w:rFonts w:asciiTheme="majorBidi" w:hAnsiTheme="majorBidi" w:cstheme="majorBidi"/>
+          <w:b/>
+          <w:bCs/>
+          <w:i/>
+          <w:iCs/>
+          <w:sz w:val="32"/>
+          <w:szCs w:val="32"/>
+        </w:rPr>
+      </w:pPr>
+      <w:r>
+        <w:rPr>
+          <w:rFonts w:asciiTheme="majorBidi" w:hAnsiTheme="majorBidi" w:cstheme="majorBidi"/>
+          <w:b/>
+          <w:bCs/>
+          <w:i/>
+          <w:iCs/>
+          <w:sz w:val="32"/>
+          <w:szCs w:val="32"/>
+        </w:rPr>
+        <w:t>docker network inspect</w:t>
+      </w:r>
+    </w:p>
+    <w:p>
+      <w:pPr>
+        <w:spacing w:after="120"/>
+        <w:ind w:left="360"/>
+        <w:rPr>
+          <w:rFonts w:asciiTheme="majorBidi" w:hAnsiTheme="majorBidi" w:cstheme="majorBidi"/>
+          <w:sz w:val="28"/>
+          <w:szCs w:val="28"/>
+        </w:rPr>
+      </w:pPr>
+      <w:r>
+        <w:rPr>
+          <w:rFonts w:asciiTheme="majorBidi" w:hAnsiTheme="majorBidi" w:cstheme="majorBidi"/>
+          <w:sz w:val="28"/>
+          <w:szCs w:val="28"/>
+        </w:rPr>
+        <w:t>Detailed information.</w:t>
+      </w:r>
+    </w:p>
+    <w:p>
+      <w:pPr>
+        <w:pStyle w:val="ListParagraph"/>
+        <w:numPr>
+          <w:ilvl w:val="0"/>
+          <w:numId w:val="44"/>
+        </w:numPr>
+        <w:spacing w:after="60"/>
+        <w:ind w:left="360"/>
+        <w:rPr>
+          <w:rFonts w:asciiTheme="majorBidi" w:hAnsiTheme="majorBidi" w:cstheme="majorBidi"/>
+          <w:b/>
+          <w:bCs/>
+          <w:i/>
+          <w:iCs/>
+          <w:sz w:val="32"/>
+          <w:szCs w:val="32"/>
+        </w:rPr>
+      </w:pPr>
+      <w:r>
+        <w:rPr>
+          <w:rFonts w:asciiTheme="majorBidi" w:hAnsiTheme="majorBidi" w:cstheme="majorBidi"/>
+          <w:b/>
+          <w:bCs/>
+          <w:i/>
+          <w:iCs/>
+          <w:sz w:val="32"/>
+          <w:szCs w:val="32"/>
+        </w:rPr>
+        <w:t>docker network rm</w:t>
+      </w:r>
+    </w:p>
+    <w:p>
+      <w:pPr>
+        <w:spacing w:after="120"/>
+        <w:ind w:left="360"/>
+        <w:rPr>
+          <w:rFonts w:asciiTheme="majorBidi" w:hAnsiTheme="majorBidi" w:cstheme="majorBidi"/>
+          <w:sz w:val="28"/>
+          <w:szCs w:val="28"/>
+        </w:rPr>
+      </w:pPr>
+      <w:r>
+        <w:rPr>
+          <w:rFonts w:asciiTheme="majorBidi" w:hAnsiTheme="majorBidi" w:cstheme="majorBidi"/>
+          <w:sz w:val="28"/>
+          <w:szCs w:val="28"/>
+        </w:rPr>
+        <w:t>Remove a network.</w:t>
+      </w:r>
+      <w:r>
+        <w:rPr>
+          <w:rFonts w:asciiTheme="majorBidi" w:hAnsiTheme="majorBidi" w:cstheme="majorBidi"/>
+          <w:sz w:val="28"/>
+          <w:szCs w:val="28"/>
+        </w:rPr>
+        <w:t xml:space="preserve"> </w:t>
+      </w:r>
+      <w:r>
+        <w:rPr>
+          <w:rFonts w:asciiTheme="majorBidi" w:hAnsiTheme="majorBidi" w:cstheme="majorBidi"/>
+          <w:sz w:val="28"/>
+          <w:szCs w:val="28"/>
+        </w:rPr>
+        <w:t>Fails if containers are still attached.</w:t>
+      </w:r>
+    </w:p>
+    <w:p>
+      <w:pPr>
+        <w:pStyle w:val="ListParagraph"/>
+        <w:numPr>
+          <w:ilvl w:val="0"/>
+          <w:numId w:val="44"/>
+        </w:numPr>
+        <w:spacing w:after="60"/>
+        <w:ind w:left="360"/>
+        <w:rPr>
+          <w:rFonts w:asciiTheme="majorBidi" w:hAnsiTheme="majorBidi" w:cstheme="majorBidi"/>
+          <w:b/>
+          <w:bCs/>
+          <w:i/>
+          <w:iCs/>
+          <w:sz w:val="32"/>
+          <w:szCs w:val="32"/>
+        </w:rPr>
+      </w:pPr>
+      <w:r>
+        <w:rPr>
+          <w:rFonts w:asciiTheme="majorBidi" w:hAnsiTheme="majorBidi" w:cstheme="majorBidi"/>
+          <w:b/>
+          <w:bCs/>
+          <w:i/>
+          <w:iCs/>
+          <w:sz w:val="32"/>
+          <w:szCs w:val="32"/>
+        </w:rPr>
+        <w:t>docker network prune</w:t>
+      </w:r>
+    </w:p>
+    <w:p>
+      <w:pPr>
+        <w:spacing w:after="120"/>
+        <w:ind w:left="360"/>
+        <w:rPr>
+          <w:rFonts w:asciiTheme="majorBidi" w:hAnsiTheme="majorBidi" w:cstheme="majorBidi"/>
+          <w:sz w:val="28"/>
+          <w:szCs w:val="28"/>
+        </w:rPr>
+      </w:pPr>
+      <w:r>
+        <w:rPr>
+          <w:rFonts w:asciiTheme="majorBidi" w:hAnsiTheme="majorBidi" w:cstheme="majorBidi"/>
+          <w:sz w:val="28"/>
+          <w:szCs w:val="28"/>
+        </w:rPr>
+        <w:t>Removes unused networks. It removes everything not connected.</w:t>
+      </w:r>
+    </w:p>
+    <w:p>
+      <w:pPr>
+        <w:pStyle w:val="ListParagraph"/>
+        <w:numPr>
+          <w:ilvl w:val="0"/>
+          <w:numId w:val="44"/>
+        </w:numPr>
+        <w:ind w:left="360"/>
+        <w:rPr>
+          <w:rFonts w:asciiTheme="majorBidi" w:hAnsiTheme="majorBidi" w:cstheme="majorBidi"/>
+          <w:b/>
+          <w:bCs/>
+          <w:i/>
+          <w:iCs/>
+          <w:sz w:val="32"/>
+          <w:szCs w:val="32"/>
+        </w:rPr>
+      </w:pPr>
+      <w:r>
+        <w:rPr>
+          <w:rFonts w:asciiTheme="majorBidi" w:hAnsiTheme="majorBidi" w:cstheme="majorBidi"/>
+          <w:b/>
+          <w:bCs/>
+          <w:sz w:val="32"/>
+          <w:szCs w:val="32"/>
+        </w:rPr>
+        <w:t>Container–Network Interaction</w:t>
+      </w:r>
+      <w:r>
+        <w:rPr>
+          <w:rFonts w:asciiTheme="majorBidi" w:hAnsiTheme="majorBidi" w:cstheme="majorBidi"/>
+          <w:b/>
+          <w:bCs/>
+          <w:sz w:val="32"/>
+          <w:szCs w:val="32"/>
+        </w:rPr>
+        <w:t xml:space="preserve"> with</w:t>
+      </w:r>
+      <w:r>
+        <w:rPr>
+          <w:rFonts w:asciiTheme="majorBidi" w:hAnsiTheme="majorBidi" w:cstheme="majorBidi"/>
+          <w:b/>
+          <w:bCs/>
+          <w:i/>
+          <w:iCs/>
+          <w:sz w:val="32"/>
+          <w:szCs w:val="32"/>
+        </w:rPr>
+        <w:t xml:space="preserve"> </w:t>
+      </w:r>
+      <w:r>
+        <w:rPr>
+          <w:rFonts w:asciiTheme="majorBidi" w:hAnsiTheme="majorBidi" w:cstheme="majorBidi"/>
+          <w:b/>
+          <w:bCs/>
+          <w:i/>
+          <w:iCs/>
+          <w:sz w:val="32"/>
+          <w:szCs w:val="32"/>
+        </w:rPr>
+        <w:t>docker run</w:t>
+      </w:r>
+    </w:p>
+    <w:p>
+      <w:pPr>
+        <w:pStyle w:val="ListParagraph"/>
+        <w:numPr>
+          <w:ilvl w:val="0"/>
+          <w:numId w:val="45"/>
+        </w:numPr>
+        <w:spacing w:after="0"/>
+        <w:rPr>
+          <w:rFonts w:asciiTheme="majorBidi" w:hAnsiTheme="majorBidi" w:cstheme="majorBidi"/>
+          <w:b/>
+          <w:bCs/>
+          <w:i/>
+          <w:iCs/>
+          <w:sz w:val="28"/>
+          <w:szCs w:val="28"/>
+        </w:rPr>
+      </w:pPr>
+      <w:r>
+        <w:rPr>
+          <w:rFonts w:asciiTheme="majorBidi" w:hAnsiTheme="majorBidi" w:cstheme="majorBidi"/>
+          <w:b/>
+          <w:bCs/>
+          <w:i/>
+          <w:iCs/>
+          <w:sz w:val="28"/>
+          <w:szCs w:val="28"/>
+        </w:rPr>
+        <w:t>--network</w:t>
+      </w:r>
+      <w:r>
+        <w:rPr>
+          <w:rFonts w:asciiTheme="majorBidi" w:hAnsiTheme="majorBidi" w:cstheme="majorBidi"/>
+          <w:b/>
+          <w:bCs/>
+          <w:i/>
+          <w:iCs/>
+          <w:sz w:val="28"/>
+          <w:szCs w:val="28"/>
+        </w:rPr>
+        <w:t xml:space="preserve"> </w:t>
+      </w:r>
+      <w:r>
+        <w:rPr>
+          <w:rFonts w:asciiTheme="majorBidi" w:hAnsiTheme="majorBidi" w:cstheme="majorBidi"/>
+          <w:sz w:val="28"/>
+          <w:szCs w:val="28"/>
+        </w:rPr>
+        <w:t>→ Attach container at startup.</w:t>
+      </w:r>
+      <w:r>
+        <w:rPr>
+          <w:rFonts w:asciiTheme="majorBidi" w:hAnsiTheme="majorBidi" w:cstheme="majorBidi"/>
+          <w:sz w:val="28"/>
+          <w:szCs w:val="28"/>
+        </w:rPr>
+        <w:t xml:space="preserve"> Example:</w:t>
+      </w:r>
+    </w:p>
+    <w:p>
+      <w:pPr>
+        <w:spacing w:after="60"/>
+        <w:ind w:left="720"/>
+        <w:rPr>
+          <w:rFonts w:asciiTheme="majorBidi" w:hAnsiTheme="majorBidi" w:cstheme="majorBidi"/>
+          <w:b/>
+          <w:bCs/>
+          <w:i/>
+          <w:iCs/>
+          <w:sz w:val="28"/>
+          <w:szCs w:val="28"/>
+        </w:rPr>
+      </w:pPr>
+      <w:r>
+        <w:rPr>
+          <w:rFonts w:asciiTheme="majorBidi" w:hAnsiTheme="majorBidi" w:cstheme="majorBidi"/>
+          <w:b/>
+          <w:bCs/>
+          <w:i/>
+          <w:iCs/>
+          <w:sz w:val="28"/>
+          <w:szCs w:val="28"/>
+        </w:rPr>
+        <w:t xml:space="preserve">docker run --network </w:t>
+      </w:r>
+      <w:proofErr w:type="spellStart"/>
+      <w:r>
+        <w:rPr>
+          <w:rFonts w:asciiTheme="majorBidi" w:hAnsiTheme="majorBidi" w:cstheme="majorBidi"/>
+          <w:b/>
+          <w:bCs/>
+          <w:i/>
+          <w:iCs/>
+          <w:sz w:val="28"/>
+          <w:szCs w:val="28"/>
+        </w:rPr>
+        <w:t>mynet</w:t>
+      </w:r>
+      <w:proofErr w:type="spellEnd"/>
+      <w:r>
+        <w:rPr>
+          <w:rFonts w:asciiTheme="majorBidi" w:hAnsiTheme="majorBidi" w:cstheme="majorBidi"/>
+          <w:b/>
+          <w:bCs/>
+          <w:i/>
+          <w:iCs/>
+          <w:sz w:val="28"/>
+          <w:szCs w:val="28"/>
+        </w:rPr>
+        <w:t xml:space="preserve"> nginx</w:t>
+      </w:r>
+    </w:p>
+    <w:p>
+      <w:pPr>
+        <w:pStyle w:val="ListParagraph"/>
+        <w:numPr>
+          <w:ilvl w:val="0"/>
+          <w:numId w:val="45"/>
+        </w:numPr>
+        <w:spacing w:after="0"/>
+        <w:rPr>
+          <w:rFonts w:asciiTheme="majorBidi" w:hAnsiTheme="majorBidi" w:cstheme="majorBidi"/>
+          <w:sz w:val="28"/>
+          <w:szCs w:val="28"/>
+        </w:rPr>
+      </w:pPr>
+      <w:r>
+        <w:rPr>
+          <w:rFonts w:asciiTheme="majorBidi" w:hAnsiTheme="majorBidi" w:cstheme="majorBidi"/>
+          <w:b/>
+          <w:bCs/>
+          <w:i/>
+          <w:iCs/>
+          <w:sz w:val="28"/>
+          <w:szCs w:val="28"/>
+        </w:rPr>
+        <w:t>--</w:t>
+      </w:r>
+      <w:proofErr w:type="spellStart"/>
+      <w:r>
+        <w:rPr>
+          <w:rFonts w:asciiTheme="majorBidi" w:hAnsiTheme="majorBidi" w:cstheme="majorBidi"/>
+          <w:b/>
+          <w:bCs/>
+          <w:i/>
+          <w:iCs/>
+          <w:sz w:val="28"/>
+          <w:szCs w:val="28"/>
+        </w:rPr>
+        <w:t>ip</w:t>
+      </w:r>
+      <w:proofErr w:type="spellEnd"/>
+      <w:r>
+        <w:rPr>
+          <w:rFonts w:asciiTheme="majorBidi" w:hAnsiTheme="majorBidi" w:cstheme="majorBidi"/>
+          <w:sz w:val="28"/>
+          <w:szCs w:val="28"/>
+        </w:rPr>
+        <w:t xml:space="preserve"> </w:t>
+      </w:r>
+      <w:r>
+        <w:rPr>
+          <w:rFonts w:asciiTheme="majorBidi" w:hAnsiTheme="majorBidi" w:cstheme="majorBidi"/>
+          <w:sz w:val="28"/>
+          <w:szCs w:val="28"/>
+        </w:rPr>
+        <w:t>→ Assign static IP (only works on user-defined networks).</w:t>
+      </w:r>
+    </w:p>
+    <w:p>
+      <w:pPr>
+        <w:spacing w:after="60"/>
+        <w:ind w:left="720"/>
+        <w:rPr>
+          <w:rFonts w:asciiTheme="majorBidi" w:hAnsiTheme="majorBidi" w:cstheme="majorBidi"/>
+          <w:sz w:val="28"/>
+          <w:szCs w:val="28"/>
+        </w:rPr>
+      </w:pPr>
+      <w:r>
+        <w:rPr>
+          <w:rFonts w:asciiTheme="majorBidi" w:hAnsiTheme="majorBidi" w:cstheme="majorBidi"/>
+          <w:sz w:val="28"/>
+          <w:szCs w:val="28"/>
+        </w:rPr>
+        <w:t xml:space="preserve">docker run --network </w:t>
+      </w:r>
+      <w:proofErr w:type="spellStart"/>
+      <w:r>
+        <w:rPr>
+          <w:rFonts w:asciiTheme="majorBidi" w:hAnsiTheme="majorBidi" w:cstheme="majorBidi"/>
+          <w:sz w:val="28"/>
+          <w:szCs w:val="28"/>
+        </w:rPr>
+        <w:t>mynet</w:t>
+      </w:r>
+      <w:proofErr w:type="spellEnd"/>
+      <w:r>
+        <w:rPr>
+          <w:rFonts w:asciiTheme="majorBidi" w:hAnsiTheme="majorBidi" w:cstheme="majorBidi"/>
+          <w:sz w:val="28"/>
+          <w:szCs w:val="28"/>
+        </w:rPr>
+        <w:t xml:space="preserve"> --</w:t>
+      </w:r>
+      <w:proofErr w:type="spellStart"/>
+      <w:r>
+        <w:rPr>
+          <w:rFonts w:asciiTheme="majorBidi" w:hAnsiTheme="majorBidi" w:cstheme="majorBidi"/>
+          <w:sz w:val="28"/>
+          <w:szCs w:val="28"/>
+        </w:rPr>
+        <w:t>ip</w:t>
+      </w:r>
+      <w:proofErr w:type="spellEnd"/>
+      <w:r>
+        <w:rPr>
+          <w:rFonts w:asciiTheme="majorBidi" w:hAnsiTheme="majorBidi" w:cstheme="majorBidi"/>
+          <w:sz w:val="28"/>
+          <w:szCs w:val="28"/>
+        </w:rPr>
+        <w:t xml:space="preserve"> 10.10.0.5 nginx</w:t>
+      </w:r>
+    </w:p>
+    <w:p>
+      <w:pPr>
+        <w:pStyle w:val="ListParagraph"/>
+        <w:numPr>
+          <w:ilvl w:val="0"/>
+          <w:numId w:val="45"/>
+        </w:numPr>
+        <w:spacing w:after="0"/>
+        <w:rPr>
+          <w:rFonts w:asciiTheme="majorBidi" w:hAnsiTheme="majorBidi" w:cstheme="majorBidi"/>
+          <w:b/>
+          <w:bCs/>
+          <w:i/>
+          <w:iCs/>
+          <w:sz w:val="28"/>
+          <w:szCs w:val="28"/>
+        </w:rPr>
+      </w:pPr>
+      <w:r>
+        <w:rPr>
+          <w:rFonts w:asciiTheme="majorBidi" w:hAnsiTheme="majorBidi" w:cstheme="majorBidi"/>
+          <w:b/>
+          <w:bCs/>
+          <w:i/>
+          <w:iCs/>
+          <w:sz w:val="28"/>
+          <w:szCs w:val="28"/>
+        </w:rPr>
+        <w:lastRenderedPageBreak/>
+        <w:t>--network-alias</w:t>
+      </w:r>
+      <w:r>
+        <w:rPr>
+          <w:rFonts w:asciiTheme="majorBidi" w:hAnsiTheme="majorBidi" w:cstheme="majorBidi"/>
+          <w:b/>
+          <w:bCs/>
+          <w:i/>
+          <w:iCs/>
+          <w:sz w:val="28"/>
+          <w:szCs w:val="28"/>
+        </w:rPr>
+        <w:t xml:space="preserve"> </w:t>
+      </w:r>
+      <w:r>
+        <w:rPr>
+          <w:rFonts w:asciiTheme="majorBidi" w:hAnsiTheme="majorBidi" w:cstheme="majorBidi"/>
+          <w:sz w:val="28"/>
+          <w:szCs w:val="28"/>
+        </w:rPr>
+        <w:t>→ Adds DNS alias inside that network.</w:t>
+      </w:r>
+      <w:r>
+        <w:rPr>
+          <w:rFonts w:asciiTheme="majorBidi" w:hAnsiTheme="majorBidi" w:cstheme="majorBidi"/>
+          <w:sz w:val="28"/>
+          <w:szCs w:val="28"/>
+        </w:rPr>
+        <w:t xml:space="preserve"> Example:</w:t>
+      </w:r>
+    </w:p>
+    <w:p>
+      <w:pPr>
+        <w:spacing w:after="120"/>
+        <w:ind w:left="720"/>
+        <w:rPr>
+          <w:rFonts w:asciiTheme="majorBidi" w:hAnsiTheme="majorBidi" w:cstheme="majorBidi"/>
+          <w:b/>
+          <w:bCs/>
+          <w:i/>
+          <w:iCs/>
+          <w:sz w:val="28"/>
+          <w:szCs w:val="28"/>
+        </w:rPr>
+      </w:pPr>
+      <w:r>
+        <w:rPr>
+          <w:rFonts w:asciiTheme="majorBidi" w:hAnsiTheme="majorBidi" w:cstheme="majorBidi"/>
+          <w:b/>
+          <w:bCs/>
+          <w:i/>
+          <w:iCs/>
+          <w:sz w:val="28"/>
+          <w:szCs w:val="28"/>
+        </w:rPr>
+        <w:t xml:space="preserve">docker run --network </w:t>
+      </w:r>
+      <w:proofErr w:type="spellStart"/>
+      <w:r>
+        <w:rPr>
+          <w:rFonts w:asciiTheme="majorBidi" w:hAnsiTheme="majorBidi" w:cstheme="majorBidi"/>
+          <w:b/>
+          <w:bCs/>
+          <w:i/>
+          <w:iCs/>
+          <w:sz w:val="28"/>
+          <w:szCs w:val="28"/>
+        </w:rPr>
+        <w:t>mynet</w:t>
+      </w:r>
+      <w:proofErr w:type="spellEnd"/>
+      <w:r>
+        <w:rPr>
+          <w:rFonts w:asciiTheme="majorBidi" w:hAnsiTheme="majorBidi" w:cstheme="majorBidi"/>
+          <w:b/>
+          <w:bCs/>
+          <w:i/>
+          <w:iCs/>
+          <w:sz w:val="28"/>
+          <w:szCs w:val="28"/>
+        </w:rPr>
+        <w:t xml:space="preserve"> --network-alias web nginx</w:t>
+      </w:r>
+    </w:p>
+    <w:p>
+      <w:pPr>
+        <w:pStyle w:val="ListParagraph"/>
+        <w:numPr>
+          <w:ilvl w:val="0"/>
+          <w:numId w:val="46"/>
+        </w:numPr>
+        <w:spacing w:after="60"/>
+        <w:ind w:left="360"/>
+        <w:rPr>
+          <w:rFonts w:asciiTheme="majorBidi" w:hAnsiTheme="majorBidi" w:cstheme="majorBidi"/>
+          <w:b/>
+          <w:bCs/>
+          <w:i/>
+          <w:iCs/>
+          <w:sz w:val="32"/>
+          <w:szCs w:val="32"/>
+        </w:rPr>
+      </w:pPr>
+      <w:r>
+        <w:rPr>
+          <w:rFonts w:asciiTheme="majorBidi" w:hAnsiTheme="majorBidi" w:cstheme="majorBidi"/>
+          <w:b/>
+          <w:bCs/>
+          <w:i/>
+          <w:iCs/>
+          <w:sz w:val="32"/>
+          <w:szCs w:val="32"/>
+        </w:rPr>
+        <w:t>docker network connect</w:t>
+      </w:r>
+    </w:p>
+    <w:p>
+      <w:pPr>
+        <w:spacing w:after="0"/>
+        <w:ind w:left="360"/>
+        <w:rPr>
+          <w:rFonts w:asciiTheme="majorBidi" w:hAnsiTheme="majorBidi" w:cstheme="majorBidi"/>
+          <w:sz w:val="28"/>
+          <w:szCs w:val="28"/>
+        </w:rPr>
+      </w:pPr>
+      <w:r>
+        <w:rPr>
+          <w:rFonts w:asciiTheme="majorBidi" w:hAnsiTheme="majorBidi" w:cstheme="majorBidi"/>
+          <w:sz w:val="28"/>
+          <w:szCs w:val="28"/>
+        </w:rPr>
+        <w:t>Attach running container to another network.</w:t>
+      </w:r>
+      <w:r>
+        <w:rPr>
+          <w:rFonts w:asciiTheme="majorBidi" w:hAnsiTheme="majorBidi" w:cstheme="majorBidi"/>
+          <w:sz w:val="28"/>
+          <w:szCs w:val="28"/>
+        </w:rPr>
+        <w:t xml:space="preserve"> Example:</w:t>
+      </w:r>
+    </w:p>
+    <w:p>
+      <w:pPr>
+        <w:spacing w:after="0"/>
+        <w:ind w:left="360"/>
+        <w:rPr>
+          <w:rFonts w:asciiTheme="majorBidi" w:hAnsiTheme="majorBidi" w:cstheme="majorBidi"/>
+          <w:b/>
+          <w:bCs/>
+          <w:i/>
+          <w:iCs/>
+          <w:sz w:val="28"/>
+          <w:szCs w:val="28"/>
+        </w:rPr>
+      </w:pPr>
+      <w:r>
+        <w:rPr>
+          <w:rFonts w:asciiTheme="majorBidi" w:hAnsiTheme="majorBidi" w:cstheme="majorBidi"/>
+          <w:b/>
+          <w:bCs/>
+          <w:i/>
+          <w:iCs/>
+          <w:sz w:val="28"/>
+          <w:szCs w:val="28"/>
+        </w:rPr>
+        <w:t xml:space="preserve">docker network connect </w:t>
+      </w:r>
+      <w:proofErr w:type="spellStart"/>
+      <w:r>
+        <w:rPr>
+          <w:rFonts w:asciiTheme="majorBidi" w:hAnsiTheme="majorBidi" w:cstheme="majorBidi"/>
+          <w:b/>
+          <w:bCs/>
+          <w:i/>
+          <w:iCs/>
+          <w:sz w:val="28"/>
+          <w:szCs w:val="28"/>
+        </w:rPr>
+        <w:t>mynet</w:t>
+      </w:r>
+      <w:proofErr w:type="spellEnd"/>
+      <w:r>
+        <w:rPr>
+          <w:rFonts w:asciiTheme="majorBidi" w:hAnsiTheme="majorBidi" w:cstheme="majorBidi"/>
+          <w:b/>
+          <w:bCs/>
+          <w:i/>
+          <w:iCs/>
+          <w:sz w:val="28"/>
+          <w:szCs w:val="28"/>
+        </w:rPr>
+        <w:t xml:space="preserve"> container1</w:t>
+      </w:r>
+    </w:p>
+    <w:p>
+      <w:pPr>
+        <w:spacing w:after="0"/>
+        <w:ind w:left="360"/>
+        <w:rPr>
+          <w:rFonts w:asciiTheme="majorBidi" w:hAnsiTheme="majorBidi" w:cstheme="majorBidi"/>
+          <w:sz w:val="28"/>
+          <w:szCs w:val="28"/>
+        </w:rPr>
+      </w:pPr>
+      <w:r>
+        <w:rPr>
+          <w:rFonts w:asciiTheme="majorBidi" w:hAnsiTheme="majorBidi" w:cstheme="majorBidi"/>
+          <w:sz w:val="28"/>
+          <w:szCs w:val="28"/>
+        </w:rPr>
+        <w:t>Important options:</w:t>
+      </w:r>
+    </w:p>
+    <w:p>
+      <w:pPr>
+        <w:pStyle w:val="ListParagraph"/>
+        <w:numPr>
+          <w:ilvl w:val="1"/>
+          <w:numId w:val="46"/>
+        </w:numPr>
+        <w:ind w:left="720"/>
+        <w:rPr>
+          <w:rFonts w:asciiTheme="majorBidi" w:hAnsiTheme="majorBidi" w:cstheme="majorBidi"/>
+          <w:sz w:val="28"/>
+          <w:szCs w:val="28"/>
+        </w:rPr>
+      </w:pPr>
+      <w:r>
+        <w:rPr>
+          <w:rFonts w:asciiTheme="majorBidi" w:hAnsiTheme="majorBidi" w:cstheme="majorBidi"/>
+          <w:b/>
+          <w:bCs/>
+          <w:i/>
+          <w:iCs/>
+          <w:sz w:val="28"/>
+          <w:szCs w:val="28"/>
+        </w:rPr>
+        <w:t>--</w:t>
+      </w:r>
+      <w:proofErr w:type="spellStart"/>
+      <w:r>
+        <w:rPr>
+          <w:rFonts w:asciiTheme="majorBidi" w:hAnsiTheme="majorBidi" w:cstheme="majorBidi"/>
+          <w:b/>
+          <w:bCs/>
+          <w:i/>
+          <w:iCs/>
+          <w:sz w:val="28"/>
+          <w:szCs w:val="28"/>
+        </w:rPr>
+        <w:t>ip</w:t>
+      </w:r>
+      <w:proofErr w:type="spellEnd"/>
+      <w:r>
+        <w:rPr>
+          <w:rFonts w:asciiTheme="majorBidi" w:hAnsiTheme="majorBidi" w:cstheme="majorBidi"/>
+          <w:sz w:val="28"/>
+          <w:szCs w:val="28"/>
+        </w:rPr>
+        <w:t xml:space="preserve"> </w:t>
+      </w:r>
+      <w:r>
+        <w:rPr>
+          <w:rFonts w:asciiTheme="majorBidi" w:hAnsiTheme="majorBidi" w:cstheme="majorBidi"/>
+          <w:sz w:val="28"/>
+          <w:szCs w:val="28"/>
+        </w:rPr>
+        <w:t xml:space="preserve">→ </w:t>
+      </w:r>
+      <w:r>
+        <w:rPr>
+          <w:rFonts w:asciiTheme="majorBidi" w:hAnsiTheme="majorBidi" w:cstheme="majorBidi"/>
+          <w:sz w:val="28"/>
+          <w:szCs w:val="28"/>
+        </w:rPr>
+        <w:t>Assign static IP on that network.</w:t>
+      </w:r>
+    </w:p>
+    <w:p>
+      <w:pPr>
+        <w:pStyle w:val="ListParagraph"/>
+        <w:rPr>
+          <w:rFonts w:asciiTheme="majorBidi" w:hAnsiTheme="majorBidi" w:cstheme="majorBidi"/>
+          <w:sz w:val="8"/>
+          <w:szCs w:val="8"/>
+        </w:rPr>
+      </w:pPr>
+    </w:p>
+    <w:p>
+      <w:pPr>
+        <w:pStyle w:val="ListParagraph"/>
+        <w:numPr>
+          <w:ilvl w:val="0"/>
+          <w:numId w:val="46"/>
+        </w:numPr>
+        <w:spacing w:after="60"/>
+        <w:ind w:left="360"/>
+        <w:rPr>
+          <w:rFonts w:asciiTheme="majorBidi" w:hAnsiTheme="majorBidi" w:cstheme="majorBidi"/>
+          <w:b/>
+          <w:bCs/>
+          <w:sz w:val="32"/>
+          <w:szCs w:val="32"/>
+        </w:rPr>
+      </w:pPr>
+      <w:r>
+        <w:rPr>
+          <w:rFonts w:asciiTheme="majorBidi" w:hAnsiTheme="majorBidi" w:cstheme="majorBidi"/>
+          <w:b/>
+          <w:bCs/>
+          <w:sz w:val="32"/>
+          <w:szCs w:val="32"/>
+        </w:rPr>
+        <w:t>docker network disconnect</w:t>
+      </w:r>
+    </w:p>
+    <w:p>
+      <w:pPr>
+        <w:spacing w:after="0"/>
+        <w:ind w:left="360"/>
+        <w:rPr>
+          <w:rFonts w:asciiTheme="majorBidi" w:hAnsiTheme="majorBidi" w:cstheme="majorBidi"/>
+          <w:sz w:val="28"/>
+          <w:szCs w:val="28"/>
+        </w:rPr>
+      </w:pPr>
+      <w:r>
+        <w:rPr>
+          <w:rFonts w:asciiTheme="majorBidi" w:hAnsiTheme="majorBidi" w:cstheme="majorBidi"/>
+          <w:sz w:val="28"/>
+          <w:szCs w:val="28"/>
+        </w:rPr>
+        <w:t>Detach container.</w:t>
+      </w:r>
+      <w:r>
+        <w:rPr>
+          <w:rFonts w:asciiTheme="majorBidi" w:hAnsiTheme="majorBidi" w:cstheme="majorBidi"/>
+          <w:sz w:val="28"/>
+          <w:szCs w:val="28"/>
+        </w:rPr>
+        <w:t xml:space="preserve"> Example:</w:t>
+      </w:r>
+    </w:p>
+    <w:p>
+      <w:pPr>
+        <w:ind w:left="360"/>
+        <w:rPr>
+          <w:rFonts w:asciiTheme="majorBidi" w:hAnsiTheme="majorBidi" w:cstheme="majorBidi"/>
+          <w:b/>
+          <w:bCs/>
+          <w:i/>
+          <w:iCs/>
+          <w:sz w:val="28"/>
+          <w:szCs w:val="28"/>
+        </w:rPr>
+      </w:pPr>
+      <w:r>
+        <w:rPr>
+          <w:rFonts w:asciiTheme="majorBidi" w:hAnsiTheme="majorBidi" w:cstheme="majorBidi"/>
+          <w:b/>
+          <w:bCs/>
+          <w:i/>
+          <w:iCs/>
+          <w:sz w:val="28"/>
+          <w:szCs w:val="28"/>
+        </w:rPr>
+        <w:t xml:space="preserve">docker network disconnect </w:t>
+      </w:r>
+      <w:proofErr w:type="spellStart"/>
+      <w:r>
+        <w:rPr>
+          <w:rFonts w:asciiTheme="majorBidi" w:hAnsiTheme="majorBidi" w:cstheme="majorBidi"/>
+          <w:b/>
+          <w:bCs/>
+          <w:i/>
+          <w:iCs/>
+          <w:sz w:val="28"/>
+          <w:szCs w:val="28"/>
+        </w:rPr>
+        <w:t>mynet</w:t>
+      </w:r>
+      <w:proofErr w:type="spellEnd"/>
+      <w:r>
+        <w:rPr>
+          <w:rFonts w:asciiTheme="majorBidi" w:hAnsiTheme="majorBidi" w:cstheme="majorBidi"/>
+          <w:b/>
+          <w:bCs/>
+          <w:i/>
+          <w:iCs/>
+          <w:sz w:val="28"/>
+          <w:szCs w:val="28"/>
+        </w:rPr>
+        <w:t xml:space="preserve"> container1</w:t>
       </w:r>
     </w:p>
     <w:sectPr>
@@ -10317,9 +13409,122 @@
     </w:lvl>
   </w:abstractNum>
   <w:abstractNum w:abstractNumId="15" w15:restartNumberingAfterBreak="0">
+    <w:nsid w:val="30F73160"/>
+    <w:multiLevelType w:val="hybridMultilevel"/>
+    <w:tmpl w:val="A34290C8"/>
+    <w:lvl w:ilvl="0" w:tplc="04090001">
+      <w:start w:val="1"/>
+      <w:numFmt w:val="bullet"/>
+      <w:lvlText w:val=""/>
+      <w:lvlJc w:val="left"/>
+      <w:pPr>
+        <w:ind w:left="720" w:hanging="360"/>
+      </w:pPr>
+      <w:rPr>
+        <w:rFonts w:ascii="Symbol" w:hAnsi="Symbol" w:hint="default"/>
+      </w:rPr>
+    </w:lvl>
+    <w:lvl w:ilvl="1" w:tplc="04090003" w:tentative="1">
+      <w:start w:val="1"/>
+      <w:numFmt w:val="bullet"/>
+      <w:lvlText w:val="o"/>
+      <w:lvlJc w:val="left"/>
+      <w:pPr>
+        <w:ind w:left="1440" w:hanging="360"/>
+      </w:pPr>
+      <w:rPr>
+        <w:rFonts w:ascii="Courier New" w:hAnsi="Courier New" w:cs="Courier New" w:hint="default"/>
+      </w:rPr>
+    </w:lvl>
+    <w:lvl w:ilvl="2" w:tplc="04090005" w:tentative="1">
+      <w:start w:val="1"/>
+      <w:numFmt w:val="bullet"/>
+      <w:lvlText w:val=""/>
+      <w:lvlJc w:val="left"/>
+      <w:pPr>
+        <w:ind w:left="2160" w:hanging="360"/>
+      </w:pPr>
+      <w:rPr>
+        <w:rFonts w:ascii="Wingdings" w:hAnsi="Wingdings" w:hint="default"/>
+      </w:rPr>
+    </w:lvl>
+    <w:lvl w:ilvl="3" w:tplc="04090001" w:tentative="1">
+      <w:start w:val="1"/>
+      <w:numFmt w:val="bullet"/>
+      <w:lvlText w:val=""/>
+      <w:lvlJc w:val="left"/>
+      <w:pPr>
+        <w:ind w:left="2880" w:hanging="360"/>
+      </w:pPr>
+      <w:rPr>
+        <w:rFonts w:ascii="Symbol" w:hAnsi="Symbol" w:hint="default"/>
+      </w:rPr>
+    </w:lvl>
+    <w:lvl w:ilvl="4" w:tplc="04090003" w:tentative="1">
+      <w:start w:val="1"/>
+      <w:numFmt w:val="bullet"/>
+      <w:lvlText w:val="o"/>
+      <w:lvlJc w:val="left"/>
+      <w:pPr>
+        <w:ind w:left="3600" w:hanging="360"/>
+      </w:pPr>
+      <w:rPr>
+        <w:rFonts w:ascii="Courier New" w:hAnsi="Courier New" w:cs="Courier New" w:hint="default"/>
+      </w:rPr>
+    </w:lvl>
+    <w:lvl w:ilvl="5" w:tplc="04090005" w:tentative="1">
+      <w:start w:val="1"/>
+      <w:numFmt w:val="bullet"/>
+      <w:lvlText w:val=""/>
+      <w:lvlJc w:val="left"/>
+      <w:pPr>
+        <w:ind w:left="4320" w:hanging="360"/>
+      </w:pPr>
+      <w:rPr>
+        <w:rFonts w:ascii="Wingdings" w:hAnsi="Wingdings" w:hint="default"/>
+      </w:rPr>
+    </w:lvl>
+    <w:lvl w:ilvl="6" w:tplc="04090001" w:tentative="1">
+      <w:start w:val="1"/>
+      <w:numFmt w:val="bullet"/>
+      <w:lvlText w:val=""/>
+      <w:lvlJc w:val="left"/>
+      <w:pPr>
+        <w:ind w:left="5040" w:hanging="360"/>
+      </w:pPr>
+      <w:rPr>
+        <w:rFonts w:ascii="Symbol" w:hAnsi="Symbol" w:hint="default"/>
+      </w:rPr>
+    </w:lvl>
+    <w:lvl w:ilvl="7" w:tplc="04090003" w:tentative="1">
+      <w:start w:val="1"/>
+      <w:numFmt w:val="bullet"/>
+      <w:lvlText w:val="o"/>
+      <w:lvlJc w:val="left"/>
+      <w:pPr>
+        <w:ind w:left="5760" w:hanging="360"/>
+      </w:pPr>
+      <w:rPr>
+        <w:rFonts w:ascii="Courier New" w:hAnsi="Courier New" w:cs="Courier New" w:hint="default"/>
+      </w:rPr>
+    </w:lvl>
+    <w:lvl w:ilvl="8" w:tplc="04090005" w:tentative="1">
+      <w:start w:val="1"/>
+      <w:numFmt w:val="bullet"/>
+      <w:lvlText w:val=""/>
+      <w:lvlJc w:val="left"/>
+      <w:pPr>
+        <w:ind w:left="6480" w:hanging="360"/>
+      </w:pPr>
+      <w:rPr>
+        <w:rFonts w:ascii="Wingdings" w:hAnsi="Wingdings" w:hint="default"/>
+      </w:rPr>
+    </w:lvl>
+  </w:abstractNum>
+  <w:abstractNum w:abstractNumId="16" w15:restartNumberingAfterBreak="0">
     <w:nsid w:val="34B82A56"/>
     <w:multiLevelType w:val="hybridMultilevel"/>
-    <w:tmpl w:val="E5A47EC4"/>
+    <w:tmpl w:val="C73E3704"/>
     <w:lvl w:ilvl="0" w:tplc="04090001">
       <w:start w:val="1"/>
       <w:numFmt w:val="bullet"/>
@@ -10332,6 +13537,119 @@
         <w:rFonts w:ascii="Symbol" w:hAnsi="Symbol" w:hint="default"/>
       </w:rPr>
     </w:lvl>
+    <w:lvl w:ilvl="1" w:tplc="04090003">
+      <w:start w:val="1"/>
+      <w:numFmt w:val="bullet"/>
+      <w:lvlText w:val="o"/>
+      <w:lvlJc w:val="left"/>
+      <w:pPr>
+        <w:ind w:left="1440" w:hanging="360"/>
+      </w:pPr>
+      <w:rPr>
+        <w:rFonts w:ascii="Courier New" w:hAnsi="Courier New" w:cs="Courier New" w:hint="default"/>
+      </w:rPr>
+    </w:lvl>
+    <w:lvl w:ilvl="2" w:tplc="04090005" w:tentative="1">
+      <w:start w:val="1"/>
+      <w:numFmt w:val="bullet"/>
+      <w:lvlText w:val=""/>
+      <w:lvlJc w:val="left"/>
+      <w:pPr>
+        <w:ind w:left="2160" w:hanging="360"/>
+      </w:pPr>
+      <w:rPr>
+        <w:rFonts w:ascii="Wingdings" w:hAnsi="Wingdings" w:hint="default"/>
+      </w:rPr>
+    </w:lvl>
+    <w:lvl w:ilvl="3" w:tplc="04090001" w:tentative="1">
+      <w:start w:val="1"/>
+      <w:numFmt w:val="bullet"/>
+      <w:lvlText w:val=""/>
+      <w:lvlJc w:val="left"/>
+      <w:pPr>
+        <w:ind w:left="2880" w:hanging="360"/>
+      </w:pPr>
+      <w:rPr>
+        <w:rFonts w:ascii="Symbol" w:hAnsi="Symbol" w:hint="default"/>
+      </w:rPr>
+    </w:lvl>
+    <w:lvl w:ilvl="4" w:tplc="04090003" w:tentative="1">
+      <w:start w:val="1"/>
+      <w:numFmt w:val="bullet"/>
+      <w:lvlText w:val="o"/>
+      <w:lvlJc w:val="left"/>
+      <w:pPr>
+        <w:ind w:left="3600" w:hanging="360"/>
+      </w:pPr>
+      <w:rPr>
+        <w:rFonts w:ascii="Courier New" w:hAnsi="Courier New" w:cs="Courier New" w:hint="default"/>
+      </w:rPr>
+    </w:lvl>
+    <w:lvl w:ilvl="5" w:tplc="04090005" w:tentative="1">
+      <w:start w:val="1"/>
+      <w:numFmt w:val="bullet"/>
+      <w:lvlText w:val=""/>
+      <w:lvlJc w:val="left"/>
+      <w:pPr>
+        <w:ind w:left="4320" w:hanging="360"/>
+      </w:pPr>
+      <w:rPr>
+        <w:rFonts w:ascii="Wingdings" w:hAnsi="Wingdings" w:hint="default"/>
+      </w:rPr>
+    </w:lvl>
+    <w:lvl w:ilvl="6" w:tplc="04090001" w:tentative="1">
+      <w:start w:val="1"/>
+      <w:numFmt w:val="bullet"/>
+      <w:lvlText w:val=""/>
+      <w:lvlJc w:val="left"/>
+      <w:pPr>
+        <w:ind w:left="5040" w:hanging="360"/>
+      </w:pPr>
+      <w:rPr>
+        <w:rFonts w:ascii="Symbol" w:hAnsi="Symbol" w:hint="default"/>
+      </w:rPr>
+    </w:lvl>
+    <w:lvl w:ilvl="7" w:tplc="04090003" w:tentative="1">
+      <w:start w:val="1"/>
+      <w:numFmt w:val="bullet"/>
+      <w:lvlText w:val="o"/>
+      <w:lvlJc w:val="left"/>
+      <w:pPr>
+        <w:ind w:left="5760" w:hanging="360"/>
+      </w:pPr>
+      <w:rPr>
+        <w:rFonts w:ascii="Courier New" w:hAnsi="Courier New" w:cs="Courier New" w:hint="default"/>
+      </w:rPr>
+    </w:lvl>
+    <w:lvl w:ilvl="8" w:tplc="04090005" w:tentative="1">
+      <w:start w:val="1"/>
+      <w:numFmt w:val="bullet"/>
+      <w:lvlText w:val=""/>
+      <w:lvlJc w:val="left"/>
+      <w:pPr>
+        <w:ind w:left="6480" w:hanging="360"/>
+      </w:pPr>
+      <w:rPr>
+        <w:rFonts w:ascii="Wingdings" w:hAnsi="Wingdings" w:hint="default"/>
+      </w:rPr>
+    </w:lvl>
+  </w:abstractNum>
+  <w:abstractNum w:abstractNumId="17" w15:restartNumberingAfterBreak="0">
+    <w:nsid w:val="3B44539B"/>
+    <w:multiLevelType w:val="hybridMultilevel"/>
+    <w:tmpl w:val="0FD47BD2"/>
+    <w:lvl w:ilvl="0" w:tplc="04090003">
+      <w:start w:val="1"/>
+      <w:numFmt w:val="bullet"/>
+      <w:lvlText w:val="o"/>
+      <w:lvlJc w:val="left"/>
+      <w:pPr>
+        <w:ind w:left="720" w:hanging="360"/>
+      </w:pPr>
+      <w:rPr>
+        <w:rFonts w:ascii="Courier New" w:hAnsi="Courier New" w:cs="Courier New" w:hint="default"/>
+      </w:rPr>
+    </w:lvl>
     <w:lvl w:ilvl="1" w:tplc="04090003" w:tentative="1">
       <w:start w:val="1"/>
       <w:numFmt w:val="bullet"/>
@@ -10429,7 +13747,7 @@
       </w:rPr>
     </w:lvl>
   </w:abstractNum>
-  <w:abstractNum w:abstractNumId="16" w15:restartNumberingAfterBreak="0">
+  <w:abstractNum w:abstractNumId="18" w15:restartNumberingAfterBreak="0">
     <w:nsid w:val="42D47DCB"/>
     <w:multiLevelType w:val="hybridMultilevel"/>
     <w:tmpl w:val="38EC0A8A"/>
@@ -10542,7 +13860,120 @@
       </w:rPr>
     </w:lvl>
   </w:abstractNum>
-  <w:abstractNum w:abstractNumId="17" w15:restartNumberingAfterBreak="0">
+  <w:abstractNum w:abstractNumId="19" w15:restartNumberingAfterBreak="0">
+    <w:nsid w:val="43CF2184"/>
+    <w:multiLevelType w:val="hybridMultilevel"/>
+    <w:tmpl w:val="31D40330"/>
+    <w:lvl w:ilvl="0" w:tplc="FFFFFFFF">
+      <w:start w:val="1"/>
+      <w:numFmt w:val="bullet"/>
+      <w:lvlText w:val=""/>
+      <w:lvlJc w:val="left"/>
+      <w:pPr>
+        <w:ind w:left="720" w:hanging="360"/>
+      </w:pPr>
+      <w:rPr>
+        <w:rFonts w:ascii="Symbol" w:hAnsi="Symbol" w:hint="default"/>
+      </w:rPr>
+    </w:lvl>
+    <w:lvl w:ilvl="1" w:tplc="FFFFFFFF">
+      <w:start w:val="1"/>
+      <w:numFmt w:val="bullet"/>
+      <w:lvlText w:val="o"/>
+      <w:lvlJc w:val="left"/>
+      <w:pPr>
+        <w:ind w:left="1440" w:hanging="360"/>
+      </w:pPr>
+      <w:rPr>
+        <w:rFonts w:ascii="Courier New" w:hAnsi="Courier New" w:cs="Courier New" w:hint="default"/>
+      </w:rPr>
+    </w:lvl>
+    <w:lvl w:ilvl="2" w:tplc="04090001">
+      <w:start w:val="1"/>
+      <w:numFmt w:val="bullet"/>
+      <w:lvlText w:val=""/>
+      <w:lvlJc w:val="left"/>
+      <w:pPr>
+        <w:ind w:left="2160" w:hanging="360"/>
+      </w:pPr>
+      <w:rPr>
+        <w:rFonts w:ascii="Symbol" w:hAnsi="Symbol" w:hint="default"/>
+      </w:rPr>
+    </w:lvl>
+    <w:lvl w:ilvl="3" w:tplc="FFFFFFFF" w:tentative="1">
+      <w:start w:val="1"/>
+      <w:numFmt w:val="bullet"/>
+      <w:lvlText w:val=""/>
+      <w:lvlJc w:val="left"/>
+      <w:pPr>
+        <w:ind w:left="2880" w:hanging="360"/>
+      </w:pPr>
+      <w:rPr>
+        <w:rFonts w:ascii="Symbol" w:hAnsi="Symbol" w:hint="default"/>
+      </w:rPr>
+    </w:lvl>
+    <w:lvl w:ilvl="4" w:tplc="FFFFFFFF" w:tentative="1">
+      <w:start w:val="1"/>
+      <w:numFmt w:val="bullet"/>
+      <w:lvlText w:val="o"/>
+      <w:lvlJc w:val="left"/>
+      <w:pPr>
+        <w:ind w:left="3600" w:hanging="360"/>
+      </w:pPr>
+      <w:rPr>
+        <w:rFonts w:ascii="Courier New" w:hAnsi="Courier New" w:cs="Courier New" w:hint="default"/>
+      </w:rPr>
+    </w:lvl>
+    <w:lvl w:ilvl="5" w:tplc="FFFFFFFF" w:tentative="1">
+      <w:start w:val="1"/>
+      <w:numFmt w:val="bullet"/>
+      <w:lvlText w:val=""/>
+      <w:lvlJc w:val="left"/>
+      <w:pPr>
+        <w:ind w:left="4320" w:hanging="360"/>
+      </w:pPr>
+      <w:rPr>
+        <w:rFonts w:ascii="Wingdings" w:hAnsi="Wingdings" w:hint="default"/>
+      </w:rPr>
+    </w:lvl>
+    <w:lvl w:ilvl="6" w:tplc="FFFFFFFF" w:tentative="1">
+      <w:start w:val="1"/>
+      <w:numFmt w:val="bullet"/>
+      <w:lvlText w:val=""/>
+      <w:lvlJc w:val="left"/>
+      <w:pPr>
+        <w:ind w:left="5040" w:hanging="360"/>
+      </w:pPr>
+      <w:rPr>
+        <w:rFonts w:ascii="Symbol" w:hAnsi="Symbol" w:hint="default"/>
+      </w:rPr>
+    </w:lvl>
+    <w:lvl w:ilvl="7" w:tplc="FFFFFFFF" w:tentative="1">
+      <w:start w:val="1"/>
+      <w:numFmt w:val="bullet"/>
+      <w:lvlText w:val="o"/>
+      <w:lvlJc w:val="left"/>
+      <w:pPr>
+        <w:ind w:left="5760" w:hanging="360"/>
+      </w:pPr>
+      <w:rPr>
+        <w:rFonts w:ascii="Courier New" w:hAnsi="Courier New" w:cs="Courier New" w:hint="default"/>
+      </w:rPr>
+    </w:lvl>
+    <w:lvl w:ilvl="8" w:tplc="FFFFFFFF" w:tentative="1">
+      <w:start w:val="1"/>
+      <w:numFmt w:val="bullet"/>
+      <w:lvlText w:val=""/>
+      <w:lvlJc w:val="left"/>
+      <w:pPr>
+        <w:ind w:left="6480" w:hanging="360"/>
+      </w:pPr>
+      <w:rPr>
+        <w:rFonts w:ascii="Wingdings" w:hAnsi="Wingdings" w:hint="default"/>
+      </w:rPr>
+    </w:lvl>
+  </w:abstractNum>
+  <w:abstractNum w:abstractNumId="20" w15:restartNumberingAfterBreak="0">
     <w:nsid w:val="46B72780"/>
     <w:multiLevelType w:val="hybridMultilevel"/>
     <w:tmpl w:val="3F7C0D16"/>
@@ -10655,7 +14086,7 @@
       </w:rPr>
     </w:lvl>
   </w:abstractNum>
-  <w:abstractNum w:abstractNumId="18" w15:restartNumberingAfterBreak="0">
+  <w:abstractNum w:abstractNumId="21" w15:restartNumberingAfterBreak="0">
     <w:nsid w:val="4713585B"/>
     <w:multiLevelType w:val="hybridMultilevel"/>
     <w:tmpl w:val="D5D03CA2"/>
@@ -10768,7 +14199,120 @@
       </w:rPr>
     </w:lvl>
   </w:abstractNum>
-  <w:abstractNum w:abstractNumId="19" w15:restartNumberingAfterBreak="0">
+  <w:abstractNum w:abstractNumId="22" w15:restartNumberingAfterBreak="0">
+    <w:nsid w:val="49AE5522"/>
+    <w:multiLevelType w:val="hybridMultilevel"/>
+    <w:tmpl w:val="A05EBD1E"/>
+    <w:lvl w:ilvl="0" w:tplc="04090005">
+      <w:start w:val="1"/>
+      <w:numFmt w:val="bullet"/>
+      <w:lvlText w:val=""/>
+      <w:lvlJc w:val="left"/>
+      <w:pPr>
+        <w:ind w:left="1440" w:hanging="360"/>
+      </w:pPr>
+      <w:rPr>
+        <w:rFonts w:ascii="Wingdings" w:hAnsi="Wingdings" w:hint="default"/>
+      </w:rPr>
+    </w:lvl>
+    <w:lvl w:ilvl="1" w:tplc="04090003" w:tentative="1">
+      <w:start w:val="1"/>
+      <w:numFmt w:val="bullet"/>
+      <w:lvlText w:val="o"/>
+      <w:lvlJc w:val="left"/>
+      <w:pPr>
+        <w:ind w:left="2160" w:hanging="360"/>
+      </w:pPr>
+      <w:rPr>
+        <w:rFonts w:ascii="Courier New" w:hAnsi="Courier New" w:cs="Courier New" w:hint="default"/>
+      </w:rPr>
+    </w:lvl>
+    <w:lvl w:ilvl="2" w:tplc="04090005" w:tentative="1">
+      <w:start w:val="1"/>
+      <w:numFmt w:val="bullet"/>
+      <w:lvlText w:val=""/>
+      <w:lvlJc w:val="left"/>
+      <w:pPr>
+        <w:ind w:left="2880" w:hanging="360"/>
+      </w:pPr>
+      <w:rPr>
+        <w:rFonts w:ascii="Wingdings" w:hAnsi="Wingdings" w:hint="default"/>
+      </w:rPr>
+    </w:lvl>
+    <w:lvl w:ilvl="3" w:tplc="04090001" w:tentative="1">
+      <w:start w:val="1"/>
+      <w:numFmt w:val="bullet"/>
+      <w:lvlText w:val=""/>
+      <w:lvlJc w:val="left"/>
+      <w:pPr>
+        <w:ind w:left="3600" w:hanging="360"/>
+      </w:pPr>
+      <w:rPr>
+        <w:rFonts w:ascii="Symbol" w:hAnsi="Symbol" w:hint="default"/>
+      </w:rPr>
+    </w:lvl>
+    <w:lvl w:ilvl="4" w:tplc="04090003" w:tentative="1">
+      <w:start w:val="1"/>
+      <w:numFmt w:val="bullet"/>
+      <w:lvlText w:val="o"/>
+      <w:lvlJc w:val="left"/>
+      <w:pPr>
+        <w:ind w:left="4320" w:hanging="360"/>
+      </w:pPr>
+      <w:rPr>
+        <w:rFonts w:ascii="Courier New" w:hAnsi="Courier New" w:cs="Courier New" w:hint="default"/>
+      </w:rPr>
+    </w:lvl>
+    <w:lvl w:ilvl="5" w:tplc="04090005" w:tentative="1">
+      <w:start w:val="1"/>
+      <w:numFmt w:val="bullet"/>
+      <w:lvlText w:val=""/>
+      <w:lvlJc w:val="left"/>
+      <w:pPr>
+        <w:ind w:left="5040" w:hanging="360"/>
+      </w:pPr>
+      <w:rPr>
+        <w:rFonts w:ascii="Wingdings" w:hAnsi="Wingdings" w:hint="default"/>
+      </w:rPr>
+    </w:lvl>
+    <w:lvl w:ilvl="6" w:tplc="04090001" w:tentative="1">
+      <w:start w:val="1"/>
+      <w:numFmt w:val="bullet"/>
+      <w:lvlText w:val=""/>
+      <w:lvlJc w:val="left"/>
+      <w:pPr>
+        <w:ind w:left="5760" w:hanging="360"/>
+      </w:pPr>
+      <w:rPr>
+        <w:rFonts w:ascii="Symbol" w:hAnsi="Symbol" w:hint="default"/>
+      </w:rPr>
+    </w:lvl>
+    <w:lvl w:ilvl="7" w:tplc="04090003" w:tentative="1">
+      <w:start w:val="1"/>
+      <w:numFmt w:val="bullet"/>
+      <w:lvlText w:val="o"/>
+      <w:lvlJc w:val="left"/>
+      <w:pPr>
+        <w:ind w:left="6480" w:hanging="360"/>
+      </w:pPr>
+      <w:rPr>
+        <w:rFonts w:ascii="Courier New" w:hAnsi="Courier New" w:cs="Courier New" w:hint="default"/>
+      </w:rPr>
+    </w:lvl>
+    <w:lvl w:ilvl="8" w:tplc="04090005" w:tentative="1">
+      <w:start w:val="1"/>
+      <w:numFmt w:val="bullet"/>
+      <w:lvlText w:val=""/>
+      <w:lvlJc w:val="left"/>
+      <w:pPr>
+        <w:ind w:left="7200" w:hanging="360"/>
+      </w:pPr>
+      <w:rPr>
+        <w:rFonts w:ascii="Wingdings" w:hAnsi="Wingdings" w:hint="default"/>
+      </w:rPr>
+    </w:lvl>
+  </w:abstractNum>
+  <w:abstractNum w:abstractNumId="23" w15:restartNumberingAfterBreak="0">
     <w:nsid w:val="4B46003E"/>
     <w:multiLevelType w:val="hybridMultilevel"/>
     <w:tmpl w:val="FFB68282"/>
@@ -10881,7 +14425,7 @@
       </w:rPr>
     </w:lvl>
   </w:abstractNum>
-  <w:abstractNum w:abstractNumId="20" w15:restartNumberingAfterBreak="0">
+  <w:abstractNum w:abstractNumId="24" w15:restartNumberingAfterBreak="0">
     <w:nsid w:val="4B862655"/>
     <w:multiLevelType w:val="hybridMultilevel"/>
     <w:tmpl w:val="8256C230"/>
@@ -10994,7 +14538,7 @@
       </w:rPr>
     </w:lvl>
   </w:abstractNum>
-  <w:abstractNum w:abstractNumId="21" w15:restartNumberingAfterBreak="0">
+  <w:abstractNum w:abstractNumId="25" w15:restartNumberingAfterBreak="0">
     <w:nsid w:val="4BB35744"/>
     <w:multiLevelType w:val="hybridMultilevel"/>
     <w:tmpl w:val="2AE04D9A"/>
@@ -11107,7 +14651,233 @@
       </w:rPr>
     </w:lvl>
   </w:abstractNum>
-  <w:abstractNum w:abstractNumId="22" w15:restartNumberingAfterBreak="0">
+  <w:abstractNum w:abstractNumId="26" w15:restartNumberingAfterBreak="0">
+    <w:nsid w:val="4C495AA5"/>
+    <w:multiLevelType w:val="hybridMultilevel"/>
+    <w:tmpl w:val="B3CC2100"/>
+    <w:lvl w:ilvl="0" w:tplc="04090001">
+      <w:start w:val="1"/>
+      <w:numFmt w:val="bullet"/>
+      <w:lvlText w:val=""/>
+      <w:lvlJc w:val="left"/>
+      <w:pPr>
+        <w:ind w:left="720" w:hanging="360"/>
+      </w:pPr>
+      <w:rPr>
+        <w:rFonts w:ascii="Symbol" w:hAnsi="Symbol" w:hint="default"/>
+      </w:rPr>
+    </w:lvl>
+    <w:lvl w:ilvl="1" w:tplc="04090003">
+      <w:start w:val="1"/>
+      <w:numFmt w:val="bullet"/>
+      <w:lvlText w:val="o"/>
+      <w:lvlJc w:val="left"/>
+      <w:pPr>
+        <w:ind w:left="1440" w:hanging="360"/>
+      </w:pPr>
+      <w:rPr>
+        <w:rFonts w:ascii="Courier New" w:hAnsi="Courier New" w:cs="Courier New" w:hint="default"/>
+      </w:rPr>
+    </w:lvl>
+    <w:lvl w:ilvl="2" w:tplc="04090005">
+      <w:start w:val="1"/>
+      <w:numFmt w:val="bullet"/>
+      <w:lvlText w:val=""/>
+      <w:lvlJc w:val="left"/>
+      <w:pPr>
+        <w:ind w:left="2160" w:hanging="360"/>
+      </w:pPr>
+      <w:rPr>
+        <w:rFonts w:ascii="Wingdings" w:hAnsi="Wingdings" w:hint="default"/>
+      </w:rPr>
+    </w:lvl>
+    <w:lvl w:ilvl="3" w:tplc="04090001" w:tentative="1">
+      <w:start w:val="1"/>
+      <w:numFmt w:val="bullet"/>
+      <w:lvlText w:val=""/>
+      <w:lvlJc w:val="left"/>
+      <w:pPr>
+        <w:ind w:left="2880" w:hanging="360"/>
+      </w:pPr>
+      <w:rPr>
+        <w:rFonts w:ascii="Symbol" w:hAnsi="Symbol" w:hint="default"/>
+      </w:rPr>
+    </w:lvl>
+    <w:lvl w:ilvl="4" w:tplc="04090003" w:tentative="1">
+      <w:start w:val="1"/>
+      <w:numFmt w:val="bullet"/>
+      <w:lvlText w:val="o"/>
+      <w:lvlJc w:val="left"/>
+      <w:pPr>
+        <w:ind w:left="3600" w:hanging="360"/>
+      </w:pPr>
+      <w:rPr>
+        <w:rFonts w:ascii="Courier New" w:hAnsi="Courier New" w:cs="Courier New" w:hint="default"/>
+      </w:rPr>
+    </w:lvl>
+    <w:lvl w:ilvl="5" w:tplc="04090005" w:tentative="1">
+      <w:start w:val="1"/>
+      <w:numFmt w:val="bullet"/>
+      <w:lvlText w:val=""/>
+      <w:lvlJc w:val="left"/>
+      <w:pPr>
+        <w:ind w:left="4320" w:hanging="360"/>
+      </w:pPr>
+      <w:rPr>
+        <w:rFonts w:ascii="Wingdings" w:hAnsi="Wingdings" w:hint="default"/>
+      </w:rPr>
+    </w:lvl>
+    <w:lvl w:ilvl="6" w:tplc="04090001" w:tentative="1">
+      <w:start w:val="1"/>
+      <w:numFmt w:val="bullet"/>
+      <w:lvlText w:val=""/>
+      <w:lvlJc w:val="left"/>
+      <w:pPr>
+        <w:ind w:left="5040" w:hanging="360"/>
+      </w:pPr>
+      <w:rPr>
+        <w:rFonts w:ascii="Symbol" w:hAnsi="Symbol" w:hint="default"/>
+      </w:rPr>
+    </w:lvl>
+    <w:lvl w:ilvl="7" w:tplc="04090003" w:tentative="1">
+      <w:start w:val="1"/>
+      <w:numFmt w:val="bullet"/>
+      <w:lvlText w:val="o"/>
+      <w:lvlJc w:val="left"/>
+      <w:pPr>
+        <w:ind w:left="5760" w:hanging="360"/>
+      </w:pPr>
+      <w:rPr>
+        <w:rFonts w:ascii="Courier New" w:hAnsi="Courier New" w:cs="Courier New" w:hint="default"/>
+      </w:rPr>
+    </w:lvl>
+    <w:lvl w:ilvl="8" w:tplc="04090005" w:tentative="1">
+      <w:start w:val="1"/>
+      <w:numFmt w:val="bullet"/>
+      <w:lvlText w:val=""/>
+      <w:lvlJc w:val="left"/>
+      <w:pPr>
+        <w:ind w:left="6480" w:hanging="360"/>
+      </w:pPr>
+      <w:rPr>
+        <w:rFonts w:ascii="Wingdings" w:hAnsi="Wingdings" w:hint="default"/>
+      </w:rPr>
+    </w:lvl>
+  </w:abstractNum>
+  <w:abstractNum w:abstractNumId="27" w15:restartNumberingAfterBreak="0">
+    <w:nsid w:val="4CFE6CCD"/>
+    <w:multiLevelType w:val="hybridMultilevel"/>
+    <w:tmpl w:val="D5526B9C"/>
+    <w:lvl w:ilvl="0" w:tplc="FFFFFFFF">
+      <w:start w:val="1"/>
+      <w:numFmt w:val="bullet"/>
+      <w:lvlText w:val=""/>
+      <w:lvlJc w:val="left"/>
+      <w:pPr>
+        <w:ind w:left="720" w:hanging="360"/>
+      </w:pPr>
+      <w:rPr>
+        <w:rFonts w:ascii="Symbol" w:hAnsi="Symbol" w:hint="default"/>
+      </w:rPr>
+    </w:lvl>
+    <w:lvl w:ilvl="1" w:tplc="FFFFFFFF">
+      <w:start w:val="1"/>
+      <w:numFmt w:val="bullet"/>
+      <w:lvlText w:val="o"/>
+      <w:lvlJc w:val="left"/>
+      <w:pPr>
+        <w:ind w:left="1440" w:hanging="360"/>
+      </w:pPr>
+      <w:rPr>
+        <w:rFonts w:ascii="Courier New" w:hAnsi="Courier New" w:cs="Courier New" w:hint="default"/>
+      </w:rPr>
+    </w:lvl>
+    <w:lvl w:ilvl="2" w:tplc="04090003">
+      <w:start w:val="1"/>
+      <w:numFmt w:val="bullet"/>
+      <w:lvlText w:val="o"/>
+      <w:lvlJc w:val="left"/>
+      <w:pPr>
+        <w:ind w:left="1440" w:hanging="360"/>
+      </w:pPr>
+      <w:rPr>
+        <w:rFonts w:ascii="Courier New" w:hAnsi="Courier New" w:cs="Courier New" w:hint="default"/>
+      </w:rPr>
+    </w:lvl>
+    <w:lvl w:ilvl="3" w:tplc="FFFFFFFF" w:tentative="1">
+      <w:start w:val="1"/>
+      <w:numFmt w:val="bullet"/>
+      <w:lvlText w:val=""/>
+      <w:lvlJc w:val="left"/>
+      <w:pPr>
+        <w:ind w:left="2880" w:hanging="360"/>
+      </w:pPr>
+      <w:rPr>
+        <w:rFonts w:ascii="Symbol" w:hAnsi="Symbol" w:hint="default"/>
+      </w:rPr>
+    </w:lvl>
+    <w:lvl w:ilvl="4" w:tplc="FFFFFFFF" w:tentative="1">
+      <w:start w:val="1"/>
+      <w:numFmt w:val="bullet"/>
+      <w:lvlText w:val="o"/>
+      <w:lvlJc w:val="left"/>
+      <w:pPr>
+        <w:ind w:left="3600" w:hanging="360"/>
+      </w:pPr>
+      <w:rPr>
+        <w:rFonts w:ascii="Courier New" w:hAnsi="Courier New" w:cs="Courier New" w:hint="default"/>
+      </w:rPr>
+    </w:lvl>
+    <w:lvl w:ilvl="5" w:tplc="FFFFFFFF" w:tentative="1">
+      <w:start w:val="1"/>
+      <w:numFmt w:val="bullet"/>
+      <w:lvlText w:val=""/>
+      <w:lvlJc w:val="left"/>
+      <w:pPr>
+        <w:ind w:left="4320" w:hanging="360"/>
+      </w:pPr>
+      <w:rPr>
+        <w:rFonts w:ascii="Wingdings" w:hAnsi="Wingdings" w:hint="default"/>
+      </w:rPr>
+    </w:lvl>
+    <w:lvl w:ilvl="6" w:tplc="FFFFFFFF" w:tentative="1">
+      <w:start w:val="1"/>
+      <w:numFmt w:val="bullet"/>
+      <w:lvlText w:val=""/>
+      <w:lvlJc w:val="left"/>
+      <w:pPr>
+        <w:ind w:left="5040" w:hanging="360"/>
+      </w:pPr>
+      <w:rPr>
+        <w:rFonts w:ascii="Symbol" w:hAnsi="Symbol" w:hint="default"/>
+      </w:rPr>
+    </w:lvl>
+    <w:lvl w:ilvl="7" w:tplc="FFFFFFFF" w:tentative="1">
+      <w:start w:val="1"/>
+      <w:numFmt w:val="bullet"/>
+      <w:lvlText w:val="o"/>
+      <w:lvlJc w:val="left"/>
+      <w:pPr>
+        <w:ind w:left="5760" w:hanging="360"/>
+      </w:pPr>
+      <w:rPr>
+        <w:rFonts w:ascii="Courier New" w:hAnsi="Courier New" w:cs="Courier New" w:hint="default"/>
+      </w:rPr>
+    </w:lvl>
+    <w:lvl w:ilvl="8" w:tplc="FFFFFFFF" w:tentative="1">
+      <w:start w:val="1"/>
+      <w:numFmt w:val="bullet"/>
+      <w:lvlText w:val=""/>
+      <w:lvlJc w:val="left"/>
+      <w:pPr>
+        <w:ind w:left="6480" w:hanging="360"/>
+      </w:pPr>
+      <w:rPr>
+        <w:rFonts w:ascii="Wingdings" w:hAnsi="Wingdings" w:hint="default"/>
+      </w:rPr>
+    </w:lvl>
+  </w:abstractNum>
+  <w:abstractNum w:abstractNumId="28" w15:restartNumberingAfterBreak="0">
     <w:nsid w:val="4EFC521F"/>
     <w:multiLevelType w:val="hybridMultilevel"/>
     <w:tmpl w:val="6D6641D4"/>
@@ -11220,7 +14990,7 @@
       </w:rPr>
     </w:lvl>
   </w:abstractNum>
-  <w:abstractNum w:abstractNumId="23" w15:restartNumberingAfterBreak="0">
+  <w:abstractNum w:abstractNumId="29" w15:restartNumberingAfterBreak="0">
     <w:nsid w:val="4F7509DD"/>
     <w:multiLevelType w:val="hybridMultilevel"/>
     <w:tmpl w:val="184A4B6A"/>
@@ -11306,7 +15076,7 @@
       </w:pPr>
     </w:lvl>
   </w:abstractNum>
-  <w:abstractNum w:abstractNumId="24" w15:restartNumberingAfterBreak="0">
+  <w:abstractNum w:abstractNumId="30" w15:restartNumberingAfterBreak="0">
     <w:nsid w:val="521A768C"/>
     <w:multiLevelType w:val="hybridMultilevel"/>
     <w:tmpl w:val="3758B944"/>
@@ -11419,7 +15189,7 @@
       </w:rPr>
     </w:lvl>
   </w:abstractNum>
-  <w:abstractNum w:abstractNumId="25" w15:restartNumberingAfterBreak="0">
+  <w:abstractNum w:abstractNumId="31" w15:restartNumberingAfterBreak="0">
     <w:nsid w:val="56E6060D"/>
     <w:multiLevelType w:val="hybridMultilevel"/>
     <w:tmpl w:val="A7FE6B06"/>
@@ -11532,7 +15302,7 @@
       </w:rPr>
     </w:lvl>
   </w:abstractNum>
-  <w:abstractNum w:abstractNumId="26" w15:restartNumberingAfterBreak="0">
+  <w:abstractNum w:abstractNumId="32" w15:restartNumberingAfterBreak="0">
     <w:nsid w:val="58A201D3"/>
     <w:multiLevelType w:val="hybridMultilevel"/>
     <w:tmpl w:val="D48CBA00"/>
@@ -11645,7 +15415,7 @@
       </w:rPr>
     </w:lvl>
   </w:abstractNum>
-  <w:abstractNum w:abstractNumId="27" w15:restartNumberingAfterBreak="0">
+  <w:abstractNum w:abstractNumId="33" w15:restartNumberingAfterBreak="0">
     <w:nsid w:val="5DF43296"/>
     <w:multiLevelType w:val="hybridMultilevel"/>
     <w:tmpl w:val="B5BEBBE0"/>
@@ -11758,7 +15528,7 @@
       </w:rPr>
     </w:lvl>
   </w:abstractNum>
-  <w:abstractNum w:abstractNumId="28" w15:restartNumberingAfterBreak="0">
+  <w:abstractNum w:abstractNumId="34" w15:restartNumberingAfterBreak="0">
     <w:nsid w:val="60DE0010"/>
     <w:multiLevelType w:val="hybridMultilevel"/>
     <w:tmpl w:val="0910F204"/>
@@ -11871,7 +15641,7 @@
       </w:rPr>
     </w:lvl>
   </w:abstractNum>
-  <w:abstractNum w:abstractNumId="29" w15:restartNumberingAfterBreak="0">
+  <w:abstractNum w:abstractNumId="35" w15:restartNumberingAfterBreak="0">
     <w:nsid w:val="615D6C3B"/>
     <w:multiLevelType w:val="hybridMultilevel"/>
     <w:tmpl w:val="B3E0162A"/>
@@ -11984,7 +15754,7 @@
       </w:rPr>
     </w:lvl>
   </w:abstractNum>
-  <w:abstractNum w:abstractNumId="30" w15:restartNumberingAfterBreak="0">
+  <w:abstractNum w:abstractNumId="36" w15:restartNumberingAfterBreak="0">
     <w:nsid w:val="63EA54DC"/>
     <w:multiLevelType w:val="hybridMultilevel"/>
     <w:tmpl w:val="AC0EFFDC"/>
@@ -12097,7 +15867,7 @@
       </w:rPr>
     </w:lvl>
   </w:abstractNum>
-  <w:abstractNum w:abstractNumId="31" w15:restartNumberingAfterBreak="0">
+  <w:abstractNum w:abstractNumId="37" w15:restartNumberingAfterBreak="0">
     <w:nsid w:val="68513ADD"/>
     <w:multiLevelType w:val="hybridMultilevel"/>
     <w:tmpl w:val="D6FC3B70"/>
@@ -12210,7 +15980,233 @@
       </w:rPr>
     </w:lvl>
   </w:abstractNum>
-  <w:abstractNum w:abstractNumId="32" w15:restartNumberingAfterBreak="0">
+  <w:abstractNum w:abstractNumId="38" w15:restartNumberingAfterBreak="0">
+    <w:nsid w:val="68E449C6"/>
+    <w:multiLevelType w:val="hybridMultilevel"/>
+    <w:tmpl w:val="43B4B23C"/>
+    <w:lvl w:ilvl="0" w:tplc="04090003">
+      <w:start w:val="1"/>
+      <w:numFmt w:val="bullet"/>
+      <w:lvlText w:val="o"/>
+      <w:lvlJc w:val="left"/>
+      <w:pPr>
+        <w:ind w:left="720" w:hanging="360"/>
+      </w:pPr>
+      <w:rPr>
+        <w:rFonts w:ascii="Courier New" w:hAnsi="Courier New" w:cs="Courier New" w:hint="default"/>
+      </w:rPr>
+    </w:lvl>
+    <w:lvl w:ilvl="1" w:tplc="FFFFFFFF" w:tentative="1">
+      <w:start w:val="1"/>
+      <w:numFmt w:val="bullet"/>
+      <w:lvlText w:val="o"/>
+      <w:lvlJc w:val="left"/>
+      <w:pPr>
+        <w:ind w:left="1440" w:hanging="360"/>
+      </w:pPr>
+      <w:rPr>
+        <w:rFonts w:ascii="Courier New" w:hAnsi="Courier New" w:cs="Courier New" w:hint="default"/>
+      </w:rPr>
+    </w:lvl>
+    <w:lvl w:ilvl="2" w:tplc="FFFFFFFF" w:tentative="1">
+      <w:start w:val="1"/>
+      <w:numFmt w:val="bullet"/>
+      <w:lvlText w:val=""/>
+      <w:lvlJc w:val="left"/>
+      <w:pPr>
+        <w:ind w:left="2160" w:hanging="360"/>
+      </w:pPr>
+      <w:rPr>
+        <w:rFonts w:ascii="Wingdings" w:hAnsi="Wingdings" w:hint="default"/>
+      </w:rPr>
+    </w:lvl>
+    <w:lvl w:ilvl="3" w:tplc="FFFFFFFF" w:tentative="1">
+      <w:start w:val="1"/>
+      <w:numFmt w:val="bullet"/>
+      <w:lvlText w:val=""/>
+      <w:lvlJc w:val="left"/>
+      <w:pPr>
+        <w:ind w:left="2880" w:hanging="360"/>
+      </w:pPr>
+      <w:rPr>
+        <w:rFonts w:ascii="Symbol" w:hAnsi="Symbol" w:hint="default"/>
+      </w:rPr>
+    </w:lvl>
+    <w:lvl w:ilvl="4" w:tplc="FFFFFFFF" w:tentative="1">
+      <w:start w:val="1"/>
+      <w:numFmt w:val="bullet"/>
+      <w:lvlText w:val="o"/>
+      <w:lvlJc w:val="left"/>
+      <w:pPr>
+        <w:ind w:left="3600" w:hanging="360"/>
+      </w:pPr>
+      <w:rPr>
+        <w:rFonts w:ascii="Courier New" w:hAnsi="Courier New" w:cs="Courier New" w:hint="default"/>
+      </w:rPr>
+    </w:lvl>
+    <w:lvl w:ilvl="5" w:tplc="FFFFFFFF" w:tentative="1">
+      <w:start w:val="1"/>
+      <w:numFmt w:val="bullet"/>
+      <w:lvlText w:val=""/>
+      <w:lvlJc w:val="left"/>
+      <w:pPr>
+        <w:ind w:left="4320" w:hanging="360"/>
+      </w:pPr>
+      <w:rPr>
+        <w:rFonts w:ascii="Wingdings" w:hAnsi="Wingdings" w:hint="default"/>
+      </w:rPr>
+    </w:lvl>
+    <w:lvl w:ilvl="6" w:tplc="FFFFFFFF" w:tentative="1">
+      <w:start w:val="1"/>
+      <w:numFmt w:val="bullet"/>
+      <w:lvlText w:val=""/>
+      <w:lvlJc w:val="left"/>
+      <w:pPr>
+        <w:ind w:left="5040" w:hanging="360"/>
+      </w:pPr>
+      <w:rPr>
+        <w:rFonts w:ascii="Symbol" w:hAnsi="Symbol" w:hint="default"/>
+      </w:rPr>
+    </w:lvl>
+    <w:lvl w:ilvl="7" w:tplc="FFFFFFFF" w:tentative="1">
+      <w:start w:val="1"/>
+      <w:numFmt w:val="bullet"/>
+      <w:lvlText w:val="o"/>
+      <w:lvlJc w:val="left"/>
+      <w:pPr>
+        <w:ind w:left="5760" w:hanging="360"/>
+      </w:pPr>
+      <w:rPr>
+        <w:rFonts w:ascii="Courier New" w:hAnsi="Courier New" w:cs="Courier New" w:hint="default"/>
+      </w:rPr>
+    </w:lvl>
+    <w:lvl w:ilvl="8" w:tplc="FFFFFFFF" w:tentative="1">
+      <w:start w:val="1"/>
+      <w:numFmt w:val="bullet"/>
+      <w:lvlText w:val=""/>
+      <w:lvlJc w:val="left"/>
+      <w:pPr>
+        <w:ind w:left="6480" w:hanging="360"/>
+      </w:pPr>
+      <w:rPr>
+        <w:rFonts w:ascii="Wingdings" w:hAnsi="Wingdings" w:hint="default"/>
+      </w:rPr>
+    </w:lvl>
+  </w:abstractNum>
+  <w:abstractNum w:abstractNumId="39" w15:restartNumberingAfterBreak="0">
+    <w:nsid w:val="6B5E5646"/>
+    <w:multiLevelType w:val="hybridMultilevel"/>
+    <w:tmpl w:val="9D9E4E1C"/>
+    <w:lvl w:ilvl="0" w:tplc="04090001">
+      <w:start w:val="1"/>
+      <w:numFmt w:val="bullet"/>
+      <w:lvlText w:val=""/>
+      <w:lvlJc w:val="left"/>
+      <w:pPr>
+        <w:ind w:left="1080" w:hanging="360"/>
+      </w:pPr>
+      <w:rPr>
+        <w:rFonts w:ascii="Symbol" w:hAnsi="Symbol" w:hint="default"/>
+      </w:rPr>
+    </w:lvl>
+    <w:lvl w:ilvl="1" w:tplc="04090003">
+      <w:start w:val="1"/>
+      <w:numFmt w:val="bullet"/>
+      <w:lvlText w:val="o"/>
+      <w:lvlJc w:val="left"/>
+      <w:pPr>
+        <w:ind w:left="1800" w:hanging="360"/>
+      </w:pPr>
+      <w:rPr>
+        <w:rFonts w:ascii="Courier New" w:hAnsi="Courier New" w:cs="Courier New" w:hint="default"/>
+      </w:rPr>
+    </w:lvl>
+    <w:lvl w:ilvl="2" w:tplc="04090005" w:tentative="1">
+      <w:start w:val="1"/>
+      <w:numFmt w:val="bullet"/>
+      <w:lvlText w:val=""/>
+      <w:lvlJc w:val="left"/>
+      <w:pPr>
+        <w:ind w:left="2520" w:hanging="360"/>
+      </w:pPr>
+      <w:rPr>
+        <w:rFonts w:ascii="Wingdings" w:hAnsi="Wingdings" w:hint="default"/>
+      </w:rPr>
+    </w:lvl>
+    <w:lvl w:ilvl="3" w:tplc="04090001" w:tentative="1">
+      <w:start w:val="1"/>
+      <w:numFmt w:val="bullet"/>
+      <w:lvlText w:val=""/>
+      <w:lvlJc w:val="left"/>
+      <w:pPr>
+        <w:ind w:left="3240" w:hanging="360"/>
+      </w:pPr>
+      <w:rPr>
+        <w:rFonts w:ascii="Symbol" w:hAnsi="Symbol" w:hint="default"/>
+      </w:rPr>
+    </w:lvl>
+    <w:lvl w:ilvl="4" w:tplc="04090003" w:tentative="1">
+      <w:start w:val="1"/>
+      <w:numFmt w:val="bullet"/>
+      <w:lvlText w:val="o"/>
+      <w:lvlJc w:val="left"/>
+      <w:pPr>
+        <w:ind w:left="3960" w:hanging="360"/>
+      </w:pPr>
+      <w:rPr>
+        <w:rFonts w:ascii="Courier New" w:hAnsi="Courier New" w:cs="Courier New" w:hint="default"/>
+      </w:rPr>
+    </w:lvl>
+    <w:lvl w:ilvl="5" w:tplc="04090005" w:tentative="1">
+      <w:start w:val="1"/>
+      <w:numFmt w:val="bullet"/>
+      <w:lvlText w:val=""/>
+      <w:lvlJc w:val="left"/>
+      <w:pPr>
+        <w:ind w:left="4680" w:hanging="360"/>
+      </w:pPr>
+      <w:rPr>
+        <w:rFonts w:ascii="Wingdings" w:hAnsi="Wingdings" w:hint="default"/>
+      </w:rPr>
+    </w:lvl>
+    <w:lvl w:ilvl="6" w:tplc="04090001" w:tentative="1">
+      <w:start w:val="1"/>
+      <w:numFmt w:val="bullet"/>
+      <w:lvlText w:val=""/>
+      <w:lvlJc w:val="left"/>
+      <w:pPr>
+        <w:ind w:left="5400" w:hanging="360"/>
+      </w:pPr>
+      <w:rPr>
+        <w:rFonts w:ascii="Symbol" w:hAnsi="Symbol" w:hint="default"/>
+      </w:rPr>
+    </w:lvl>
+    <w:lvl w:ilvl="7" w:tplc="04090003" w:tentative="1">
+      <w:start w:val="1"/>
+      <w:numFmt w:val="bullet"/>
+      <w:lvlText w:val="o"/>
+      <w:lvlJc w:val="left"/>
+      <w:pPr>
+        <w:ind w:left="6120" w:hanging="360"/>
+      </w:pPr>
+      <w:rPr>
+        <w:rFonts w:ascii="Courier New" w:hAnsi="Courier New" w:cs="Courier New" w:hint="default"/>
+      </w:rPr>
+    </w:lvl>
+    <w:lvl w:ilvl="8" w:tplc="04090005" w:tentative="1">
+      <w:start w:val="1"/>
+      <w:numFmt w:val="bullet"/>
+      <w:lvlText w:val=""/>
+      <w:lvlJc w:val="left"/>
+      <w:pPr>
+        <w:ind w:left="6840" w:hanging="360"/>
+      </w:pPr>
+      <w:rPr>
+        <w:rFonts w:ascii="Wingdings" w:hAnsi="Wingdings" w:hint="default"/>
+      </w:rPr>
+    </w:lvl>
+  </w:abstractNum>
+  <w:abstractNum w:abstractNumId="40" w15:restartNumberingAfterBreak="0">
     <w:nsid w:val="71841C50"/>
     <w:multiLevelType w:val="hybridMultilevel"/>
     <w:tmpl w:val="2F12406C"/>
@@ -12323,7 +16319,7 @@
       </w:rPr>
     </w:lvl>
   </w:abstractNum>
-  <w:abstractNum w:abstractNumId="33" w15:restartNumberingAfterBreak="0">
+  <w:abstractNum w:abstractNumId="41" w15:restartNumberingAfterBreak="0">
     <w:nsid w:val="71C7364A"/>
     <w:multiLevelType w:val="hybridMultilevel"/>
     <w:tmpl w:val="E62A71BA"/>
@@ -12436,7 +16432,7 @@
       </w:rPr>
     </w:lvl>
   </w:abstractNum>
-  <w:abstractNum w:abstractNumId="34" w15:restartNumberingAfterBreak="0">
+  <w:abstractNum w:abstractNumId="42" w15:restartNumberingAfterBreak="0">
     <w:nsid w:val="76DD489E"/>
     <w:multiLevelType w:val="hybridMultilevel"/>
     <w:tmpl w:val="3F46C344"/>
@@ -12549,7 +16545,7 @@
       </w:rPr>
     </w:lvl>
   </w:abstractNum>
-  <w:abstractNum w:abstractNumId="35" w15:restartNumberingAfterBreak="0">
+  <w:abstractNum w:abstractNumId="43" w15:restartNumberingAfterBreak="0">
     <w:nsid w:val="79AA416B"/>
     <w:multiLevelType w:val="hybridMultilevel"/>
     <w:tmpl w:val="ADFE69AE"/>
@@ -12662,7 +16658,7 @@
       </w:rPr>
     </w:lvl>
   </w:abstractNum>
-  <w:abstractNum w:abstractNumId="36" w15:restartNumberingAfterBreak="0">
+  <w:abstractNum w:abstractNumId="44" w15:restartNumberingAfterBreak="0">
     <w:nsid w:val="7A9041B9"/>
     <w:multiLevelType w:val="hybridMultilevel"/>
     <w:tmpl w:val="45F437CC"/>
@@ -12775,7 +16771,7 @@
       </w:rPr>
     </w:lvl>
   </w:abstractNum>
-  <w:abstractNum w:abstractNumId="37" w15:restartNumberingAfterBreak="0">
+  <w:abstractNum w:abstractNumId="45" w15:restartNumberingAfterBreak="0">
     <w:nsid w:val="7CAD4690"/>
     <w:multiLevelType w:val="hybridMultilevel"/>
     <w:tmpl w:val="A9BACDB0"/>
@@ -12889,16 +16885,16 @@
     </w:lvl>
   </w:abstractNum>
   <w:num w:numId="1" w16cid:durableId="658994979">
-    <w:abstractNumId w:val="18"/>
+    <w:abstractNumId w:val="21"/>
   </w:num>
   <w:num w:numId="2" w16cid:durableId="740174242">
-    <w:abstractNumId w:val="32"/>
+    <w:abstractNumId w:val="40"/>
   </w:num>
   <w:num w:numId="3" w16cid:durableId="471295010">
-    <w:abstractNumId w:val="15"/>
+    <w:abstractNumId w:val="16"/>
   </w:num>
   <w:num w:numId="4" w16cid:durableId="1146312485">
-    <w:abstractNumId w:val="31"/>
+    <w:abstractNumId w:val="37"/>
   </w:num>
   <w:num w:numId="5" w16cid:durableId="1009286173">
     <w:abstractNumId w:val="14"/>
@@ -12907,55 +16903,55 @@
     <w:abstractNumId w:val="3"/>
   </w:num>
   <w:num w:numId="7" w16cid:durableId="1638026638">
-    <w:abstractNumId w:val="35"/>
+    <w:abstractNumId w:val="43"/>
   </w:num>
   <w:num w:numId="8" w16cid:durableId="1120681555">
-    <w:abstractNumId w:val="25"/>
+    <w:abstractNumId w:val="31"/>
   </w:num>
   <w:num w:numId="9" w16cid:durableId="144859571">
-    <w:abstractNumId w:val="23"/>
+    <w:abstractNumId w:val="29"/>
   </w:num>
   <w:num w:numId="10" w16cid:durableId="654992174">
     <w:abstractNumId w:val="10"/>
   </w:num>
   <w:num w:numId="11" w16cid:durableId="800657404">
-    <w:abstractNumId w:val="33"/>
+    <w:abstractNumId w:val="41"/>
   </w:num>
   <w:num w:numId="12" w16cid:durableId="1393697662">
-    <w:abstractNumId w:val="30"/>
+    <w:abstractNumId w:val="36"/>
   </w:num>
   <w:num w:numId="13" w16cid:durableId="169955128">
-    <w:abstractNumId w:val="21"/>
+    <w:abstractNumId w:val="25"/>
   </w:num>
   <w:num w:numId="14" w16cid:durableId="1690982048">
     <w:abstractNumId w:val="1"/>
   </w:num>
   <w:num w:numId="15" w16cid:durableId="211161098">
-    <w:abstractNumId w:val="36"/>
+    <w:abstractNumId w:val="44"/>
   </w:num>
   <w:num w:numId="16" w16cid:durableId="1435441451">
-    <w:abstractNumId w:val="17"/>
+    <w:abstractNumId w:val="20"/>
   </w:num>
   <w:num w:numId="17" w16cid:durableId="927999176">
-    <w:abstractNumId w:val="20"/>
+    <w:abstractNumId w:val="24"/>
   </w:num>
   <w:num w:numId="18" w16cid:durableId="93599952">
-    <w:abstractNumId w:val="24"/>
+    <w:abstractNumId w:val="30"/>
   </w:num>
   <w:num w:numId="19" w16cid:durableId="521751371">
-    <w:abstractNumId w:val="19"/>
+    <w:abstractNumId w:val="23"/>
   </w:num>
   <w:num w:numId="20" w16cid:durableId="1656032199">
-    <w:abstractNumId w:val="37"/>
+    <w:abstractNumId w:val="45"/>
   </w:num>
   <w:num w:numId="21" w16cid:durableId="487332287">
-    <w:abstractNumId w:val="29"/>
+    <w:abstractNumId w:val="35"/>
   </w:num>
   <w:num w:numId="22" w16cid:durableId="842471202">
     <w:abstractNumId w:val="13"/>
   </w:num>
   <w:num w:numId="23" w16cid:durableId="696127414">
-    <w:abstractNumId w:val="34"/>
+    <w:abstractNumId w:val="42"/>
   </w:num>
   <w:num w:numId="24" w16cid:durableId="1773158374">
     <w:abstractNumId w:val="11"/>
@@ -12967,7 +16963,7 @@
     <w:abstractNumId w:val="9"/>
   </w:num>
   <w:num w:numId="27" w16cid:durableId="18701920">
-    <w:abstractNumId w:val="27"/>
+    <w:abstractNumId w:val="33"/>
   </w:num>
   <w:num w:numId="28" w16cid:durableId="1344746692">
     <w:abstractNumId w:val="7"/>
@@ -12982,10 +16978,10 @@
     <w:abstractNumId w:val="6"/>
   </w:num>
   <w:num w:numId="32" w16cid:durableId="508060214">
-    <w:abstractNumId w:val="26"/>
+    <w:abstractNumId w:val="32"/>
   </w:num>
   <w:num w:numId="33" w16cid:durableId="219363190">
-    <w:abstractNumId w:val="28"/>
+    <w:abstractNumId w:val="34"/>
   </w:num>
   <w:num w:numId="34" w16cid:durableId="500386984">
     <w:abstractNumId w:val="0"/>
@@ -12994,13 +16990,37 @@
     <w:abstractNumId w:val="12"/>
   </w:num>
   <w:num w:numId="36" w16cid:durableId="782269379">
-    <w:abstractNumId w:val="16"/>
+    <w:abstractNumId w:val="18"/>
   </w:num>
   <w:num w:numId="37" w16cid:durableId="1034616971">
     <w:abstractNumId w:val="5"/>
   </w:num>
   <w:num w:numId="38" w16cid:durableId="1174107392">
+    <w:abstractNumId w:val="28"/>
+  </w:num>
+  <w:num w:numId="39" w16cid:durableId="1331062212">
+    <w:abstractNumId w:val="26"/>
+  </w:num>
+  <w:num w:numId="40" w16cid:durableId="7634309">
+    <w:abstractNumId w:val="19"/>
+  </w:num>
+  <w:num w:numId="41" w16cid:durableId="1417945812">
+    <w:abstractNumId w:val="27"/>
+  </w:num>
+  <w:num w:numId="42" w16cid:durableId="1205412830">
+    <w:abstractNumId w:val="17"/>
+  </w:num>
+  <w:num w:numId="43" w16cid:durableId="1364748937">
     <w:abstractNumId w:val="22"/>
+  </w:num>
+  <w:num w:numId="44" w16cid:durableId="1160315120">
+    <w:abstractNumId w:val="15"/>
+  </w:num>
+  <w:num w:numId="45" w16cid:durableId="66264478">
+    <w:abstractNumId w:val="38"/>
+  </w:num>
+  <w:num w:numId="46" w16cid:durableId="1969823741">
+    <w:abstractNumId w:val="39"/>
   </w:num>
 </w:numbering>
 </file>
@@ -13922,6 +17942,174 @@
       <w:spacing w:val="5"/>
     </w:rPr>
   </w:style>
+  <w:style w:type="table" w:styleId="TableGrid">
+    <w:name w:val="Table Grid"/>
+    <w:basedOn w:val="TableNormal"/>
+    <w:uiPriority w:val="39"/>
+    <w:rsid w:val="001B6303"/>
+    <w:pPr>
+      <w:spacing w:after="0" w:line="240" w:lineRule="auto"/>
+    </w:pPr>
+    <w:tblPr>
+      <w:tblBorders>
+        <w:top w:val="single" w:sz="4" w:space="0" w:color="auto"/>
+        <w:left w:val="single" w:sz="4" w:space="0" w:color="auto"/>
+        <w:bottom w:val="single" w:sz="4" w:space="0" w:color="auto"/>
+        <w:right w:val="single" w:sz="4" w:space="0" w:color="auto"/>
+        <w:insideH w:val="single" w:sz="4" w:space="0" w:color="auto"/>
+        <w:insideV w:val="single" w:sz="4" w:space="0" w:color="auto"/>
+      </w:tblBorders>
+    </w:tblPr>
+  </w:style>
+  <w:style w:type="character" w:styleId="HTMLCode">
+    <w:name w:val="HTML Code"/>
+    <w:basedOn w:val="DefaultParagraphFont"/>
+    <w:uiPriority w:val="99"/>
+    <w:semiHidden/>
+    <w:unhideWhenUsed/>
+    <w:rsid w:val="001B6303"/>
+    <w:rPr>
+      <w:rFonts w:ascii="Courier New" w:eastAsia="Times New Roman" w:hAnsi="Courier New" w:cs="Courier New"/>
+      <w:sz w:val="20"/>
+      <w:szCs w:val="20"/>
+    </w:rPr>
+  </w:style>
+  <w:style w:type="table" w:styleId="GridTable3">
+    <w:name w:val="Grid Table 3"/>
+    <w:basedOn w:val="TableNormal"/>
+    <w:uiPriority w:val="48"/>
+    <w:rsid w:val="001B6303"/>
+    <w:pPr>
+      <w:spacing w:after="0" w:line="240" w:lineRule="auto"/>
+    </w:pPr>
+    <w:tblPr>
+      <w:tblStyleRowBandSize w:val="1"/>
+      <w:tblStyleColBandSize w:val="1"/>
+      <w:tblBorders>
+        <w:top w:val="single" w:sz="4" w:space="0" w:color="666666" w:themeColor="text1" w:themeTint="99"/>
+        <w:left w:val="single" w:sz="4" w:space="0" w:color="666666" w:themeColor="text1" w:themeTint="99"/>
+        <w:bottom w:val="single" w:sz="4" w:space="0" w:color="666666" w:themeColor="text1" w:themeTint="99"/>
+        <w:right w:val="single" w:sz="4" w:space="0" w:color="666666" w:themeColor="text1" w:themeTint="99"/>
+        <w:insideH w:val="single" w:sz="4" w:space="0" w:color="666666" w:themeColor="text1" w:themeTint="99"/>
+        <w:insideV w:val="single" w:sz="4" w:space="0" w:color="666666" w:themeColor="text1" w:themeTint="99"/>
+      </w:tblBorders>
+    </w:tblPr>
+    <w:tblStylePr w:type="firstRow">
+      <w:rPr>
+        <w:b/>
+        <w:bCs/>
+      </w:rPr>
+      <w:tblPr/>
+      <w:tcPr>
+        <w:tcBorders>
+          <w:top w:val="nil"/>
+          <w:left w:val="nil"/>
+          <w:right w:val="nil"/>
+          <w:insideH w:val="nil"/>
+          <w:insideV w:val="nil"/>
+        </w:tcBorders>
+        <w:shd w:val="clear" w:color="auto" w:fill="FFFFFF" w:themeFill="background1"/>
+      </w:tcPr>
+    </w:tblStylePr>
+    <w:tblStylePr w:type="lastRow">
+      <w:rPr>
+        <w:b/>
+        <w:bCs/>
+      </w:rPr>
+      <w:tblPr/>
+      <w:tcPr>
+        <w:tcBorders>
+          <w:left w:val="nil"/>
+          <w:bottom w:val="nil"/>
+          <w:right w:val="nil"/>
+          <w:insideH w:val="nil"/>
+          <w:insideV w:val="nil"/>
+        </w:tcBorders>
+        <w:shd w:val="clear" w:color="auto" w:fill="FFFFFF" w:themeFill="background1"/>
+      </w:tcPr>
+    </w:tblStylePr>
+    <w:tblStylePr w:type="firstCol">
+      <w:pPr>
+        <w:jc w:val="right"/>
+      </w:pPr>
+      <w:rPr>
+        <w:i/>
+        <w:iCs/>
+      </w:rPr>
+      <w:tblPr/>
+      <w:tcPr>
+        <w:tcBorders>
+          <w:top w:val="nil"/>
+          <w:left w:val="nil"/>
+          <w:bottom w:val="nil"/>
+          <w:insideH w:val="nil"/>
+          <w:insideV w:val="nil"/>
+        </w:tcBorders>
+        <w:shd w:val="clear" w:color="auto" w:fill="FFFFFF" w:themeFill="background1"/>
+      </w:tcPr>
+    </w:tblStylePr>
+    <w:tblStylePr w:type="lastCol">
+      <w:rPr>
+        <w:i/>
+        <w:iCs/>
+      </w:rPr>
+      <w:tblPr/>
+      <w:tcPr>
+        <w:tcBorders>
+          <w:top w:val="nil"/>
+          <w:bottom w:val="nil"/>
+          <w:right w:val="nil"/>
+          <w:insideH w:val="nil"/>
+          <w:insideV w:val="nil"/>
+        </w:tcBorders>
+        <w:shd w:val="clear" w:color="auto" w:fill="FFFFFF" w:themeFill="background1"/>
+      </w:tcPr>
+    </w:tblStylePr>
+    <w:tblStylePr w:type="band1Vert">
+      <w:tblPr/>
+      <w:tcPr>
+        <w:shd w:val="clear" w:color="auto" w:fill="CCCCCC" w:themeFill="text1" w:themeFillTint="33"/>
+      </w:tcPr>
+    </w:tblStylePr>
+    <w:tblStylePr w:type="band1Horz">
+      <w:tblPr/>
+      <w:tcPr>
+        <w:shd w:val="clear" w:color="auto" w:fill="CCCCCC" w:themeFill="text1" w:themeFillTint="33"/>
+      </w:tcPr>
+    </w:tblStylePr>
+    <w:tblStylePr w:type="neCell">
+      <w:tblPr/>
+      <w:tcPr>
+        <w:tcBorders>
+          <w:bottom w:val="single" w:sz="4" w:space="0" w:color="666666" w:themeColor="text1" w:themeTint="99"/>
+        </w:tcBorders>
+      </w:tcPr>
+    </w:tblStylePr>
+    <w:tblStylePr w:type="nwCell">
+      <w:tblPr/>
+      <w:tcPr>
+        <w:tcBorders>
+          <w:bottom w:val="single" w:sz="4" w:space="0" w:color="666666" w:themeColor="text1" w:themeTint="99"/>
+        </w:tcBorders>
+      </w:tcPr>
+    </w:tblStylePr>
+    <w:tblStylePr w:type="seCell">
+      <w:tblPr/>
+      <w:tcPr>
+        <w:tcBorders>
+          <w:top w:val="single" w:sz="4" w:space="0" w:color="666666" w:themeColor="text1" w:themeTint="99"/>
+        </w:tcBorders>
+      </w:tcPr>
+    </w:tblStylePr>
+    <w:tblStylePr w:type="swCell">
+      <w:tblPr/>
+      <w:tcPr>
+        <w:tcBorders>
+          <w:top w:val="single" w:sz="4" w:space="0" w:color="666666" w:themeColor="text1" w:themeTint="99"/>
+        </w:tcBorders>
+      </w:tcPr>
+    </w:tblStylePr>
+  </w:style>
 </w:styles>
 </file>
 

</xml_diff>